<commit_message>
Cambios en base dee datos
</commit_message>
<xml_diff>
--- a/documentacion/memoria David.docx
+++ b/documentacion/memoria David.docx
@@ -410,7 +410,17 @@
           <w:sz w:val="24"/>
           <w:szCs w:val="24"/>
         </w:rPr>
-        <w:t>Para el desarrollo de la API se ha</w:t>
+        <w:t>Para el desarrollo de la API se h</w:t>
+      </w:r>
+      <w:bookmarkStart w:id="0" w:name="_GoBack"/>
+      <w:bookmarkEnd w:id="0"/>
+      <w:r>
+        <w:rPr>
+          <w:rFonts w:ascii="Arial" w:hAnsi="Arial" w:cs="Arial"/>
+          <w:sz w:val="24"/>
+          <w:szCs w:val="24"/>
+        </w:rPr>
+        <w:t>a</w:t>
       </w:r>
       <w:r>
         <w:rPr>
@@ -435,6 +445,215 @@
           <w:szCs w:val="24"/>
         </w:rPr>
         <w:t>utilizado varias tecnologías, entre ellas:</w:t>
+      </w:r>
+    </w:p>
+    <w:p>
+      <w:pPr>
+        <w:jc w:val="both"/>
+        <w:rPr>
+          <w:rFonts w:ascii="Arial" w:hAnsi="Arial" w:cs="Arial"/>
+          <w:sz w:val="24"/>
+          <w:szCs w:val="24"/>
+        </w:rPr>
+      </w:pPr>
+      <w:r>
+        <w:rPr>
+          <w:rFonts w:ascii="Arial" w:hAnsi="Arial" w:cs="Arial"/>
+          <w:b/>
+          <w:sz w:val="24"/>
+          <w:szCs w:val="24"/>
+        </w:rPr>
+        <w:t>REST</w:t>
+      </w:r>
+      <w:r>
+        <w:rPr>
+          <w:rFonts w:ascii="Arial" w:hAnsi="Arial" w:cs="Arial"/>
+          <w:sz w:val="24"/>
+          <w:szCs w:val="24"/>
+        </w:rPr>
+        <w:t xml:space="preserve"> </w:t>
+      </w:r>
+      <w:r>
+        <w:rPr>
+          <w:rFonts w:ascii="Arial" w:hAnsi="Arial" w:cs="Arial"/>
+          <w:sz w:val="24"/>
+          <w:szCs w:val="24"/>
+        </w:rPr>
+        <w:t xml:space="preserve">La transferencia de estado representacional (en inglés </w:t>
+      </w:r>
+      <w:proofErr w:type="spellStart"/>
+      <w:r>
+        <w:rPr>
+          <w:rFonts w:ascii="Arial" w:hAnsi="Arial" w:cs="Arial"/>
+          <w:sz w:val="24"/>
+          <w:szCs w:val="24"/>
+        </w:rPr>
+        <w:t>representational</w:t>
+      </w:r>
+      <w:proofErr w:type="spellEnd"/>
+      <w:r>
+        <w:rPr>
+          <w:rFonts w:ascii="Arial" w:hAnsi="Arial" w:cs="Arial"/>
+          <w:sz w:val="24"/>
+          <w:szCs w:val="24"/>
+        </w:rPr>
+        <w:t xml:space="preserve"> </w:t>
+      </w:r>
+      <w:proofErr w:type="spellStart"/>
+      <w:r>
+        <w:rPr>
+          <w:rFonts w:ascii="Arial" w:hAnsi="Arial" w:cs="Arial"/>
+          <w:sz w:val="24"/>
+          <w:szCs w:val="24"/>
+        </w:rPr>
+        <w:t>state</w:t>
+      </w:r>
+      <w:proofErr w:type="spellEnd"/>
+      <w:r>
+        <w:rPr>
+          <w:rFonts w:ascii="Arial" w:hAnsi="Arial" w:cs="Arial"/>
+          <w:sz w:val="24"/>
+          <w:szCs w:val="24"/>
+        </w:rPr>
+        <w:t xml:space="preserve"> transfer) es un estilo de arquitectura </w:t>
+      </w:r>
+      <w:r>
+        <w:rPr>
+          <w:rFonts w:ascii="Arial" w:hAnsi="Arial" w:cs="Arial"/>
+          <w:sz w:val="24"/>
+          <w:szCs w:val="24"/>
+        </w:rPr>
+        <w:t xml:space="preserve">de </w:t>
+      </w:r>
+      <w:r>
+        <w:rPr>
+          <w:rFonts w:ascii="Arial" w:hAnsi="Arial" w:cs="Arial"/>
+          <w:sz w:val="24"/>
+          <w:szCs w:val="24"/>
+        </w:rPr>
+        <w:t>software para sistemas hipermedia</w:t>
+      </w:r>
+      <w:r>
+        <w:rPr>
+          <w:rFonts w:ascii="Arial" w:hAnsi="Arial" w:cs="Arial"/>
+          <w:sz w:val="24"/>
+          <w:szCs w:val="24"/>
+          <w:vertAlign w:val="superscript"/>
+        </w:rPr>
+        <w:t>1</w:t>
+      </w:r>
+      <w:r>
+        <w:rPr>
+          <w:rFonts w:ascii="Arial" w:hAnsi="Arial" w:cs="Arial"/>
+          <w:sz w:val="24"/>
+          <w:szCs w:val="24"/>
+        </w:rPr>
+        <w:t xml:space="preserve"> distribuidos como la </w:t>
+      </w:r>
+      <w:proofErr w:type="spellStart"/>
+      <w:r>
+        <w:rPr>
+          <w:rFonts w:ascii="Arial" w:hAnsi="Arial" w:cs="Arial"/>
+          <w:sz w:val="24"/>
+          <w:szCs w:val="24"/>
+        </w:rPr>
+        <w:t>World</w:t>
+      </w:r>
+      <w:proofErr w:type="spellEnd"/>
+      <w:r>
+        <w:rPr>
+          <w:rFonts w:ascii="Arial" w:hAnsi="Arial" w:cs="Arial"/>
+          <w:sz w:val="24"/>
+          <w:szCs w:val="24"/>
+        </w:rPr>
+        <w:t xml:space="preserve"> Wide Web. El término se originó en el año 2000, en una tesis doctoral sobre la web escrita por Roy Fielding, uno de los principales autores de la especificación del protocolo HTTP</w:t>
+      </w:r>
+      <w:r>
+        <w:rPr>
+          <w:rFonts w:ascii="Arial" w:hAnsi="Arial" w:cs="Arial"/>
+          <w:sz w:val="24"/>
+          <w:szCs w:val="24"/>
+          <w:vertAlign w:val="superscript"/>
+        </w:rPr>
+        <w:t>2</w:t>
+      </w:r>
+      <w:r>
+        <w:rPr>
+          <w:rFonts w:ascii="Arial" w:hAnsi="Arial" w:cs="Arial"/>
+          <w:sz w:val="24"/>
+          <w:szCs w:val="24"/>
+        </w:rPr>
+        <w:t xml:space="preserve"> y ha pasado a ser ampliamente utilizado por la comunidad de desarrollo.</w:t>
+      </w:r>
+      <w:r>
+        <w:rPr>
+          <w:rFonts w:ascii="Arial" w:hAnsi="Arial" w:cs="Arial"/>
+          <w:sz w:val="24"/>
+          <w:szCs w:val="24"/>
+        </w:rPr>
+        <w:t xml:space="preserve"> Es utilizado en el proyecto para la comunicación con el resto de </w:t>
+      </w:r>
+      <w:proofErr w:type="gramStart"/>
+      <w:r>
+        <w:rPr>
+          <w:rFonts w:ascii="Arial" w:hAnsi="Arial" w:cs="Arial"/>
+          <w:sz w:val="24"/>
+          <w:szCs w:val="24"/>
+        </w:rPr>
+        <w:t>servicios</w:t>
+      </w:r>
+      <w:proofErr w:type="gramEnd"/>
+      <w:r>
+        <w:rPr>
+          <w:rFonts w:ascii="Arial" w:hAnsi="Arial" w:cs="Arial"/>
+          <w:sz w:val="24"/>
+          <w:szCs w:val="24"/>
+        </w:rPr>
+        <w:t xml:space="preserve"> de la aplicación </w:t>
+      </w:r>
+      <w:proofErr w:type="spellStart"/>
+      <w:r>
+        <w:rPr>
+          <w:rFonts w:ascii="Arial" w:hAnsi="Arial" w:cs="Arial"/>
+          <w:sz w:val="24"/>
+          <w:szCs w:val="24"/>
+        </w:rPr>
+        <w:t>Meteosalle</w:t>
+      </w:r>
+      <w:proofErr w:type="spellEnd"/>
+      <w:r>
+        <w:rPr>
+          <w:rFonts w:ascii="Arial" w:hAnsi="Arial" w:cs="Arial"/>
+          <w:sz w:val="24"/>
+          <w:szCs w:val="24"/>
+        </w:rPr>
+        <w:t xml:space="preserve">, tanto el </w:t>
+      </w:r>
+      <w:proofErr w:type="spellStart"/>
+      <w:r>
+        <w:rPr>
+          <w:rFonts w:ascii="Arial" w:hAnsi="Arial" w:cs="Arial"/>
+          <w:sz w:val="24"/>
+          <w:szCs w:val="24"/>
+        </w:rPr>
+        <w:t>frontend</w:t>
+      </w:r>
+      <w:proofErr w:type="spellEnd"/>
+      <w:r>
+        <w:rPr>
+          <w:rFonts w:ascii="Arial" w:hAnsi="Arial" w:cs="Arial"/>
+          <w:sz w:val="24"/>
+          <w:szCs w:val="24"/>
+        </w:rPr>
+        <w:t xml:space="preserve"> como el servicio de búsqueda de información de datos externos</w:t>
+      </w:r>
+      <w:r>
+        <w:rPr>
+          <w:rFonts w:ascii="Arial" w:hAnsi="Arial" w:cs="Arial"/>
+          <w:sz w:val="24"/>
+          <w:szCs w:val="24"/>
+        </w:rPr>
+        <w:t>.</w:t>
       </w:r>
     </w:p>
     <w:p>
@@ -565,6 +784,14 @@
           <w:sz w:val="24"/>
           <w:szCs w:val="24"/>
         </w:rPr>
+        <w:t xml:space="preserve"> general</w:t>
+      </w:r>
+      <w:r>
+        <w:rPr>
+          <w:rFonts w:ascii="Arial" w:hAnsi="Arial" w:cs="Arial"/>
+          <w:sz w:val="24"/>
+          <w:szCs w:val="24"/>
+        </w:rPr>
         <w:t>, sin costo de licencias y cuenta con una gran comunidad y documentación.</w:t>
       </w:r>
     </w:p>
@@ -573,20 +800,292 @@
         <w:jc w:val="both"/>
         <w:rPr>
           <w:rFonts w:ascii="Arial" w:hAnsi="Arial" w:cs="Arial"/>
+          <w:sz w:val="24"/>
+          <w:szCs w:val="24"/>
+        </w:rPr>
+      </w:pPr>
+    </w:p>
+    <w:p>
+      <w:pPr>
+        <w:jc w:val="both"/>
+        <w:rPr>
+          <w:rFonts w:ascii="Arial" w:hAnsi="Arial" w:cs="Arial"/>
+          <w:sz w:val="24"/>
+          <w:szCs w:val="24"/>
+        </w:rPr>
+      </w:pPr>
+    </w:p>
+    <w:p>
+      <w:pPr>
+        <w:jc w:val="both"/>
+        <w:rPr>
+          <w:rFonts w:ascii="Arial" w:hAnsi="Arial" w:cs="Arial"/>
+          <w:sz w:val="24"/>
+          <w:szCs w:val="24"/>
+        </w:rPr>
+      </w:pPr>
+    </w:p>
+    <w:p>
+      <w:pPr>
+        <w:pStyle w:val="Piedepgina"/>
+        <w:numPr>
+          <w:ilvl w:val="0"/>
+          <w:numId w:val="4"/>
+        </w:numPr>
+        <w:rPr>
+          <w:rFonts w:asciiTheme="majorHAnsi" w:hAnsiTheme="majorHAnsi" w:cstheme="majorHAnsi"/>
+          <w:sz w:val="18"/>
+          <w:szCs w:val="18"/>
+        </w:rPr>
+      </w:pPr>
+      <w:r>
+        <w:rPr>
+          <w:rFonts w:asciiTheme="majorHAnsi" w:hAnsiTheme="majorHAnsi" w:cstheme="majorHAnsi"/>
+          <w:sz w:val="18"/>
+          <w:szCs w:val="18"/>
+        </w:rPr>
+        <w:t>El término hipermedia sirve para designar al conjunto de métodos o procedimientos para escribir, diseñar o componer contenidos que integren soportes tales como: texto, imagen, video, audio, mapas y otros soportes de información emergentes, de tal modo que el resultado obtenido, además, tenga la posibilidad de interactuar con los usuarios.</w:t>
+      </w:r>
+    </w:p>
+    <w:p>
+      <w:pPr>
+        <w:pStyle w:val="Piedepgina"/>
+        <w:numPr>
+          <w:ilvl w:val="0"/>
+          <w:numId w:val="4"/>
+        </w:numPr>
+        <w:rPr>
+          <w:rFonts w:asciiTheme="majorHAnsi" w:hAnsiTheme="majorHAnsi" w:cstheme="majorHAnsi"/>
+          <w:sz w:val="18"/>
+          <w:szCs w:val="18"/>
+        </w:rPr>
+      </w:pPr>
+      <w:r>
+        <w:rPr>
+          <w:rFonts w:asciiTheme="majorHAnsi" w:hAnsiTheme="majorHAnsi" w:cstheme="majorHAnsi"/>
+          <w:sz w:val="18"/>
+          <w:szCs w:val="18"/>
+        </w:rPr>
+        <w:t>El Protocolo de transferencia de hipertexto</w:t>
+      </w:r>
+      <w:r>
+        <w:rPr>
+          <w:rFonts w:asciiTheme="majorHAnsi" w:hAnsiTheme="majorHAnsi" w:cstheme="majorHAnsi"/>
+          <w:sz w:val="18"/>
+          <w:szCs w:val="18"/>
+        </w:rPr>
+        <w:t xml:space="preserve"> Http </w:t>
+      </w:r>
+      <w:r>
+        <w:rPr>
+          <w:rFonts w:asciiTheme="majorHAnsi" w:hAnsiTheme="majorHAnsi" w:cstheme="majorHAnsi"/>
+          <w:sz w:val="18"/>
+          <w:szCs w:val="18"/>
+        </w:rPr>
+        <w:t xml:space="preserve">es el protocolo de comunicación que permite las transferencias de información en la </w:t>
+      </w:r>
+      <w:proofErr w:type="spellStart"/>
+      <w:r>
+        <w:rPr>
+          <w:rFonts w:asciiTheme="majorHAnsi" w:hAnsiTheme="majorHAnsi" w:cstheme="majorHAnsi"/>
+          <w:sz w:val="18"/>
+          <w:szCs w:val="18"/>
+        </w:rPr>
+        <w:t>World</w:t>
+      </w:r>
+      <w:proofErr w:type="spellEnd"/>
+      <w:r>
+        <w:rPr>
+          <w:rFonts w:asciiTheme="majorHAnsi" w:hAnsiTheme="majorHAnsi" w:cstheme="majorHAnsi"/>
+          <w:sz w:val="18"/>
+          <w:szCs w:val="18"/>
+        </w:rPr>
+        <w:t xml:space="preserve"> Wide Web</w:t>
+      </w:r>
+      <w:r>
+        <w:rPr>
+          <w:rFonts w:asciiTheme="majorHAnsi" w:hAnsiTheme="majorHAnsi" w:cstheme="majorHAnsi"/>
+          <w:sz w:val="18"/>
+          <w:szCs w:val="18"/>
+        </w:rPr>
+        <w:t xml:space="preserve">. </w:t>
+      </w:r>
+      <w:hyperlink r:id="rId7" w:history="1">
+        <w:r>
+          <w:rPr>
+            <w:rStyle w:val="Hipervnculo"/>
+            <w:rFonts w:asciiTheme="majorHAnsi" w:hAnsiTheme="majorHAnsi" w:cstheme="majorHAnsi"/>
+            <w:sz w:val="18"/>
+            <w:szCs w:val="18"/>
+          </w:rPr>
+          <w:t>https://es.wikipedia.org/wiki/Protocolo_de_transferencia_de_hipertexto</w:t>
+        </w:r>
+      </w:hyperlink>
+    </w:p>
+    <w:p>
+      <w:pPr>
+        <w:jc w:val="both"/>
+        <w:rPr>
+          <w:rFonts w:ascii="Arial" w:hAnsi="Arial" w:cs="Arial"/>
+          <w:sz w:val="24"/>
+          <w:szCs w:val="24"/>
+        </w:rPr>
+      </w:pPr>
+      <w:proofErr w:type="spellStart"/>
+      <w:r>
+        <w:rPr>
+          <w:rFonts w:ascii="Arial" w:hAnsi="Arial" w:cs="Arial"/>
           <w:b/>
           <w:sz w:val="24"/>
           <w:szCs w:val="24"/>
         </w:rPr>
-      </w:pPr>
+        <w:lastRenderedPageBreak/>
+        <w:t>Mysql</w:t>
+      </w:r>
+      <w:proofErr w:type="spellEnd"/>
+      <w:r>
+        <w:rPr>
+          <w:rFonts w:ascii="Arial" w:hAnsi="Arial" w:cs="Arial"/>
+          <w:b/>
+          <w:sz w:val="24"/>
+          <w:szCs w:val="24"/>
+        </w:rPr>
+        <w:t xml:space="preserve"> </w:t>
+      </w:r>
+      <w:r>
+        <w:rPr>
+          <w:rFonts w:ascii="Arial" w:hAnsi="Arial" w:cs="Arial"/>
+          <w:sz w:val="24"/>
+          <w:szCs w:val="24"/>
+        </w:rPr>
+        <w:t xml:space="preserve">es un sistema de gestión de bases de datos relacional desarrollado bajo licencia dual: Licencia pública general/Licencia comercial por Oracle </w:t>
+      </w:r>
       <w:proofErr w:type="spellStart"/>
       <w:r>
         <w:rPr>
           <w:rFonts w:ascii="Arial" w:hAnsi="Arial" w:cs="Arial"/>
+          <w:sz w:val="24"/>
+          <w:szCs w:val="24"/>
+        </w:rPr>
+        <w:t>Corporation</w:t>
+      </w:r>
+      <w:proofErr w:type="spellEnd"/>
+      <w:r>
+        <w:rPr>
+          <w:rFonts w:ascii="Arial" w:hAnsi="Arial" w:cs="Arial"/>
+          <w:sz w:val="24"/>
+          <w:szCs w:val="24"/>
+        </w:rPr>
+        <w:t xml:space="preserve"> y está considerada como la base de datos de código abierto más popular del mundo,</w:t>
+      </w:r>
+      <w:r>
+        <w:rPr>
+          <w:rFonts w:ascii="Arial" w:hAnsi="Arial" w:cs="Arial"/>
+          <w:sz w:val="24"/>
+          <w:szCs w:val="24"/>
+        </w:rPr>
+        <w:t xml:space="preserve"> </w:t>
+      </w:r>
+      <w:r>
+        <w:rPr>
+          <w:rFonts w:ascii="Arial" w:hAnsi="Arial" w:cs="Arial"/>
+          <w:sz w:val="24"/>
+          <w:szCs w:val="24"/>
+        </w:rPr>
+        <w:t>sobre todo para entornos de desarrollo web.</w:t>
+      </w:r>
+      <w:r>
+        <w:rPr>
+          <w:rFonts w:ascii="Arial" w:hAnsi="Arial" w:cs="Arial"/>
+          <w:sz w:val="24"/>
+          <w:szCs w:val="24"/>
+        </w:rPr>
+        <w:t xml:space="preserve"> Es utilizada en el proyecto para mantener los datos</w:t>
+      </w:r>
+      <w:r>
+        <w:rPr>
+          <w:rFonts w:ascii="Arial" w:hAnsi="Arial" w:cs="Arial"/>
+          <w:sz w:val="24"/>
+          <w:szCs w:val="24"/>
+        </w:rPr>
+        <w:t xml:space="preserve"> </w:t>
+      </w:r>
+      <w:r>
+        <w:rPr>
+          <w:rFonts w:ascii="Arial" w:hAnsi="Arial" w:cs="Arial"/>
+          <w:sz w:val="24"/>
+          <w:szCs w:val="24"/>
+        </w:rPr>
+        <w:t>y persistirlos en el tiempo</w:t>
+      </w:r>
+      <w:r>
+        <w:rPr>
+          <w:rFonts w:ascii="Arial" w:hAnsi="Arial" w:cs="Arial"/>
+          <w:sz w:val="24"/>
+          <w:szCs w:val="24"/>
+        </w:rPr>
+        <w:t xml:space="preserve"> de las estaciones,</w:t>
+      </w:r>
+      <w:r>
+        <w:rPr>
+          <w:rFonts w:ascii="Arial" w:hAnsi="Arial" w:cs="Arial"/>
+          <w:sz w:val="24"/>
+          <w:szCs w:val="24"/>
+        </w:rPr>
+        <w:t xml:space="preserve"> </w:t>
+      </w:r>
+      <w:r>
+        <w:rPr>
+          <w:rFonts w:ascii="Arial" w:hAnsi="Arial" w:cs="Arial"/>
+          <w:sz w:val="24"/>
+          <w:szCs w:val="24"/>
+        </w:rPr>
+        <w:t>usuarios y la relación entre el código postal y la provincia a la que pertenece</w:t>
+      </w:r>
+      <w:r>
+        <w:rPr>
+          <w:rFonts w:ascii="Arial" w:hAnsi="Arial" w:cs="Arial"/>
+          <w:sz w:val="24"/>
+          <w:szCs w:val="24"/>
+        </w:rPr>
+        <w:t xml:space="preserve"> una </w:t>
+      </w:r>
+      <w:r>
+        <w:rPr>
+          <w:rFonts w:ascii="Arial" w:hAnsi="Arial" w:cs="Arial"/>
+          <w:sz w:val="24"/>
+          <w:szCs w:val="24"/>
+        </w:rPr>
+        <w:t>estación</w:t>
+      </w:r>
+      <w:r>
+        <w:rPr>
+          <w:rFonts w:ascii="Arial" w:hAnsi="Arial" w:cs="Arial"/>
+          <w:sz w:val="24"/>
+          <w:szCs w:val="24"/>
+        </w:rPr>
+        <w:t>.</w:t>
+      </w:r>
+    </w:p>
+    <w:p>
+      <w:pPr>
+        <w:jc w:val="both"/>
+        <w:rPr>
+          <w:rFonts w:ascii="Arial" w:hAnsi="Arial" w:cs="Arial"/>
           <w:b/>
           <w:sz w:val="24"/>
           <w:szCs w:val="24"/>
         </w:rPr>
-        <w:t>Mysql</w:t>
+      </w:pPr>
+      <w:proofErr w:type="spellStart"/>
+      <w:r>
+        <w:rPr>
+          <w:rFonts w:ascii="Arial" w:hAnsi="Arial" w:cs="Arial"/>
+          <w:b/>
+          <w:sz w:val="24"/>
+          <w:szCs w:val="24"/>
+        </w:rPr>
+        <w:t>RabbitMQ</w:t>
       </w:r>
       <w:proofErr w:type="spellEnd"/>
       <w:r>
@@ -604,7 +1103,7 @@
           <w:sz w:val="24"/>
           <w:szCs w:val="24"/>
         </w:rPr>
-        <w:t xml:space="preserve">es un sistema de gestión de bases de datos relacional desarrollado bajo licencia dual: Licencia pública general/Licencia comercial por Oracle </w:t>
+        <w:t xml:space="preserve">es un software de negociación de mensajes de código abierto. Implementa el estándar </w:t>
       </w:r>
       <w:proofErr w:type="spellStart"/>
       <w:r>
@@ -613,7 +1112,7 @@
           <w:sz w:val="24"/>
           <w:szCs w:val="24"/>
         </w:rPr>
-        <w:t>Corporation</w:t>
+        <w:t>Advanced</w:t>
       </w:r>
       <w:proofErr w:type="spellEnd"/>
       <w:r>
@@ -622,180 +1121,618 @@
           <w:sz w:val="24"/>
           <w:szCs w:val="24"/>
         </w:rPr>
-        <w:t xml:space="preserve"> y está considerada como la base de datos de código abierto más popular del mundo,1​2​ y una de las más populares en general junto a Oracle y Microsoft SQL Server, sobre todo para entornos de desarrollo web.</w:t>
-      </w:r>
-      <w:bookmarkStart w:id="0" w:name="_GoBack"/>
-      <w:bookmarkEnd w:id="0"/>
-    </w:p>
-    <w:p>
-      <w:pPr>
-        <w:jc w:val="both"/>
-        <w:rPr>
-          <w:rFonts w:ascii="Arial" w:hAnsi="Arial" w:cs="Arial"/>
-          <w:sz w:val="24"/>
-          <w:szCs w:val="24"/>
-        </w:rPr>
-      </w:pPr>
-    </w:p>
-    <w:p>
-      <w:pPr>
-        <w:jc w:val="both"/>
-        <w:rPr>
-          <w:rFonts w:ascii="Arial" w:hAnsi="Arial" w:cs="Arial"/>
-          <w:sz w:val="24"/>
-          <w:szCs w:val="24"/>
-        </w:rPr>
-      </w:pPr>
-    </w:p>
-    <w:p>
-      <w:pPr>
-        <w:jc w:val="both"/>
-        <w:rPr>
-          <w:rFonts w:ascii="Arial" w:hAnsi="Arial" w:cs="Arial"/>
-          <w:sz w:val="24"/>
-          <w:szCs w:val="24"/>
-        </w:rPr>
-      </w:pPr>
-    </w:p>
-    <w:p>
-      <w:pPr>
-        <w:jc w:val="both"/>
-        <w:rPr>
-          <w:rFonts w:ascii="Arial" w:hAnsi="Arial" w:cs="Arial"/>
-          <w:sz w:val="24"/>
-          <w:szCs w:val="24"/>
-        </w:rPr>
-      </w:pPr>
-    </w:p>
-    <w:p>
-      <w:pPr>
-        <w:jc w:val="both"/>
-        <w:rPr>
-          <w:rFonts w:ascii="Arial" w:hAnsi="Arial" w:cs="Arial"/>
-          <w:sz w:val="24"/>
-          <w:szCs w:val="24"/>
-        </w:rPr>
-      </w:pPr>
-    </w:p>
-    <w:p>
-      <w:pPr>
-        <w:jc w:val="both"/>
-        <w:rPr>
-          <w:rFonts w:ascii="Arial" w:hAnsi="Arial" w:cs="Arial"/>
-          <w:sz w:val="24"/>
-          <w:szCs w:val="24"/>
-        </w:rPr>
-      </w:pPr>
-    </w:p>
-    <w:p>
-      <w:pPr>
-        <w:jc w:val="both"/>
-        <w:rPr>
-          <w:rFonts w:ascii="Arial" w:hAnsi="Arial" w:cs="Arial"/>
-          <w:sz w:val="24"/>
-          <w:szCs w:val="24"/>
-        </w:rPr>
-      </w:pPr>
-    </w:p>
-    <w:p>
-      <w:pPr>
-        <w:jc w:val="both"/>
-        <w:rPr>
-          <w:rFonts w:ascii="Arial" w:hAnsi="Arial" w:cs="Arial"/>
-          <w:sz w:val="24"/>
-          <w:szCs w:val="24"/>
-        </w:rPr>
-      </w:pPr>
-    </w:p>
-    <w:p>
-      <w:pPr>
-        <w:jc w:val="both"/>
-        <w:rPr>
-          <w:rFonts w:ascii="Arial" w:hAnsi="Arial" w:cs="Arial"/>
-          <w:sz w:val="24"/>
-          <w:szCs w:val="24"/>
-        </w:rPr>
-      </w:pPr>
-    </w:p>
-    <w:p>
-      <w:pPr>
-        <w:jc w:val="both"/>
-        <w:rPr>
-          <w:rFonts w:ascii="Arial" w:hAnsi="Arial" w:cs="Arial"/>
-          <w:sz w:val="24"/>
-          <w:szCs w:val="24"/>
-        </w:rPr>
-      </w:pPr>
-    </w:p>
-    <w:p>
-      <w:pPr>
-        <w:jc w:val="both"/>
-        <w:rPr>
-          <w:rFonts w:ascii="Arial" w:hAnsi="Arial" w:cs="Arial"/>
-          <w:sz w:val="24"/>
-          <w:szCs w:val="24"/>
-        </w:rPr>
-      </w:pPr>
-    </w:p>
-    <w:p>
-      <w:pPr>
-        <w:jc w:val="both"/>
-        <w:rPr>
-          <w:rFonts w:ascii="Arial" w:hAnsi="Arial" w:cs="Arial"/>
-          <w:sz w:val="24"/>
-          <w:szCs w:val="24"/>
-        </w:rPr>
-      </w:pPr>
-    </w:p>
-    <w:p>
-      <w:pPr>
-        <w:jc w:val="both"/>
-        <w:rPr>
-          <w:rFonts w:ascii="Arial" w:hAnsi="Arial" w:cs="Arial"/>
-          <w:sz w:val="24"/>
-          <w:szCs w:val="24"/>
-        </w:rPr>
-      </w:pPr>
-    </w:p>
-    <w:p>
-      <w:pPr>
-        <w:jc w:val="both"/>
-        <w:rPr>
-          <w:rFonts w:ascii="Arial" w:hAnsi="Arial" w:cs="Arial"/>
-          <w:sz w:val="24"/>
-          <w:szCs w:val="24"/>
-        </w:rPr>
-      </w:pPr>
-    </w:p>
-    <w:p>
-      <w:pPr>
-        <w:jc w:val="both"/>
-        <w:rPr>
-          <w:rFonts w:ascii="Arial" w:hAnsi="Arial" w:cs="Arial"/>
-          <w:sz w:val="24"/>
-          <w:szCs w:val="24"/>
-        </w:rPr>
-      </w:pPr>
-    </w:p>
-    <w:p>
-      <w:pPr>
-        <w:jc w:val="both"/>
-        <w:rPr>
-          <w:rFonts w:ascii="Arial" w:hAnsi="Arial" w:cs="Arial"/>
-          <w:sz w:val="24"/>
-          <w:szCs w:val="24"/>
-        </w:rPr>
-      </w:pPr>
-    </w:p>
-    <w:p>
-      <w:pPr>
-        <w:jc w:val="both"/>
-        <w:rPr>
-          <w:rFonts w:ascii="Arial" w:hAnsi="Arial" w:cs="Arial"/>
-          <w:sz w:val="24"/>
-          <w:szCs w:val="24"/>
-        </w:rPr>
-      </w:pPr>
+        <w:t xml:space="preserve"> </w:t>
+      </w:r>
+      <w:proofErr w:type="spellStart"/>
+      <w:r>
+        <w:rPr>
+          <w:rFonts w:ascii="Arial" w:hAnsi="Arial" w:cs="Arial"/>
+          <w:sz w:val="24"/>
+          <w:szCs w:val="24"/>
+        </w:rPr>
+        <w:t>Message</w:t>
+      </w:r>
+      <w:proofErr w:type="spellEnd"/>
+      <w:r>
+        <w:rPr>
+          <w:rFonts w:ascii="Arial" w:hAnsi="Arial" w:cs="Arial"/>
+          <w:sz w:val="24"/>
+          <w:szCs w:val="24"/>
+        </w:rPr>
+        <w:t xml:space="preserve"> </w:t>
+      </w:r>
+      <w:proofErr w:type="spellStart"/>
+      <w:r>
+        <w:rPr>
+          <w:rFonts w:ascii="Arial" w:hAnsi="Arial" w:cs="Arial"/>
+          <w:sz w:val="24"/>
+          <w:szCs w:val="24"/>
+        </w:rPr>
+        <w:t>Queuing</w:t>
+      </w:r>
+      <w:proofErr w:type="spellEnd"/>
+      <w:r>
+        <w:rPr>
+          <w:rFonts w:ascii="Arial" w:hAnsi="Arial" w:cs="Arial"/>
+          <w:sz w:val="24"/>
+          <w:szCs w:val="24"/>
+        </w:rPr>
+        <w:t xml:space="preserve"> </w:t>
+      </w:r>
+      <w:proofErr w:type="spellStart"/>
+      <w:r>
+        <w:rPr>
+          <w:rFonts w:ascii="Arial" w:hAnsi="Arial" w:cs="Arial"/>
+          <w:sz w:val="24"/>
+          <w:szCs w:val="24"/>
+        </w:rPr>
+        <w:t>Protocol</w:t>
+      </w:r>
+      <w:proofErr w:type="spellEnd"/>
+      <w:r>
+        <w:rPr>
+          <w:rFonts w:ascii="Arial" w:hAnsi="Arial" w:cs="Arial"/>
+          <w:sz w:val="24"/>
+          <w:szCs w:val="24"/>
+        </w:rPr>
+        <w:t xml:space="preserve"> (AMQP)</w:t>
+      </w:r>
+      <w:r>
+        <w:rPr>
+          <w:rFonts w:ascii="Arial" w:hAnsi="Arial" w:cs="Arial"/>
+          <w:b/>
+          <w:sz w:val="24"/>
+          <w:szCs w:val="24"/>
+        </w:rPr>
+        <w:t xml:space="preserve"> </w:t>
+      </w:r>
+      <w:r>
+        <w:rPr>
+          <w:rFonts w:ascii="Arial" w:hAnsi="Arial" w:cs="Arial"/>
+          <w:sz w:val="24"/>
+          <w:szCs w:val="24"/>
+        </w:rPr>
+        <w:t>es un protocolo de estándar abierto en la capa de aplicaciones de un sistema de comunicación. Las características que definen al protocolo AMQP son la orientación a mensajes, encolamiento ("</w:t>
+      </w:r>
+      <w:proofErr w:type="spellStart"/>
+      <w:r>
+        <w:rPr>
+          <w:rFonts w:ascii="Arial" w:hAnsi="Arial" w:cs="Arial"/>
+          <w:sz w:val="24"/>
+          <w:szCs w:val="24"/>
+        </w:rPr>
+        <w:t>queuing</w:t>
+      </w:r>
+      <w:proofErr w:type="spellEnd"/>
+      <w:r>
+        <w:rPr>
+          <w:rFonts w:ascii="Arial" w:hAnsi="Arial" w:cs="Arial"/>
+          <w:sz w:val="24"/>
+          <w:szCs w:val="24"/>
+        </w:rPr>
+        <w:t>"), enrutamiento (tanto punto-a-punto como publicación-subscripción), exactitud y seguridad.</w:t>
+      </w:r>
+      <w:r>
+        <w:rPr>
+          <w:rFonts w:ascii="Arial" w:hAnsi="Arial" w:cs="Arial"/>
+          <w:sz w:val="24"/>
+          <w:szCs w:val="24"/>
+        </w:rPr>
+        <w:t xml:space="preserve"> </w:t>
+      </w:r>
+      <w:r>
+        <w:rPr>
+          <w:rFonts w:ascii="Arial" w:hAnsi="Arial" w:cs="Arial"/>
+          <w:sz w:val="24"/>
+          <w:szCs w:val="24"/>
+        </w:rPr>
+        <w:t xml:space="preserve">El código fuente está liberado bajo la licencia Mozilla </w:t>
+      </w:r>
+      <w:proofErr w:type="spellStart"/>
+      <w:r>
+        <w:rPr>
+          <w:rFonts w:ascii="Arial" w:hAnsi="Arial" w:cs="Arial"/>
+          <w:sz w:val="24"/>
+          <w:szCs w:val="24"/>
+        </w:rPr>
+        <w:t>Public</w:t>
+      </w:r>
+      <w:proofErr w:type="spellEnd"/>
+      <w:r>
+        <w:rPr>
+          <w:rFonts w:ascii="Arial" w:hAnsi="Arial" w:cs="Arial"/>
+          <w:sz w:val="24"/>
+          <w:szCs w:val="24"/>
+        </w:rPr>
+        <w:t xml:space="preserve"> </w:t>
+      </w:r>
+      <w:proofErr w:type="spellStart"/>
+      <w:r>
+        <w:rPr>
+          <w:rFonts w:ascii="Arial" w:hAnsi="Arial" w:cs="Arial"/>
+          <w:sz w:val="24"/>
+          <w:szCs w:val="24"/>
+        </w:rPr>
+        <w:t>License</w:t>
+      </w:r>
+      <w:proofErr w:type="spellEnd"/>
+      <w:r>
+        <w:rPr>
+          <w:rFonts w:ascii="Arial" w:hAnsi="Arial" w:cs="Arial"/>
+          <w:sz w:val="24"/>
+          <w:szCs w:val="24"/>
+        </w:rPr>
+        <w:t>.</w:t>
+      </w:r>
+      <w:r>
+        <w:rPr>
+          <w:rFonts w:ascii="Arial" w:hAnsi="Arial" w:cs="Arial"/>
+          <w:sz w:val="24"/>
+          <w:szCs w:val="24"/>
+        </w:rPr>
+        <w:t xml:space="preserve"> En el proyecto se utiliza principalmente para crear un proceso paralelo que actualice los valores de las estaciones en la base de datos de </w:t>
+      </w:r>
+      <w:r>
+        <w:rPr>
+          <w:rFonts w:ascii="Arial" w:hAnsi="Arial" w:cs="Arial"/>
+          <w:b/>
+          <w:sz w:val="24"/>
+          <w:szCs w:val="24"/>
+        </w:rPr>
+        <w:t>Redis</w:t>
+      </w:r>
+      <w:r>
+        <w:rPr>
+          <w:rFonts w:ascii="Arial" w:hAnsi="Arial" w:cs="Arial"/>
+          <w:b/>
+          <w:sz w:val="24"/>
+          <w:szCs w:val="24"/>
+        </w:rPr>
+        <w:t>.</w:t>
+      </w:r>
+    </w:p>
+    <w:p>
+      <w:pPr>
+        <w:jc w:val="both"/>
+        <w:rPr>
+          <w:rFonts w:ascii="Arial" w:hAnsi="Arial" w:cs="Arial"/>
+          <w:sz w:val="24"/>
+          <w:szCs w:val="24"/>
+        </w:rPr>
+      </w:pPr>
+      <w:r>
+        <w:rPr>
+          <w:rFonts w:ascii="Arial" w:hAnsi="Arial" w:cs="Arial"/>
+          <w:b/>
+          <w:sz w:val="24"/>
+          <w:szCs w:val="24"/>
+        </w:rPr>
+        <w:t xml:space="preserve">Redis </w:t>
+      </w:r>
+      <w:r>
+        <w:rPr>
+          <w:rFonts w:ascii="Arial" w:hAnsi="Arial" w:cs="Arial"/>
+          <w:sz w:val="24"/>
+          <w:szCs w:val="24"/>
+        </w:rPr>
+        <w:t>es un motor de base de datos en memoria, basado en el almacenamiento en tablas de hashes (clave/valor) pero que opcionalmente puede ser usada como una base de datos durable o persistente.</w:t>
+      </w:r>
+      <w:r>
+        <w:rPr>
+          <w:rFonts w:ascii="Arial" w:hAnsi="Arial" w:cs="Arial"/>
+          <w:sz w:val="24"/>
+          <w:szCs w:val="24"/>
+        </w:rPr>
+        <w:t xml:space="preserve"> </w:t>
+      </w:r>
+      <w:r>
+        <w:rPr>
+          <w:rFonts w:ascii="Arial" w:hAnsi="Arial" w:cs="Arial"/>
+          <w:sz w:val="24"/>
+          <w:szCs w:val="24"/>
+        </w:rPr>
+        <w:t>Está liberado bajo licencia BSD por lo que es considerado software de código abierto.</w:t>
+      </w:r>
+      <w:r>
+        <w:rPr>
+          <w:rFonts w:ascii="Arial" w:hAnsi="Arial" w:cs="Arial"/>
+          <w:sz w:val="24"/>
+          <w:szCs w:val="24"/>
+        </w:rPr>
+        <w:t xml:space="preserve"> En el proyecto se ha utilizado para agilizar los procesos de búsqueda de datos</w:t>
+      </w:r>
+      <w:r>
+        <w:rPr>
+          <w:rFonts w:ascii="Arial" w:hAnsi="Arial" w:cs="Arial"/>
+          <w:sz w:val="24"/>
+          <w:szCs w:val="24"/>
+        </w:rPr>
+        <w:t>, los datos consultados se almacenan en Redis y son actualizados según las operaciones que se vayan realizando en la aplicación de esta forma se evita re</w:t>
+      </w:r>
+      <w:r>
+        <w:rPr>
+          <w:rFonts w:ascii="Arial" w:hAnsi="Arial" w:cs="Arial"/>
+          <w:sz w:val="24"/>
+          <w:szCs w:val="24"/>
+        </w:rPr>
+        <w:t>trasar las respuestas al cliente; devolviendo los datos que ya hayan sido consultados.</w:t>
+      </w:r>
+    </w:p>
+    <w:p>
+      <w:pPr>
+        <w:jc w:val="both"/>
+        <w:rPr>
+          <w:rFonts w:ascii="Arial" w:hAnsi="Arial" w:cs="Arial"/>
+          <w:b/>
+          <w:sz w:val="24"/>
+          <w:szCs w:val="24"/>
+        </w:rPr>
+      </w:pPr>
+      <w:r>
+        <w:rPr>
+          <w:rFonts w:ascii="Arial" w:hAnsi="Arial" w:cs="Arial"/>
+          <w:b/>
+          <w:sz w:val="24"/>
+          <w:szCs w:val="24"/>
+        </w:rPr>
+        <w:t>Docker</w:t>
+      </w:r>
+      <w:r>
+        <w:rPr>
+          <w:rFonts w:ascii="Arial" w:hAnsi="Arial" w:cs="Arial"/>
+          <w:b/>
+          <w:sz w:val="24"/>
+          <w:szCs w:val="24"/>
+        </w:rPr>
+        <w:t xml:space="preserve"> </w:t>
+      </w:r>
+      <w:r>
+        <w:rPr>
+          <w:rFonts w:ascii="Arial" w:hAnsi="Arial" w:cs="Arial"/>
+          <w:sz w:val="24"/>
+          <w:szCs w:val="24"/>
+        </w:rPr>
+        <w:t>es un proyecto de código abierto que automatiza el despliegue de aplicaciones dentro de contenedores de software, proporcionando una capa adicional de abstracción y automatización de virtualización de aplicaciones en múltiples sistemas operativos</w:t>
+      </w:r>
+      <w:r>
+        <w:rPr>
+          <w:rFonts w:ascii="Arial" w:hAnsi="Arial" w:cs="Arial"/>
+          <w:sz w:val="24"/>
+          <w:szCs w:val="24"/>
+        </w:rPr>
+        <w:t>. Se ha utilizado en el proyecto para el despliegue de la aplicación debido a su versatilidad y adaptación en varios sistemas operativos además de la agilidad que ofrece para el despliegue.</w:t>
+      </w:r>
+    </w:p>
+    <w:p>
+      <w:pPr>
+        <w:jc w:val="both"/>
+        <w:rPr>
+          <w:rFonts w:ascii="Arial" w:hAnsi="Arial" w:cs="Arial"/>
+          <w:b/>
+          <w:sz w:val="24"/>
+          <w:szCs w:val="24"/>
+        </w:rPr>
+      </w:pPr>
+    </w:p>
+    <w:p>
+      <w:pPr>
+        <w:jc w:val="both"/>
+        <w:rPr>
+          <w:rFonts w:ascii="Arial" w:hAnsi="Arial" w:cs="Arial"/>
+          <w:b/>
+          <w:sz w:val="24"/>
+          <w:szCs w:val="24"/>
+        </w:rPr>
+      </w:pPr>
+    </w:p>
+    <w:p>
+      <w:pPr>
+        <w:jc w:val="both"/>
+        <w:rPr>
+          <w:rFonts w:ascii="Arial" w:hAnsi="Arial" w:cs="Arial"/>
+          <w:b/>
+          <w:sz w:val="24"/>
+          <w:szCs w:val="24"/>
+        </w:rPr>
+      </w:pPr>
+    </w:p>
+    <w:p>
+      <w:pPr>
+        <w:jc w:val="both"/>
+        <w:rPr>
+          <w:rFonts w:ascii="Arial" w:hAnsi="Arial" w:cs="Arial"/>
+          <w:sz w:val="24"/>
+          <w:szCs w:val="24"/>
+        </w:rPr>
+      </w:pPr>
+    </w:p>
+    <w:p>
+      <w:pPr>
+        <w:jc w:val="both"/>
+        <w:rPr>
+          <w:rFonts w:ascii="Arial" w:hAnsi="Arial" w:cs="Arial"/>
+          <w:sz w:val="24"/>
+          <w:szCs w:val="24"/>
+        </w:rPr>
+      </w:pPr>
+    </w:p>
+    <w:p>
+      <w:pPr>
+        <w:jc w:val="both"/>
+        <w:rPr>
+          <w:rFonts w:ascii="Arial" w:hAnsi="Arial" w:cs="Arial"/>
+          <w:sz w:val="24"/>
+          <w:szCs w:val="24"/>
+        </w:rPr>
+      </w:pPr>
+    </w:p>
+    <w:p>
+      <w:pPr>
+        <w:jc w:val="both"/>
+        <w:rPr>
+          <w:rFonts w:ascii="Arial" w:hAnsi="Arial" w:cs="Arial"/>
+          <w:sz w:val="24"/>
+          <w:szCs w:val="24"/>
+        </w:rPr>
+      </w:pPr>
+    </w:p>
+    <w:p>
+      <w:pPr>
+        <w:jc w:val="both"/>
+        <w:rPr>
+          <w:rFonts w:ascii="Arial" w:hAnsi="Arial" w:cs="Arial"/>
+          <w:sz w:val="24"/>
+          <w:szCs w:val="24"/>
+        </w:rPr>
+      </w:pPr>
+    </w:p>
+    <w:p>
+      <w:pPr>
+        <w:jc w:val="both"/>
+        <w:rPr>
+          <w:rFonts w:ascii="Arial" w:hAnsi="Arial" w:cs="Arial"/>
+          <w:sz w:val="24"/>
+          <w:szCs w:val="24"/>
+        </w:rPr>
+      </w:pPr>
+    </w:p>
+    <w:p>
+      <w:pPr>
+        <w:jc w:val="both"/>
+        <w:rPr>
+          <w:rFonts w:ascii="Arial" w:hAnsi="Arial" w:cs="Arial"/>
+          <w:sz w:val="24"/>
+          <w:szCs w:val="24"/>
+        </w:rPr>
+      </w:pPr>
+    </w:p>
+    <w:p>
+      <w:pPr>
+        <w:jc w:val="both"/>
+        <w:rPr>
+          <w:rFonts w:ascii="Arial" w:hAnsi="Arial" w:cs="Arial"/>
+          <w:sz w:val="24"/>
+          <w:szCs w:val="24"/>
+        </w:rPr>
+      </w:pPr>
+    </w:p>
+    <w:p>
+      <w:pPr>
+        <w:jc w:val="both"/>
+        <w:rPr>
+          <w:rFonts w:ascii="Arial" w:hAnsi="Arial" w:cs="Arial"/>
+          <w:sz w:val="24"/>
+          <w:szCs w:val="24"/>
+        </w:rPr>
+      </w:pPr>
+    </w:p>
+    <w:p>
+      <w:pPr>
+        <w:jc w:val="both"/>
+        <w:rPr>
+          <w:rFonts w:ascii="Arial" w:hAnsi="Arial" w:cs="Arial"/>
+          <w:sz w:val="24"/>
+          <w:szCs w:val="24"/>
+        </w:rPr>
+      </w:pPr>
+    </w:p>
+    <w:p>
+      <w:pPr>
+        <w:jc w:val="both"/>
+        <w:rPr>
+          <w:rFonts w:ascii="Arial" w:hAnsi="Arial" w:cs="Arial"/>
+          <w:sz w:val="24"/>
+          <w:szCs w:val="24"/>
+        </w:rPr>
+      </w:pPr>
+    </w:p>
+    <w:p>
+      <w:pPr>
+        <w:jc w:val="both"/>
+        <w:rPr>
+          <w:rFonts w:ascii="Arial" w:hAnsi="Arial" w:cs="Arial"/>
+          <w:sz w:val="24"/>
+          <w:szCs w:val="24"/>
+        </w:rPr>
+      </w:pPr>
+    </w:p>
+    <w:p>
+      <w:pPr>
+        <w:jc w:val="both"/>
+        <w:rPr>
+          <w:rFonts w:ascii="Arial" w:hAnsi="Arial" w:cs="Arial"/>
+          <w:sz w:val="24"/>
+          <w:szCs w:val="24"/>
+        </w:rPr>
+      </w:pPr>
+    </w:p>
+    <w:p>
+      <w:pPr>
+        <w:jc w:val="both"/>
+        <w:rPr>
+          <w:rFonts w:ascii="Arial" w:hAnsi="Arial" w:cs="Arial"/>
+          <w:sz w:val="24"/>
+          <w:szCs w:val="24"/>
+        </w:rPr>
+      </w:pPr>
+    </w:p>
+    <w:p>
+      <w:pPr>
+        <w:jc w:val="both"/>
+        <w:rPr>
+          <w:rFonts w:ascii="Arial" w:hAnsi="Arial" w:cs="Arial"/>
+          <w:sz w:val="24"/>
+          <w:szCs w:val="24"/>
+        </w:rPr>
+      </w:pPr>
+    </w:p>
+    <w:p>
+      <w:pPr>
+        <w:jc w:val="both"/>
+        <w:rPr>
+          <w:rFonts w:ascii="Arial" w:hAnsi="Arial" w:cs="Arial"/>
+          <w:sz w:val="24"/>
+          <w:szCs w:val="24"/>
+        </w:rPr>
+      </w:pPr>
+    </w:p>
+    <w:p>
+      <w:pPr>
+        <w:jc w:val="both"/>
+        <w:rPr>
+          <w:rFonts w:ascii="Arial" w:hAnsi="Arial" w:cs="Arial"/>
+          <w:sz w:val="24"/>
+          <w:szCs w:val="24"/>
+        </w:rPr>
+      </w:pPr>
+      <w:r>
+        <w:rPr>
+          <w:rFonts w:ascii="Arial" w:hAnsi="Arial" w:cs="Arial"/>
+          <w:sz w:val="24"/>
+          <w:szCs w:val="24"/>
+        </w:rPr>
+        <w:t>Bibliografía:</w:t>
+      </w:r>
+    </w:p>
+    <w:p>
+      <w:pPr>
+        <w:jc w:val="both"/>
+      </w:pPr>
+      <w:r>
+        <w:rPr>
+          <w:rFonts w:ascii="Arial" w:hAnsi="Arial" w:cs="Arial"/>
+          <w:sz w:val="24"/>
+          <w:szCs w:val="24"/>
+        </w:rPr>
+        <w:t>Proto</w:t>
+      </w:r>
+      <w:r>
+        <w:rPr>
+          <w:rFonts w:ascii="Arial" w:hAnsi="Arial" w:cs="Arial"/>
+          <w:sz w:val="24"/>
+          <w:szCs w:val="24"/>
+        </w:rPr>
+        <w:t>colo http:</w:t>
+      </w:r>
+      <w:r>
+        <w:rPr>
+          <w:rFonts w:ascii="Arial" w:hAnsi="Arial" w:cs="Arial"/>
+          <w:sz w:val="24"/>
+          <w:szCs w:val="24"/>
+        </w:rPr>
+        <w:t xml:space="preserve"> </w:t>
+      </w:r>
+      <w:hyperlink r:id="rId8" w:history="1">
+        <w:r>
+          <w:rPr>
+            <w:rStyle w:val="Hipervnculo"/>
+          </w:rPr>
+          <w:t>https://es.wikipedia.org/wiki/Protocolo_de_transferencia_de_hipertexto</w:t>
+        </w:r>
+      </w:hyperlink>
+    </w:p>
+    <w:p>
+      <w:pPr>
+        <w:jc w:val="both"/>
+      </w:pPr>
+      <w:hyperlink r:id="rId9" w:history="1">
+        <w:r>
+          <w:rPr>
+            <w:rStyle w:val="Hipervnculo"/>
+          </w:rPr>
+          <w:t>https://es.wikipedia.org/wiki/Hipermedia</w:t>
+        </w:r>
+      </w:hyperlink>
+    </w:p>
+    <w:p>
+      <w:pPr>
+        <w:jc w:val="both"/>
+      </w:pPr>
+      <w:hyperlink r:id="rId10" w:history="1">
+        <w:r>
+          <w:rPr>
+            <w:rStyle w:val="Hipervnculo"/>
+          </w:rPr>
+          <w:t>https://es.wikipedia.org/wiki/Transferencia_de_Estado_Representacional</w:t>
+        </w:r>
+      </w:hyperlink>
+    </w:p>
+    <w:p>
+      <w:pPr>
+        <w:jc w:val="both"/>
+      </w:pPr>
+      <w:hyperlink r:id="rId11" w:history="1">
+        <w:r>
+          <w:rPr>
+            <w:rStyle w:val="Hipervnculo"/>
+          </w:rPr>
+          <w:t>https://es.wikipedia.org/wiki/PHP</w:t>
+        </w:r>
+      </w:hyperlink>
+    </w:p>
+    <w:p>
+      <w:pPr>
+        <w:jc w:val="both"/>
+      </w:pPr>
+      <w:hyperlink r:id="rId12" w:history="1">
+        <w:r>
+          <w:rPr>
+            <w:rStyle w:val="Hipervnculo"/>
+          </w:rPr>
+          <w:t>https://es.wikipedia.org/wiki/RabbitMQ</w:t>
+        </w:r>
+      </w:hyperlink>
+    </w:p>
+    <w:p>
+      <w:pPr>
+        <w:jc w:val="both"/>
+      </w:pPr>
+      <w:hyperlink r:id="rId13" w:history="1">
+        <w:r>
+          <w:rPr>
+            <w:rStyle w:val="Hipervnculo"/>
+          </w:rPr>
+          <w:t>https://es.wikipedia.org/wiki/MySQL</w:t>
+        </w:r>
+      </w:hyperlink>
+    </w:p>
+    <w:p>
+      <w:pPr>
+        <w:jc w:val="both"/>
+        <w:rPr>
+          <w:rFonts w:ascii="Arial" w:hAnsi="Arial" w:cs="Arial"/>
+          <w:sz w:val="24"/>
+          <w:szCs w:val="24"/>
+        </w:rPr>
+      </w:pPr>
+      <w:hyperlink r:id="rId14" w:history="1">
+        <w:r>
+          <w:rPr>
+            <w:rStyle w:val="Hipervnculo"/>
+          </w:rPr>
+          <w:t>https://es.wikipedia.org/wiki/Redis</w:t>
+        </w:r>
+      </w:hyperlink>
     </w:p>
     <w:p>
       <w:pPr>
@@ -895,6 +1832,154 @@
     </w:sectPr>
   </w:body>
 </w:document>
+</file>
+
+<file path=word/endnotes.xml><?xml version="1.0" encoding="utf-8"?>
+<w:endnotes xmlns:wpc="http://schemas.microsoft.com/office/word/2010/wordprocessingCanvas" xmlns:cx="http://schemas.microsoft.com/office/drawing/2014/chartex" xmlns:cx1="http://schemas.microsoft.com/office/drawing/2015/9/8/chartex" xmlns:cx2="http://schemas.microsoft.com/office/drawing/2015/10/21/chartex" xmlns:cx3="http://schemas.microsoft.com/office/drawing/2016/5/9/chartex" xmlns:cx4="http://schemas.microsoft.com/office/drawing/2016/5/10/chartex" xmlns:cx5="http://schemas.microsoft.com/office/drawing/2016/5/11/chartex" xmlns:cx6="http://schemas.microsoft.com/office/drawing/2016/5/12/chartex" xmlns:cx7="http://schemas.microsoft.com/office/drawing/2016/5/13/chartex" xmlns:cx8="http://schemas.microsoft.com/office/drawing/2016/5/14/chartex" xmlns:mc="http://schemas.openxmlformats.org/markup-compatibility/2006" xmlns:aink="http://schemas.microsoft.com/office/drawing/2016/ink" xmlns:am3d="http://schemas.microsoft.com/office/drawing/2017/model3d" xmlns:o="urn:schemas-microsoft-com:office:office" xmlns:r="http://schemas.openxmlformats.org/officeDocument/2006/relationships" xmlns:m="http://schemas.openxmlformats.org/officeDocument/2006/math" xmlns:v="urn:schemas-microsoft-com:vml" xmlns:wp14="http://schemas.microsoft.com/office/word/2010/wordprocessingDrawing" xmlns:wp="http://schemas.openxmlformats.org/drawingml/2006/wordprocessingDrawing" xmlns:w10="urn:schemas-microsoft-com:office:word" xmlns:w="http://schemas.openxmlformats.org/wordprocessingml/2006/main" xmlns:w14="http://schemas.microsoft.com/office/word/2010/wordml" xmlns:w15="http://schemas.microsoft.com/office/word/2012/wordml" xmlns:w16cid="http://schemas.microsoft.com/office/word/2016/wordml/cid" xmlns:w16se="http://schemas.microsoft.com/office/word/2015/wordml/symex" xmlns:wpg="http://schemas.microsoft.com/office/word/2010/wordprocessingGroup" xmlns:wpi="http://schemas.microsoft.com/office/word/2010/wordprocessingInk" xmlns:wne="http://schemas.microsoft.com/office/word/2006/wordml" xmlns:wps="http://schemas.microsoft.com/office/word/2010/wordprocessingShape" mc:Ignorable="w14 w15 w16se w16cid wp14">
+  <w:endnote w:type="separator" w:id="-1">
+    <w:p>
+      <w:pPr>
+        <w:spacing w:after="0" w:line="240" w:lineRule="auto"/>
+      </w:pPr>
+      <w:r>
+        <w:separator/>
+      </w:r>
+    </w:p>
+  </w:endnote>
+  <w:endnote w:type="continuationSeparator" w:id="0">
+    <w:p>
+      <w:pPr>
+        <w:spacing w:after="0" w:line="240" w:lineRule="auto"/>
+      </w:pPr>
+      <w:r>
+        <w:continuationSeparator/>
+      </w:r>
+    </w:p>
+  </w:endnote>
+</w:endnotes>
+</file>
+
+<file path=word/footnotes.xml><?xml version="1.0" encoding="utf-8"?>
+<w:footnotes xmlns:wpc="http://schemas.microsoft.com/office/word/2010/wordprocessingCanvas" xmlns:cx="http://schemas.microsoft.com/office/drawing/2014/chartex" xmlns:cx1="http://schemas.microsoft.com/office/drawing/2015/9/8/chartex" xmlns:cx2="http://schemas.microsoft.com/office/drawing/2015/10/21/chartex" xmlns:cx3="http://schemas.microsoft.com/office/drawing/2016/5/9/chartex" xmlns:cx4="http://schemas.microsoft.com/office/drawing/2016/5/10/chartex" xmlns:cx5="http://schemas.microsoft.com/office/drawing/2016/5/11/chartex" xmlns:cx6="http://schemas.microsoft.com/office/drawing/2016/5/12/chartex" xmlns:cx7="http://schemas.microsoft.com/office/drawing/2016/5/13/chartex" xmlns:cx8="http://schemas.microsoft.com/office/drawing/2016/5/14/chartex" xmlns:mc="http://schemas.openxmlformats.org/markup-compatibility/2006" xmlns:aink="http://schemas.microsoft.com/office/drawing/2016/ink" xmlns:am3d="http://schemas.microsoft.com/office/drawing/2017/model3d" xmlns:o="urn:schemas-microsoft-com:office:office" xmlns:r="http://schemas.openxmlformats.org/officeDocument/2006/relationships" xmlns:m="http://schemas.openxmlformats.org/officeDocument/2006/math" xmlns:v="urn:schemas-microsoft-com:vml" xmlns:wp14="http://schemas.microsoft.com/office/word/2010/wordprocessingDrawing" xmlns:wp="http://schemas.openxmlformats.org/drawingml/2006/wordprocessingDrawing" xmlns:w10="urn:schemas-microsoft-com:office:word" xmlns:w="http://schemas.openxmlformats.org/wordprocessingml/2006/main" xmlns:w14="http://schemas.microsoft.com/office/word/2010/wordml" xmlns:w15="http://schemas.microsoft.com/office/word/2012/wordml" xmlns:w16cid="http://schemas.microsoft.com/office/word/2016/wordml/cid" xmlns:w16se="http://schemas.microsoft.com/office/word/2015/wordml/symex" xmlns:wpg="http://schemas.microsoft.com/office/word/2010/wordprocessingGroup" xmlns:wpi="http://schemas.microsoft.com/office/word/2010/wordprocessingInk" xmlns:wne="http://schemas.microsoft.com/office/word/2006/wordml" xmlns:wps="http://schemas.microsoft.com/office/word/2010/wordprocessingShape" mc:Ignorable="w14 w15 w16se w16cid wp14">
+  <w:footnote w:type="separator" w:id="-1">
+    <w:p>
+      <w:pPr>
+        <w:spacing w:after="0" w:line="240" w:lineRule="auto"/>
+      </w:pPr>
+      <w:r>
+        <w:separator/>
+      </w:r>
+    </w:p>
+  </w:footnote>
+  <w:footnote w:type="continuationSeparator" w:id="0">
+    <w:p>
+      <w:pPr>
+        <w:spacing w:after="0" w:line="240" w:lineRule="auto"/>
+      </w:pPr>
+      <w:r>
+        <w:continuationSeparator/>
+      </w:r>
+    </w:p>
+  </w:footnote>
+</w:footnotes>
+</file>
+
+<file path=word/numbering.xml><?xml version="1.0" encoding="utf-8"?>
+<w:numbering xmlns:wpc="http://schemas.microsoft.com/office/word/2010/wordprocessingCanvas" xmlns:cx="http://schemas.microsoft.com/office/drawing/2014/chartex" xmlns:cx1="http://schemas.microsoft.com/office/drawing/2015/9/8/chartex" xmlns:cx2="http://schemas.microsoft.com/office/drawing/2015/10/21/chartex" xmlns:cx3="http://schemas.microsoft.com/office/drawing/2016/5/9/chartex" xmlns:cx4="http://schemas.microsoft.com/office/drawing/2016/5/10/chartex" xmlns:cx5="http://schemas.microsoft.com/office/drawing/2016/5/11/chartex" xmlns:cx6="http://schemas.microsoft.com/office/drawing/2016/5/12/chartex" xmlns:cx7="http://schemas.microsoft.com/office/drawing/2016/5/13/chartex" xmlns:cx8="http://schemas.microsoft.com/office/drawing/2016/5/14/chartex" xmlns:mc="http://schemas.openxmlformats.org/markup-compatibility/2006" xmlns:aink="http://schemas.microsoft.com/office/drawing/2016/ink" xmlns:am3d="http://schemas.microsoft.com/office/drawing/2017/model3d" xmlns:o="urn:schemas-microsoft-com:office:office" xmlns:r="http://schemas.openxmlformats.org/officeDocument/2006/relationships" xmlns:m="http://schemas.openxmlformats.org/officeDocument/2006/math" xmlns:v="urn:schemas-microsoft-com:vml" xmlns:wp14="http://schemas.microsoft.com/office/word/2010/wordprocessingDrawing" xmlns:wp="http://schemas.openxmlformats.org/drawingml/2006/wordprocessingDrawing" xmlns:w10="urn:schemas-microsoft-com:office:word" xmlns:w="http://schemas.openxmlformats.org/wordprocessingml/2006/main" xmlns:w14="http://schemas.microsoft.com/office/word/2010/wordml" xmlns:w15="http://schemas.microsoft.com/office/word/2012/wordml" xmlns:w16cid="http://schemas.microsoft.com/office/word/2016/wordml/cid" xmlns:w16se="http://schemas.microsoft.com/office/word/2015/wordml/symex" xmlns:wpg="http://schemas.microsoft.com/office/word/2010/wordprocessingGroup" xmlns:wpi="http://schemas.microsoft.com/office/word/2010/wordprocessingInk" xmlns:wne="http://schemas.microsoft.com/office/word/2006/wordml" xmlns:wps="http://schemas.microsoft.com/office/word/2010/wordprocessingShape" mc:Ignorable="w14 w15 w16se w16cid wp14">
+  <w:abstractNum w:abstractNumId="0" w15:restartNumberingAfterBreak="0">
+    <w:nsid w:val="4F0828F3"/>
+    <w:multiLevelType w:val="hybridMultilevel"/>
+    <w:tmpl w:val="7714CA7C"/>
+    <w:lvl w:ilvl="0" w:tplc="FE06C2F2">
+      <w:start w:val="1"/>
+      <w:numFmt w:val="decimal"/>
+      <w:lvlText w:val="%1."/>
+      <w:lvlJc w:val="left"/>
+      <w:pPr>
+        <w:ind w:left="720" w:hanging="360"/>
+      </w:pPr>
+      <w:rPr>
+        <w:rFonts w:hint="default"/>
+        <w:sz w:val="22"/>
+      </w:rPr>
+    </w:lvl>
+    <w:lvl w:ilvl="1" w:tplc="0C0A0019">
+      <w:start w:val="1"/>
+      <w:numFmt w:val="lowerLetter"/>
+      <w:lvlText w:val="%2."/>
+      <w:lvlJc w:val="left"/>
+      <w:pPr>
+        <w:ind w:left="1440" w:hanging="360"/>
+      </w:pPr>
+    </w:lvl>
+    <w:lvl w:ilvl="2" w:tplc="0C0A001B" w:tentative="1">
+      <w:start w:val="1"/>
+      <w:numFmt w:val="lowerRoman"/>
+      <w:lvlText w:val="%3."/>
+      <w:lvlJc w:val="right"/>
+      <w:pPr>
+        <w:ind w:left="2160" w:hanging="180"/>
+      </w:pPr>
+    </w:lvl>
+    <w:lvl w:ilvl="3" w:tplc="0C0A000F" w:tentative="1">
+      <w:start w:val="1"/>
+      <w:numFmt w:val="decimal"/>
+      <w:lvlText w:val="%4."/>
+      <w:lvlJc w:val="left"/>
+      <w:pPr>
+        <w:ind w:left="2880" w:hanging="360"/>
+      </w:pPr>
+    </w:lvl>
+    <w:lvl w:ilvl="4" w:tplc="0C0A0019" w:tentative="1">
+      <w:start w:val="1"/>
+      <w:numFmt w:val="lowerLetter"/>
+      <w:lvlText w:val="%5."/>
+      <w:lvlJc w:val="left"/>
+      <w:pPr>
+        <w:ind w:left="3600" w:hanging="360"/>
+      </w:pPr>
+    </w:lvl>
+    <w:lvl w:ilvl="5" w:tplc="0C0A001B" w:tentative="1">
+      <w:start w:val="1"/>
+      <w:numFmt w:val="lowerRoman"/>
+      <w:lvlText w:val="%6."/>
+      <w:lvlJc w:val="right"/>
+      <w:pPr>
+        <w:ind w:left="4320" w:hanging="180"/>
+      </w:pPr>
+    </w:lvl>
+    <w:lvl w:ilvl="6" w:tplc="0C0A000F" w:tentative="1">
+      <w:start w:val="1"/>
+      <w:numFmt w:val="decimal"/>
+      <w:lvlText w:val="%7."/>
+      <w:lvlJc w:val="left"/>
+      <w:pPr>
+        <w:ind w:left="5040" w:hanging="360"/>
+      </w:pPr>
+    </w:lvl>
+    <w:lvl w:ilvl="7" w:tplc="0C0A0019" w:tentative="1">
+      <w:start w:val="1"/>
+      <w:numFmt w:val="lowerLetter"/>
+      <w:lvlText w:val="%8."/>
+      <w:lvlJc w:val="left"/>
+      <w:pPr>
+        <w:ind w:left="5760" w:hanging="360"/>
+      </w:pPr>
+    </w:lvl>
+    <w:lvl w:ilvl="8" w:tplc="0C0A001B" w:tentative="1">
+      <w:start w:val="1"/>
+      <w:numFmt w:val="lowerRoman"/>
+      <w:lvlText w:val="%9."/>
+      <w:lvlJc w:val="right"/>
+      <w:pPr>
+        <w:ind w:left="6480" w:hanging="180"/>
+      </w:pPr>
+    </w:lvl>
+  </w:abstractNum>
+  <w:num w:numId="4">
+    <w:abstractNumId w:val="0"/>
+  </w:num>
+</w:numbering>
 </file>
 
 <file path=word/styles.xml><?xml version="1.0" encoding="utf-8"?>
@@ -1298,7 +2383,6 @@
   <w:style w:type="character" w:default="1" w:styleId="Fuentedeprrafopredeter">
     <w:name w:val="Default Paragraph Font"/>
     <w:uiPriority w:val="1"/>
-    <w:semiHidden/>
     <w:unhideWhenUsed/>
   </w:style>
   <w:style w:type="table" w:default="1" w:styleId="Tablanormal">
@@ -1321,6 +2405,62 @@
     <w:uiPriority w:val="99"/>
     <w:semiHidden/>
     <w:unhideWhenUsed/>
+  </w:style>
+  <w:style w:type="paragraph" w:styleId="Encabezado">
+    <w:name w:val="header"/>
+    <w:basedOn w:val="Normal"/>
+    <w:link w:val="EncabezadoCar"/>
+    <w:uiPriority w:val="99"/>
+    <w:unhideWhenUsed/>
+    <w:rsid w:val="008B41D6"/>
+    <w:pPr>
+      <w:tabs>
+        <w:tab w:val="center" w:pos="4252"/>
+        <w:tab w:val="right" w:pos="8504"/>
+      </w:tabs>
+      <w:spacing w:after="0" w:line="240" w:lineRule="auto"/>
+    </w:pPr>
+  </w:style>
+  <w:style w:type="character" w:customStyle="1" w:styleId="EncabezadoCar">
+    <w:name w:val="Encabezado Car"/>
+    <w:basedOn w:val="Fuentedeprrafopredeter"/>
+    <w:link w:val="Encabezado"/>
+    <w:uiPriority w:val="99"/>
+    <w:rsid w:val="008B41D6"/>
+  </w:style>
+  <w:style w:type="paragraph" w:styleId="Piedepgina">
+    <w:name w:val="footer"/>
+    <w:basedOn w:val="Normal"/>
+    <w:link w:val="PiedepginaCar"/>
+    <w:uiPriority w:val="99"/>
+    <w:unhideWhenUsed/>
+    <w:rsid w:val="008B41D6"/>
+    <w:pPr>
+      <w:tabs>
+        <w:tab w:val="center" w:pos="4252"/>
+        <w:tab w:val="right" w:pos="8504"/>
+      </w:tabs>
+      <w:spacing w:after="0" w:line="240" w:lineRule="auto"/>
+    </w:pPr>
+  </w:style>
+  <w:style w:type="character" w:customStyle="1" w:styleId="PiedepginaCar">
+    <w:name w:val="Pie de página Car"/>
+    <w:basedOn w:val="Fuentedeprrafopredeter"/>
+    <w:link w:val="Piedepgina"/>
+    <w:uiPriority w:val="99"/>
+    <w:rsid w:val="008B41D6"/>
+  </w:style>
+  <w:style w:type="character" w:styleId="Hipervnculo">
+    <w:name w:val="Hyperlink"/>
+    <w:basedOn w:val="Fuentedeprrafopredeter"/>
+    <w:uiPriority w:val="99"/>
+    <w:semiHidden/>
+    <w:unhideWhenUsed/>
+    <w:rsid w:val="006A5FC7"/>
+    <w:rPr>
+      <w:color w:val="0000FF"/>
+      <w:u w:val="single"/>
+    </w:rPr>
   </w:style>
 </w:styles>
 </file>

</xml_diff>

<commit_message>
Añadida info a la memoria symfony
</commit_message>
<xml_diff>
--- a/documentacion/memoria David.docx
+++ b/documentacion/memoria David.docx
@@ -731,6 +731,1515 @@
         </w:rPr>
         <w:t>su código, y el de todos los componentes y librerías que incluye, se publican bajo la licencia MIT de software libre.</w:t>
       </w:r>
+      <w:r>
+        <w:rPr>
+          <w:rFonts w:ascii="Arial" w:hAnsi="Arial" w:cs="Arial"/>
+          <w:sz w:val="24"/>
+          <w:szCs w:val="24"/>
+        </w:rPr>
+        <w:t xml:space="preserve"> </w:t>
+      </w:r>
+      <w:r>
+        <w:rPr>
+          <w:rFonts w:ascii="Arial" w:hAnsi="Arial" w:cs="Arial"/>
+          <w:sz w:val="24"/>
+          <w:szCs w:val="24"/>
+        </w:rPr>
+        <w:t xml:space="preserve">Se ha escogido principalmente por su fácil </w:t>
+      </w:r>
+      <w:r>
+        <w:rPr>
+          <w:rFonts w:ascii="Arial" w:hAnsi="Arial" w:cs="Arial"/>
+          <w:sz w:val="24"/>
+          <w:szCs w:val="24"/>
+        </w:rPr>
+        <w:t>utilización</w:t>
+      </w:r>
+      <w:r>
+        <w:rPr>
+          <w:rFonts w:ascii="Arial" w:hAnsi="Arial" w:cs="Arial"/>
+          <w:sz w:val="24"/>
+          <w:szCs w:val="24"/>
+        </w:rPr>
+        <w:t xml:space="preserve"> y la capacidad de incluirles com</w:t>
+      </w:r>
+      <w:r>
+        <w:rPr>
+          <w:rFonts w:ascii="Arial" w:hAnsi="Arial" w:cs="Arial"/>
+          <w:sz w:val="24"/>
+          <w:szCs w:val="24"/>
+        </w:rPr>
+        <w:t>ponentes</w:t>
+      </w:r>
+      <w:r>
+        <w:rPr>
+          <w:rFonts w:ascii="Arial" w:hAnsi="Arial" w:cs="Arial"/>
+          <w:sz w:val="24"/>
+          <w:szCs w:val="24"/>
+        </w:rPr>
+        <w:t xml:space="preserve"> para el desarrollo de la API, necesarios para </w:t>
+      </w:r>
+      <w:r>
+        <w:rPr>
+          <w:rFonts w:ascii="Arial" w:hAnsi="Arial" w:cs="Arial"/>
+          <w:sz w:val="24"/>
+          <w:szCs w:val="24"/>
+        </w:rPr>
+        <w:t>agilizar el proceso de desarrollo.</w:t>
+      </w:r>
+      <w:r>
+        <w:rPr>
+          <w:rFonts w:ascii="Arial" w:hAnsi="Arial" w:cs="Arial"/>
+          <w:sz w:val="24"/>
+          <w:szCs w:val="24"/>
+        </w:rPr>
+        <w:t xml:space="preserve"> Los </w:t>
+      </w:r>
+      <w:r>
+        <w:rPr>
+          <w:rFonts w:ascii="Arial" w:hAnsi="Arial" w:cs="Arial"/>
+          <w:sz w:val="24"/>
+          <w:szCs w:val="24"/>
+        </w:rPr>
+        <w:t xml:space="preserve">componentes </w:t>
+      </w:r>
+      <w:r>
+        <w:rPr>
+          <w:rFonts w:ascii="Arial" w:hAnsi="Arial" w:cs="Arial"/>
+          <w:sz w:val="24"/>
+          <w:szCs w:val="24"/>
+        </w:rPr>
+        <w:t>utilizados</w:t>
+      </w:r>
+      <w:r>
+        <w:rPr>
+          <w:rFonts w:ascii="Arial" w:hAnsi="Arial" w:cs="Arial"/>
+          <w:sz w:val="24"/>
+          <w:szCs w:val="24"/>
+        </w:rPr>
+        <w:t xml:space="preserve"> principalmente son:</w:t>
+      </w:r>
+    </w:p>
+    <w:p>
+      <w:pPr>
+        <w:jc w:val="both"/>
+        <w:rPr>
+          <w:rFonts w:ascii="Arial" w:hAnsi="Arial" w:cs="Arial"/>
+          <w:sz w:val="24"/>
+          <w:szCs w:val="24"/>
+        </w:rPr>
+      </w:pPr>
+      <w:proofErr w:type="spellStart"/>
+      <w:r>
+        <w:rPr>
+          <w:rFonts w:ascii="Arial" w:hAnsi="Arial" w:cs="Arial"/>
+          <w:b/>
+          <w:sz w:val="24"/>
+          <w:szCs w:val="24"/>
+        </w:rPr>
+        <w:t>symfony</w:t>
+      </w:r>
+      <w:proofErr w:type="spellEnd"/>
+      <w:r>
+        <w:rPr>
+          <w:rFonts w:ascii="Arial" w:hAnsi="Arial" w:cs="Arial"/>
+          <w:b/>
+          <w:sz w:val="24"/>
+          <w:szCs w:val="24"/>
+        </w:rPr>
+        <w:t>/</w:t>
+      </w:r>
+      <w:proofErr w:type="spellStart"/>
+      <w:r>
+        <w:rPr>
+          <w:rFonts w:ascii="Arial" w:hAnsi="Arial" w:cs="Arial"/>
+          <w:b/>
+          <w:sz w:val="24"/>
+          <w:szCs w:val="24"/>
+        </w:rPr>
+        <w:t>console</w:t>
+      </w:r>
+      <w:proofErr w:type="spellEnd"/>
+      <w:r>
+        <w:rPr>
+          <w:rFonts w:ascii="Arial" w:hAnsi="Arial" w:cs="Arial"/>
+          <w:b/>
+          <w:sz w:val="24"/>
+          <w:szCs w:val="24"/>
+        </w:rPr>
+        <w:t>:</w:t>
+      </w:r>
+      <w:r>
+        <w:rPr>
+          <w:rFonts w:ascii="Arial" w:hAnsi="Arial" w:cs="Arial"/>
+          <w:sz w:val="24"/>
+          <w:szCs w:val="24"/>
+        </w:rPr>
+        <w:t xml:space="preserve"> P</w:t>
+      </w:r>
+      <w:r>
+        <w:rPr>
+          <w:rFonts w:ascii="Arial" w:hAnsi="Arial" w:cs="Arial"/>
+          <w:sz w:val="24"/>
+          <w:szCs w:val="24"/>
+        </w:rPr>
+        <w:t xml:space="preserve">ermite crear comandos de línea de comandos. Los comandos de la consola se pueden usar para cualquier tarea recurrente, como </w:t>
+      </w:r>
+      <w:proofErr w:type="spellStart"/>
+      <w:r>
+        <w:rPr>
+          <w:rFonts w:ascii="Arial" w:hAnsi="Arial" w:cs="Arial"/>
+          <w:sz w:val="24"/>
+          <w:szCs w:val="24"/>
+        </w:rPr>
+        <w:t>cronjobs</w:t>
+      </w:r>
+      <w:proofErr w:type="spellEnd"/>
+      <w:r>
+        <w:rPr>
+          <w:rFonts w:ascii="Arial" w:hAnsi="Arial" w:cs="Arial"/>
+          <w:sz w:val="24"/>
+          <w:szCs w:val="24"/>
+        </w:rPr>
+        <w:t>, importaciones u otros trabajos por lotes.</w:t>
+      </w:r>
+      <w:r>
+        <w:rPr>
+          <w:rFonts w:ascii="Arial" w:hAnsi="Arial" w:cs="Arial"/>
+          <w:sz w:val="24"/>
+          <w:szCs w:val="24"/>
+        </w:rPr>
+        <w:t xml:space="preserve"> Se ha utilizado para crear el comando que ejecuta el </w:t>
+      </w:r>
+      <w:proofErr w:type="spellStart"/>
+      <w:r>
+        <w:rPr>
+          <w:rFonts w:ascii="Arial" w:hAnsi="Arial" w:cs="Arial"/>
+          <w:b/>
+          <w:sz w:val="24"/>
+          <w:szCs w:val="24"/>
+        </w:rPr>
+        <w:t>worker</w:t>
+      </w:r>
+      <w:proofErr w:type="spellEnd"/>
+      <w:r>
+        <w:rPr>
+          <w:rFonts w:ascii="Arial" w:hAnsi="Arial" w:cs="Arial"/>
+          <w:sz w:val="24"/>
+          <w:szCs w:val="24"/>
+        </w:rPr>
+        <w:t xml:space="preserve"> </w:t>
+      </w:r>
+      <w:r>
+        <w:rPr>
+          <w:rFonts w:ascii="Arial" w:hAnsi="Arial" w:cs="Arial"/>
+          <w:sz w:val="24"/>
+          <w:szCs w:val="24"/>
+        </w:rPr>
+        <w:t>que se mantiene a la escucha de eventos de actualización de estaciones, así como para crear la cache inicial en Redis.</w:t>
+      </w:r>
+    </w:p>
+    <w:p>
+      <w:pPr>
+        <w:jc w:val="both"/>
+        <w:rPr>
+          <w:rFonts w:ascii="Arial" w:hAnsi="Arial" w:cs="Arial"/>
+          <w:sz w:val="24"/>
+          <w:szCs w:val="24"/>
+        </w:rPr>
+      </w:pPr>
+      <w:proofErr w:type="spellStart"/>
+      <w:r>
+        <w:rPr>
+          <w:rFonts w:ascii="Arial" w:hAnsi="Arial" w:cs="Arial"/>
+          <w:b/>
+          <w:sz w:val="24"/>
+          <w:szCs w:val="24"/>
+        </w:rPr>
+        <w:t>symfony</w:t>
+      </w:r>
+      <w:proofErr w:type="spellEnd"/>
+      <w:r>
+        <w:rPr>
+          <w:rFonts w:ascii="Arial" w:hAnsi="Arial" w:cs="Arial"/>
+          <w:b/>
+          <w:sz w:val="24"/>
+          <w:szCs w:val="24"/>
+        </w:rPr>
+        <w:t>/</w:t>
+      </w:r>
+      <w:proofErr w:type="spellStart"/>
+      <w:r>
+        <w:rPr>
+          <w:rFonts w:ascii="Arial" w:hAnsi="Arial" w:cs="Arial"/>
+          <w:b/>
+          <w:sz w:val="24"/>
+          <w:szCs w:val="24"/>
+        </w:rPr>
+        <w:t>dotenv</w:t>
+      </w:r>
+      <w:proofErr w:type="spellEnd"/>
+      <w:r>
+        <w:rPr>
+          <w:rFonts w:ascii="Arial" w:hAnsi="Arial" w:cs="Arial"/>
+          <w:b/>
+          <w:sz w:val="24"/>
+          <w:szCs w:val="24"/>
+        </w:rPr>
+        <w:t>:</w:t>
+      </w:r>
+      <w:r>
+        <w:rPr>
+          <w:rFonts w:ascii="Arial" w:hAnsi="Arial" w:cs="Arial"/>
+          <w:b/>
+          <w:sz w:val="24"/>
+          <w:szCs w:val="24"/>
+        </w:rPr>
+        <w:t xml:space="preserve"> </w:t>
+      </w:r>
+      <w:r>
+        <w:rPr>
+          <w:rFonts w:ascii="Arial" w:hAnsi="Arial" w:cs="Arial"/>
+          <w:sz w:val="24"/>
+          <w:szCs w:val="24"/>
+        </w:rPr>
+        <w:t xml:space="preserve">analiza los </w:t>
+      </w:r>
+      <w:proofErr w:type="gramStart"/>
+      <w:r>
+        <w:rPr>
+          <w:rFonts w:ascii="Arial" w:hAnsi="Arial" w:cs="Arial"/>
+          <w:sz w:val="24"/>
+          <w:szCs w:val="24"/>
+        </w:rPr>
+        <w:t>archivos .</w:t>
+      </w:r>
+      <w:proofErr w:type="spellStart"/>
+      <w:r>
+        <w:rPr>
+          <w:rFonts w:ascii="Arial" w:hAnsi="Arial" w:cs="Arial"/>
+          <w:b/>
+          <w:sz w:val="24"/>
+          <w:szCs w:val="24"/>
+        </w:rPr>
+        <w:t>env</w:t>
+      </w:r>
+      <w:proofErr w:type="spellEnd"/>
+      <w:proofErr w:type="gramEnd"/>
+      <w:r>
+        <w:rPr>
+          <w:rFonts w:ascii="Arial" w:hAnsi="Arial" w:cs="Arial"/>
+          <w:sz w:val="24"/>
+          <w:szCs w:val="24"/>
+        </w:rPr>
+        <w:t xml:space="preserve"> para que las variables de entorno almacenadas en ellos sean accesibles a través de $ _ENV o $ _SERVER.</w:t>
+      </w:r>
+      <w:r>
+        <w:rPr>
+          <w:rFonts w:ascii="Arial" w:hAnsi="Arial" w:cs="Arial"/>
+          <w:sz w:val="24"/>
+          <w:szCs w:val="24"/>
+        </w:rPr>
+        <w:t xml:space="preserve"> Se ha utilizado para cargar las variables de entornos de la aplicación como son, la configuración de dirección de servidores</w:t>
+      </w:r>
+      <w:r>
+        <w:rPr>
+          <w:rFonts w:ascii="Arial" w:hAnsi="Arial" w:cs="Arial"/>
+          <w:sz w:val="24"/>
+          <w:szCs w:val="24"/>
+        </w:rPr>
+        <w:t xml:space="preserve"> y configurar los estados de la aplicación, refiérase a en estado de producción o de desarrollo.</w:t>
+      </w:r>
+    </w:p>
+    <w:p>
+      <w:pPr>
+        <w:jc w:val="both"/>
+        <w:rPr>
+          <w:rFonts w:ascii="Arial" w:hAnsi="Arial" w:cs="Arial"/>
+          <w:sz w:val="24"/>
+          <w:szCs w:val="24"/>
+        </w:rPr>
+      </w:pPr>
+      <w:proofErr w:type="spellStart"/>
+      <w:r>
+        <w:rPr>
+          <w:rFonts w:ascii="Arial" w:hAnsi="Arial" w:cs="Arial"/>
+          <w:b/>
+          <w:sz w:val="24"/>
+          <w:szCs w:val="24"/>
+        </w:rPr>
+        <w:t>symfony</w:t>
+      </w:r>
+      <w:proofErr w:type="spellEnd"/>
+      <w:r>
+        <w:rPr>
+          <w:rFonts w:ascii="Arial" w:hAnsi="Arial" w:cs="Arial"/>
+          <w:b/>
+          <w:sz w:val="24"/>
+          <w:szCs w:val="24"/>
+        </w:rPr>
+        <w:t>/http-client</w:t>
+      </w:r>
+      <w:r>
+        <w:rPr>
+          <w:rFonts w:ascii="Arial" w:hAnsi="Arial" w:cs="Arial"/>
+          <w:b/>
+          <w:sz w:val="24"/>
+          <w:szCs w:val="24"/>
+        </w:rPr>
+        <w:t xml:space="preserve">: </w:t>
+      </w:r>
+      <w:r>
+        <w:rPr>
+          <w:rFonts w:ascii="Arial" w:hAnsi="Arial" w:cs="Arial"/>
+          <w:sz w:val="24"/>
+          <w:szCs w:val="24"/>
+        </w:rPr>
+        <w:t xml:space="preserve">El componente </w:t>
+      </w:r>
+      <w:proofErr w:type="spellStart"/>
+      <w:r>
+        <w:rPr>
+          <w:rFonts w:ascii="Arial" w:hAnsi="Arial" w:cs="Arial"/>
+          <w:sz w:val="24"/>
+          <w:szCs w:val="24"/>
+        </w:rPr>
+        <w:t>HttpClient</w:t>
+      </w:r>
+      <w:proofErr w:type="spellEnd"/>
+      <w:r>
+        <w:rPr>
+          <w:rFonts w:ascii="Arial" w:hAnsi="Arial" w:cs="Arial"/>
+          <w:sz w:val="24"/>
+          <w:szCs w:val="24"/>
+        </w:rPr>
+        <w:t xml:space="preserve"> es un cliente HTTP de bajo nivel con soporte para envolturas de flujo PHP y cURL</w:t>
+      </w:r>
+      <w:r>
+        <w:rPr>
+          <w:rFonts w:ascii="Arial" w:hAnsi="Arial" w:cs="Arial"/>
+          <w:sz w:val="24"/>
+          <w:szCs w:val="24"/>
+          <w:vertAlign w:val="superscript"/>
+        </w:rPr>
+        <w:t>4</w:t>
+      </w:r>
+      <w:r>
+        <w:rPr>
+          <w:rFonts w:ascii="Arial" w:hAnsi="Arial" w:cs="Arial"/>
+          <w:sz w:val="24"/>
+          <w:szCs w:val="24"/>
+        </w:rPr>
+        <w:t>. Proporciona utilidades para consumir API y admite operaciones síncronas y asíncronas.</w:t>
+      </w:r>
+      <w:r>
+        <w:rPr>
+          <w:rFonts w:ascii="Arial" w:hAnsi="Arial" w:cs="Arial"/>
+          <w:sz w:val="24"/>
+          <w:szCs w:val="24"/>
+        </w:rPr>
+        <w:t xml:space="preserve"> En la aplicación se ha utilizado para consumir la API del backend 2, se ha preferido este componente antes que otro porque es altamente configurable en las peticiones pudiendo especificar al tipo de versión HTTP a utilizar, la cantidad de conexiones simultaneas que se desean </w:t>
+      </w:r>
+      <w:r>
+        <w:rPr>
+          <w:rFonts w:ascii="Arial" w:hAnsi="Arial" w:cs="Arial"/>
+          <w:sz w:val="24"/>
+          <w:szCs w:val="24"/>
+        </w:rPr>
+        <w:t>realizar,</w:t>
+      </w:r>
+      <w:r>
+        <w:rPr>
+          <w:rFonts w:ascii="Arial" w:hAnsi="Arial" w:cs="Arial"/>
+          <w:sz w:val="24"/>
+          <w:szCs w:val="24"/>
+        </w:rPr>
+        <w:t xml:space="preserve"> así como especificar que tecnología utilizar para realizar peticiones, </w:t>
+      </w:r>
+      <w:proofErr w:type="spellStart"/>
+      <w:r>
+        <w:rPr>
+          <w:rFonts w:ascii="Arial" w:hAnsi="Arial" w:cs="Arial"/>
+          <w:sz w:val="24"/>
+          <w:szCs w:val="24"/>
+        </w:rPr>
+        <w:t>cURL</w:t>
+      </w:r>
+      <w:proofErr w:type="spellEnd"/>
+      <w:r>
+        <w:rPr>
+          <w:rFonts w:ascii="Arial" w:hAnsi="Arial" w:cs="Arial"/>
+          <w:sz w:val="24"/>
+          <w:szCs w:val="24"/>
+        </w:rPr>
+        <w:t xml:space="preserve"> o PHP me he decantado por </w:t>
+      </w:r>
+      <w:proofErr w:type="spellStart"/>
+      <w:r>
+        <w:rPr>
+          <w:rFonts w:ascii="Arial" w:hAnsi="Arial" w:cs="Arial"/>
+          <w:sz w:val="24"/>
+          <w:szCs w:val="24"/>
+        </w:rPr>
+        <w:t>cURL</w:t>
+      </w:r>
+      <w:proofErr w:type="spellEnd"/>
+      <w:r>
+        <w:rPr>
+          <w:rFonts w:ascii="Arial" w:hAnsi="Arial" w:cs="Arial"/>
+          <w:sz w:val="24"/>
+          <w:szCs w:val="24"/>
+        </w:rPr>
+        <w:t xml:space="preserve"> principalmente porque es un software especializado en la transferencia de archivos.</w:t>
+      </w:r>
+    </w:p>
+    <w:p>
+      <w:pPr>
+        <w:jc w:val="both"/>
+        <w:rPr>
+          <w:rFonts w:ascii="Arial" w:hAnsi="Arial" w:cs="Arial"/>
+          <w:sz w:val="24"/>
+          <w:szCs w:val="24"/>
+        </w:rPr>
+      </w:pPr>
+      <w:proofErr w:type="spellStart"/>
+      <w:r>
+        <w:rPr>
+          <w:rFonts w:ascii="Arial" w:hAnsi="Arial" w:cs="Arial"/>
+          <w:b/>
+          <w:sz w:val="24"/>
+          <w:szCs w:val="24"/>
+        </w:rPr>
+        <w:t>symfony</w:t>
+      </w:r>
+      <w:proofErr w:type="spellEnd"/>
+      <w:r>
+        <w:rPr>
+          <w:rFonts w:ascii="Arial" w:hAnsi="Arial" w:cs="Arial"/>
+          <w:b/>
+          <w:sz w:val="24"/>
+          <w:szCs w:val="24"/>
+        </w:rPr>
+        <w:t>/http-</w:t>
+      </w:r>
+      <w:proofErr w:type="spellStart"/>
+      <w:r>
+        <w:rPr>
+          <w:rFonts w:ascii="Arial" w:hAnsi="Arial" w:cs="Arial"/>
+          <w:b/>
+          <w:sz w:val="24"/>
+          <w:szCs w:val="24"/>
+        </w:rPr>
+        <w:t>foundation</w:t>
+      </w:r>
+      <w:proofErr w:type="spellEnd"/>
+      <w:r>
+        <w:rPr>
+          <w:rFonts w:ascii="Arial" w:hAnsi="Arial" w:cs="Arial"/>
+          <w:b/>
+          <w:sz w:val="24"/>
+          <w:szCs w:val="24"/>
+        </w:rPr>
+        <w:t xml:space="preserve">: </w:t>
+      </w:r>
+      <w:r>
+        <w:rPr>
+          <w:rFonts w:ascii="Arial" w:hAnsi="Arial" w:cs="Arial"/>
+          <w:sz w:val="24"/>
+          <w:szCs w:val="24"/>
+        </w:rPr>
+        <w:t xml:space="preserve">El componente </w:t>
+      </w:r>
+      <w:proofErr w:type="spellStart"/>
+      <w:r>
+        <w:rPr>
+          <w:rFonts w:ascii="Arial" w:hAnsi="Arial" w:cs="Arial"/>
+          <w:sz w:val="24"/>
+          <w:szCs w:val="24"/>
+        </w:rPr>
+        <w:t>HttpFoundation</w:t>
+      </w:r>
+      <w:proofErr w:type="spellEnd"/>
+      <w:r>
+        <w:rPr>
+          <w:rFonts w:ascii="Arial" w:hAnsi="Arial" w:cs="Arial"/>
+          <w:sz w:val="24"/>
+          <w:szCs w:val="24"/>
+        </w:rPr>
+        <w:t xml:space="preserve"> define una capa orientada a objetos para la especificación HTTP.</w:t>
+      </w:r>
+      <w:r>
+        <w:rPr>
+          <w:rFonts w:ascii="Arial" w:hAnsi="Arial" w:cs="Arial"/>
+          <w:sz w:val="24"/>
+          <w:szCs w:val="24"/>
+        </w:rPr>
+        <w:t xml:space="preserve"> Según mi criterio uno de los componentes estrella. </w:t>
+      </w:r>
+      <w:r>
+        <w:rPr>
+          <w:rFonts w:ascii="Arial" w:hAnsi="Arial" w:cs="Arial"/>
+          <w:sz w:val="24"/>
+          <w:szCs w:val="24"/>
+        </w:rPr>
+        <w:t xml:space="preserve">En PHP, la solicitud está representada por algunas variables globales ($ _GET, $ _POST, $ _FILES, $ _COOKIE, $ _SESSION, ...) </w:t>
+      </w:r>
+      <w:r>
+        <w:rPr>
+          <w:rFonts w:ascii="Arial" w:hAnsi="Arial" w:cs="Arial"/>
+          <w:sz w:val="24"/>
+          <w:szCs w:val="24"/>
+        </w:rPr>
+        <w:lastRenderedPageBreak/>
+        <w:t xml:space="preserve">y la respuesta es generada por algunas funciones (echo, </w:t>
+      </w:r>
+      <w:proofErr w:type="spellStart"/>
+      <w:r>
+        <w:rPr>
+          <w:rFonts w:ascii="Arial" w:hAnsi="Arial" w:cs="Arial"/>
+          <w:sz w:val="24"/>
+          <w:szCs w:val="24"/>
+        </w:rPr>
+        <w:t>header</w:t>
+      </w:r>
+      <w:proofErr w:type="spellEnd"/>
+      <w:r>
+        <w:rPr>
+          <w:rFonts w:ascii="Arial" w:hAnsi="Arial" w:cs="Arial"/>
+          <w:sz w:val="24"/>
+          <w:szCs w:val="24"/>
+        </w:rPr>
+        <w:t xml:space="preserve"> (), </w:t>
+      </w:r>
+      <w:proofErr w:type="spellStart"/>
+      <w:r>
+        <w:rPr>
+          <w:rFonts w:ascii="Arial" w:hAnsi="Arial" w:cs="Arial"/>
+          <w:sz w:val="24"/>
+          <w:szCs w:val="24"/>
+        </w:rPr>
+        <w:t>setcookie</w:t>
+      </w:r>
+      <w:proofErr w:type="spellEnd"/>
+      <w:r>
+        <w:rPr>
+          <w:rFonts w:ascii="Arial" w:hAnsi="Arial" w:cs="Arial"/>
+          <w:sz w:val="24"/>
+          <w:szCs w:val="24"/>
+        </w:rPr>
+        <w:t xml:space="preserve"> (), ...)</w:t>
+      </w:r>
+    </w:p>
+    <w:p>
+      <w:pPr>
+        <w:jc w:val="both"/>
+        <w:rPr>
+          <w:rFonts w:ascii="Arial" w:hAnsi="Arial" w:cs="Arial"/>
+          <w:sz w:val="24"/>
+          <w:szCs w:val="24"/>
+        </w:rPr>
+      </w:pPr>
+      <w:r>
+        <w:rPr>
+          <w:rFonts w:ascii="Arial" w:hAnsi="Arial" w:cs="Arial"/>
+          <w:sz w:val="24"/>
+          <w:szCs w:val="24"/>
+        </w:rPr>
+        <w:t xml:space="preserve">El componente </w:t>
+      </w:r>
+      <w:proofErr w:type="spellStart"/>
+      <w:r>
+        <w:rPr>
+          <w:rFonts w:ascii="Arial" w:hAnsi="Arial" w:cs="Arial"/>
+          <w:sz w:val="24"/>
+          <w:szCs w:val="24"/>
+        </w:rPr>
+        <w:t>Symfony</w:t>
+      </w:r>
+      <w:proofErr w:type="spellEnd"/>
+      <w:r>
+        <w:rPr>
+          <w:rFonts w:ascii="Arial" w:hAnsi="Arial" w:cs="Arial"/>
+          <w:sz w:val="24"/>
+          <w:szCs w:val="24"/>
+        </w:rPr>
+        <w:t xml:space="preserve"> </w:t>
+      </w:r>
+      <w:proofErr w:type="spellStart"/>
+      <w:r>
+        <w:rPr>
+          <w:rFonts w:ascii="Arial" w:hAnsi="Arial" w:cs="Arial"/>
+          <w:sz w:val="24"/>
+          <w:szCs w:val="24"/>
+        </w:rPr>
+        <w:t>HttpFoundation</w:t>
+      </w:r>
+      <w:proofErr w:type="spellEnd"/>
+      <w:r>
+        <w:rPr>
+          <w:rFonts w:ascii="Arial" w:hAnsi="Arial" w:cs="Arial"/>
+          <w:sz w:val="24"/>
+          <w:szCs w:val="24"/>
+        </w:rPr>
+        <w:t xml:space="preserve"> reemplaza estas variables y funciones globales PHP predeterminadas</w:t>
+      </w:r>
+      <w:r>
+        <w:rPr>
+          <w:rFonts w:ascii="Arial" w:hAnsi="Arial" w:cs="Arial"/>
+          <w:sz w:val="24"/>
+          <w:szCs w:val="24"/>
+        </w:rPr>
+        <w:t>,</w:t>
+      </w:r>
+      <w:r>
+        <w:rPr>
+          <w:rFonts w:ascii="Arial" w:hAnsi="Arial" w:cs="Arial"/>
+          <w:sz w:val="24"/>
+          <w:szCs w:val="24"/>
+        </w:rPr>
+        <w:t xml:space="preserve"> por una capa orientada a objetos</w:t>
+      </w:r>
+      <w:r>
+        <w:rPr>
+          <w:rFonts w:ascii="Arial" w:hAnsi="Arial" w:cs="Arial"/>
+          <w:sz w:val="24"/>
+          <w:szCs w:val="24"/>
+        </w:rPr>
+        <w:t xml:space="preserve"> lo que la hace magnifica para el desarrollo de l</w:t>
+      </w:r>
+      <w:r>
+        <w:rPr>
+          <w:rFonts w:ascii="Arial" w:hAnsi="Arial" w:cs="Arial"/>
+          <w:sz w:val="24"/>
+          <w:szCs w:val="24"/>
+        </w:rPr>
+        <w:t>a API Rest</w:t>
+      </w:r>
+      <w:r>
+        <w:rPr>
+          <w:rFonts w:ascii="Arial" w:hAnsi="Arial" w:cs="Arial"/>
+          <w:sz w:val="24"/>
+          <w:szCs w:val="24"/>
+        </w:rPr>
+        <w:t>.</w:t>
+      </w:r>
+      <w:r>
+        <w:rPr>
+          <w:rFonts w:ascii="Arial" w:hAnsi="Arial" w:cs="Arial"/>
+          <w:sz w:val="24"/>
+          <w:szCs w:val="24"/>
+        </w:rPr>
+        <w:t xml:space="preserve"> Se ha utilizado </w:t>
+      </w:r>
+      <w:r>
+        <w:rPr>
+          <w:rFonts w:ascii="Arial" w:hAnsi="Arial" w:cs="Arial"/>
+          <w:sz w:val="24"/>
+          <w:szCs w:val="24"/>
+        </w:rPr>
+        <w:t xml:space="preserve">en </w:t>
+      </w:r>
+      <w:r>
+        <w:rPr>
+          <w:rFonts w:ascii="Arial" w:hAnsi="Arial" w:cs="Arial"/>
+          <w:sz w:val="24"/>
+          <w:szCs w:val="24"/>
+        </w:rPr>
+        <w:t xml:space="preserve">el proyecto para manejar todas las </w:t>
+      </w:r>
+      <w:r>
+        <w:rPr>
+          <w:rFonts w:ascii="Arial" w:hAnsi="Arial" w:cs="Arial"/>
+          <w:sz w:val="24"/>
+          <w:szCs w:val="24"/>
+        </w:rPr>
+        <w:t xml:space="preserve">peticiones </w:t>
+      </w:r>
+      <w:r>
+        <w:rPr>
+          <w:rFonts w:ascii="Arial" w:hAnsi="Arial" w:cs="Arial"/>
+          <w:sz w:val="24"/>
+          <w:szCs w:val="24"/>
+        </w:rPr>
+        <w:t>y</w:t>
+      </w:r>
+      <w:r>
+        <w:rPr>
+          <w:rFonts w:ascii="Arial" w:hAnsi="Arial" w:cs="Arial"/>
+          <w:sz w:val="24"/>
+          <w:szCs w:val="24"/>
+        </w:rPr>
+        <w:t xml:space="preserve"> </w:t>
+      </w:r>
+      <w:r>
+        <w:rPr>
+          <w:rFonts w:ascii="Arial" w:hAnsi="Arial" w:cs="Arial"/>
+          <w:sz w:val="24"/>
+          <w:szCs w:val="24"/>
+        </w:rPr>
+        <w:t>respuestas de la API</w:t>
+      </w:r>
+      <w:r>
+        <w:rPr>
+          <w:rFonts w:ascii="Arial" w:hAnsi="Arial" w:cs="Arial"/>
+          <w:sz w:val="24"/>
+          <w:szCs w:val="24"/>
+        </w:rPr>
+        <w:t xml:space="preserve"> a través </w:t>
+      </w:r>
+      <w:r>
+        <w:rPr>
+          <w:rFonts w:ascii="Arial" w:hAnsi="Arial" w:cs="Arial"/>
+          <w:sz w:val="24"/>
+          <w:szCs w:val="24"/>
+        </w:rPr>
+        <w:t xml:space="preserve">del objeto </w:t>
+      </w:r>
+      <w:r>
+        <w:rPr>
+          <w:rFonts w:ascii="Arial" w:hAnsi="Arial" w:cs="Arial"/>
+          <w:b/>
+          <w:sz w:val="24"/>
+          <w:szCs w:val="24"/>
+        </w:rPr>
+        <w:t>Request</w:t>
+      </w:r>
+      <w:r>
+        <w:rPr>
+          <w:rFonts w:ascii="Arial" w:hAnsi="Arial" w:cs="Arial"/>
+          <w:sz w:val="24"/>
+          <w:szCs w:val="24"/>
+        </w:rPr>
+        <w:t xml:space="preserve"> y </w:t>
+      </w:r>
+      <w:r>
+        <w:rPr>
+          <w:rFonts w:ascii="Arial" w:hAnsi="Arial" w:cs="Arial"/>
+          <w:sz w:val="24"/>
+          <w:szCs w:val="24"/>
+        </w:rPr>
+        <w:t xml:space="preserve">del objeto </w:t>
+      </w:r>
+      <w:proofErr w:type="spellStart"/>
+      <w:r>
+        <w:rPr>
+          <w:rFonts w:ascii="Arial" w:hAnsi="Arial" w:cs="Arial"/>
+          <w:b/>
+          <w:sz w:val="24"/>
+          <w:szCs w:val="24"/>
+        </w:rPr>
+        <w:t>JsonResponse</w:t>
+      </w:r>
+      <w:proofErr w:type="spellEnd"/>
+      <w:r>
+        <w:rPr>
+          <w:rFonts w:ascii="Arial" w:hAnsi="Arial" w:cs="Arial"/>
+          <w:sz w:val="24"/>
+          <w:szCs w:val="24"/>
+        </w:rPr>
+        <w:t xml:space="preserve"> exceptuando las respuestas a rutas </w:t>
+      </w:r>
+      <w:r>
+        <w:rPr>
+          <w:rFonts w:ascii="Arial" w:hAnsi="Arial" w:cs="Arial"/>
+          <w:sz w:val="24"/>
+          <w:szCs w:val="24"/>
+        </w:rPr>
+        <w:t>que no existen que veremos en otro componente</w:t>
+      </w:r>
+      <w:r>
+        <w:rPr>
+          <w:rFonts w:ascii="Arial" w:hAnsi="Arial" w:cs="Arial"/>
+          <w:sz w:val="24"/>
+          <w:szCs w:val="24"/>
+        </w:rPr>
+        <w:t>.</w:t>
+      </w:r>
+    </w:p>
+    <w:p>
+      <w:pPr>
+        <w:jc w:val="both"/>
+        <w:rPr>
+          <w:rFonts w:ascii="Arial" w:hAnsi="Arial" w:cs="Arial"/>
+          <w:sz w:val="24"/>
+          <w:szCs w:val="24"/>
+        </w:rPr>
+      </w:pPr>
+      <w:proofErr w:type="spellStart"/>
+      <w:r>
+        <w:rPr>
+          <w:rFonts w:ascii="Arial" w:hAnsi="Arial" w:cs="Arial"/>
+          <w:b/>
+          <w:sz w:val="24"/>
+          <w:szCs w:val="24"/>
+        </w:rPr>
+        <w:t>Symfony</w:t>
+      </w:r>
+      <w:proofErr w:type="spellEnd"/>
+      <w:r>
+        <w:rPr>
+          <w:rFonts w:ascii="Arial" w:hAnsi="Arial" w:cs="Arial"/>
+          <w:b/>
+          <w:sz w:val="24"/>
+          <w:szCs w:val="24"/>
+        </w:rPr>
+        <w:t>/</w:t>
+      </w:r>
+      <w:proofErr w:type="spellStart"/>
+      <w:r>
+        <w:rPr>
+          <w:rFonts w:ascii="Arial" w:hAnsi="Arial" w:cs="Arial"/>
+          <w:b/>
+          <w:sz w:val="24"/>
+          <w:szCs w:val="24"/>
+        </w:rPr>
+        <w:t>Routing</w:t>
+      </w:r>
+      <w:proofErr w:type="spellEnd"/>
+      <w:r>
+        <w:t xml:space="preserve"> </w:t>
+      </w:r>
+      <w:r>
+        <w:rPr>
+          <w:rFonts w:ascii="Arial" w:hAnsi="Arial" w:cs="Arial"/>
+          <w:sz w:val="24"/>
+          <w:szCs w:val="24"/>
+        </w:rPr>
+        <w:t>El componente de enrutamiento asigna una solicitud HTTP a un conjunto de variables de configuración. Se utiliza para construir sistemas de enrutamiento para aplicaciones web donde cada URL está asociada con algún código para ejecutar.</w:t>
+      </w:r>
+      <w:r>
+        <w:rPr>
+          <w:rFonts w:ascii="Arial" w:hAnsi="Arial" w:cs="Arial"/>
+          <w:sz w:val="24"/>
+          <w:szCs w:val="24"/>
+        </w:rPr>
+        <w:t xml:space="preserve"> Se ha utilizado para indicar la función a ejecutar al realizar una llamada a una URL del dominio de la API</w:t>
+      </w:r>
+      <w:r>
+        <w:rPr>
+          <w:rFonts w:ascii="Arial" w:hAnsi="Arial" w:cs="Arial"/>
+          <w:sz w:val="24"/>
+          <w:szCs w:val="24"/>
+        </w:rPr>
+        <w:t>,</w:t>
+      </w:r>
+      <w:r>
+        <w:rPr>
+          <w:rFonts w:ascii="Arial" w:hAnsi="Arial" w:cs="Arial"/>
+          <w:sz w:val="24"/>
+          <w:szCs w:val="24"/>
+        </w:rPr>
+        <w:t xml:space="preserve"> </w:t>
+      </w:r>
+      <w:r>
+        <w:rPr>
+          <w:rFonts w:ascii="Arial" w:hAnsi="Arial" w:cs="Arial"/>
+          <w:sz w:val="24"/>
+          <w:szCs w:val="24"/>
+        </w:rPr>
+        <w:t>a través de</w:t>
+      </w:r>
+      <w:r>
+        <w:rPr>
+          <w:rFonts w:ascii="Arial" w:hAnsi="Arial" w:cs="Arial"/>
+          <w:sz w:val="24"/>
+          <w:szCs w:val="24"/>
+        </w:rPr>
+        <w:t xml:space="preserve"> </w:t>
+      </w:r>
+      <w:proofErr w:type="spellStart"/>
+      <w:r>
+        <w:rPr>
+          <w:rFonts w:ascii="Arial" w:hAnsi="Arial" w:cs="Arial"/>
+          <w:sz w:val="24"/>
+          <w:szCs w:val="24"/>
+        </w:rPr>
+        <w:t>Annotation</w:t>
+      </w:r>
+      <w:proofErr w:type="spellEnd"/>
+      <w:r>
+        <w:rPr>
+          <w:rFonts w:ascii="Arial" w:hAnsi="Arial" w:cs="Arial"/>
+          <w:sz w:val="24"/>
+          <w:szCs w:val="24"/>
+        </w:rPr>
+        <w:t>\</w:t>
+      </w:r>
+      <w:proofErr w:type="spellStart"/>
+      <w:r>
+        <w:rPr>
+          <w:rFonts w:ascii="Arial" w:hAnsi="Arial" w:cs="Arial"/>
+          <w:sz w:val="24"/>
+          <w:szCs w:val="24"/>
+        </w:rPr>
+        <w:t>Route</w:t>
+      </w:r>
+      <w:proofErr w:type="spellEnd"/>
+      <w:r>
+        <w:rPr>
+          <w:rFonts w:ascii="Arial" w:hAnsi="Arial" w:cs="Arial"/>
+          <w:sz w:val="24"/>
+          <w:szCs w:val="24"/>
+        </w:rPr>
+        <w:t xml:space="preserve">, </w:t>
+      </w:r>
+      <w:r>
+        <w:rPr>
+          <w:rFonts w:ascii="Arial" w:hAnsi="Arial" w:cs="Arial"/>
+          <w:sz w:val="24"/>
+          <w:szCs w:val="24"/>
+        </w:rPr>
+        <w:t xml:space="preserve">se habilita para un </w:t>
+      </w:r>
+      <w:proofErr w:type="spellStart"/>
+      <w:r>
+        <w:rPr>
+          <w:rFonts w:ascii="Arial" w:hAnsi="Arial" w:cs="Arial"/>
+          <w:sz w:val="24"/>
+          <w:szCs w:val="24"/>
+        </w:rPr>
+        <w:t>controller</w:t>
+      </w:r>
+      <w:proofErr w:type="spellEnd"/>
+      <w:r>
+        <w:rPr>
+          <w:rFonts w:ascii="Arial" w:hAnsi="Arial" w:cs="Arial"/>
+          <w:sz w:val="24"/>
+          <w:szCs w:val="24"/>
+        </w:rPr>
+        <w:t xml:space="preserve"> una URL determinada, se ha preferido definir las rutas como </w:t>
+      </w:r>
+      <w:proofErr w:type="spellStart"/>
+      <w:r>
+        <w:rPr>
+          <w:rFonts w:ascii="Arial" w:hAnsi="Arial" w:cs="Arial"/>
+          <w:sz w:val="24"/>
+          <w:szCs w:val="24"/>
+        </w:rPr>
+        <w:t>annotations</w:t>
+      </w:r>
+      <w:proofErr w:type="spellEnd"/>
+      <w:r>
+        <w:rPr>
+          <w:rFonts w:ascii="Arial" w:hAnsi="Arial" w:cs="Arial"/>
+          <w:sz w:val="24"/>
+          <w:szCs w:val="24"/>
+        </w:rPr>
+        <w:t xml:space="preserve"> debido a que se puede identificar y asignar más fácil la función de un </w:t>
+      </w:r>
+      <w:proofErr w:type="spellStart"/>
+      <w:r>
+        <w:rPr>
+          <w:rFonts w:ascii="Arial" w:hAnsi="Arial" w:cs="Arial"/>
+          <w:sz w:val="24"/>
+          <w:szCs w:val="24"/>
+        </w:rPr>
+        <w:t>controller</w:t>
+      </w:r>
+      <w:proofErr w:type="spellEnd"/>
+      <w:r>
+        <w:rPr>
+          <w:rFonts w:ascii="Arial" w:hAnsi="Arial" w:cs="Arial"/>
+          <w:sz w:val="24"/>
+          <w:szCs w:val="24"/>
+        </w:rPr>
+        <w:t xml:space="preserve"> para una ruta determinada.</w:t>
+      </w:r>
+    </w:p>
+    <w:p>
+      <w:pPr>
+        <w:jc w:val="both"/>
+        <w:rPr>
+          <w:rFonts w:ascii="Arial" w:hAnsi="Arial" w:cs="Arial"/>
+          <w:b/>
+          <w:sz w:val="24"/>
+          <w:szCs w:val="24"/>
+        </w:rPr>
+      </w:pPr>
+      <w:proofErr w:type="spellStart"/>
+      <w:r>
+        <w:rPr>
+          <w:rFonts w:ascii="Arial" w:hAnsi="Arial" w:cs="Arial"/>
+          <w:b/>
+          <w:sz w:val="24"/>
+          <w:szCs w:val="24"/>
+        </w:rPr>
+        <w:t>Bundles</w:t>
+      </w:r>
+      <w:proofErr w:type="spellEnd"/>
+    </w:p>
+    <w:p>
+      <w:pPr>
+        <w:jc w:val="both"/>
+        <w:rPr>
+          <w:rFonts w:ascii="Arial" w:hAnsi="Arial" w:cs="Arial"/>
+          <w:sz w:val="24"/>
+          <w:szCs w:val="24"/>
+        </w:rPr>
+      </w:pPr>
+      <w:r>
+        <w:rPr>
+          <w:rFonts w:ascii="Arial" w:hAnsi="Arial" w:cs="Arial"/>
+          <w:sz w:val="24"/>
+          <w:szCs w:val="24"/>
+        </w:rPr>
+        <w:t xml:space="preserve">Un </w:t>
+      </w:r>
+      <w:proofErr w:type="spellStart"/>
+      <w:r>
+        <w:rPr>
+          <w:rFonts w:ascii="Arial" w:hAnsi="Arial" w:cs="Arial"/>
+          <w:sz w:val="24"/>
+          <w:szCs w:val="24"/>
+        </w:rPr>
+        <w:t>bundle</w:t>
+      </w:r>
+      <w:proofErr w:type="spellEnd"/>
+      <w:r>
+        <w:rPr>
+          <w:rFonts w:ascii="Arial" w:hAnsi="Arial" w:cs="Arial"/>
+          <w:sz w:val="24"/>
+          <w:szCs w:val="24"/>
+        </w:rPr>
+        <w:t xml:space="preserve"> (paquete) </w:t>
+      </w:r>
+      <w:r>
+        <w:rPr>
+          <w:rFonts w:ascii="Arial" w:hAnsi="Arial" w:cs="Arial"/>
+          <w:sz w:val="24"/>
+          <w:szCs w:val="24"/>
+        </w:rPr>
+        <w:t xml:space="preserve">es similar a un </w:t>
+      </w:r>
+      <w:r>
+        <w:rPr>
+          <w:rFonts w:ascii="Arial" w:hAnsi="Arial" w:cs="Arial"/>
+          <w:sz w:val="24"/>
+          <w:szCs w:val="24"/>
+        </w:rPr>
+        <w:t>plugin</w:t>
+      </w:r>
+      <w:r>
+        <w:rPr>
+          <w:rFonts w:ascii="Arial" w:hAnsi="Arial" w:cs="Arial"/>
+          <w:sz w:val="24"/>
+          <w:szCs w:val="24"/>
+        </w:rPr>
+        <w:t xml:space="preserve"> en otro software, pero aún mejor. Las características principales </w:t>
+      </w:r>
+      <w:r>
+        <w:rPr>
+          <w:rFonts w:ascii="Arial" w:hAnsi="Arial" w:cs="Arial"/>
+          <w:sz w:val="24"/>
+          <w:szCs w:val="24"/>
+        </w:rPr>
+        <w:t>enmarcadas en</w:t>
+      </w:r>
+      <w:r>
+        <w:rPr>
+          <w:rFonts w:ascii="Arial" w:hAnsi="Arial" w:cs="Arial"/>
+          <w:sz w:val="24"/>
+          <w:szCs w:val="24"/>
+        </w:rPr>
+        <w:t xml:space="preserve"> </w:t>
+      </w:r>
+      <w:proofErr w:type="spellStart"/>
+      <w:r>
+        <w:rPr>
+          <w:rFonts w:ascii="Arial" w:hAnsi="Arial" w:cs="Arial"/>
+          <w:sz w:val="24"/>
+          <w:szCs w:val="24"/>
+        </w:rPr>
+        <w:t>Symfony</w:t>
+      </w:r>
+      <w:proofErr w:type="spellEnd"/>
+      <w:r>
+        <w:rPr>
+          <w:rFonts w:ascii="Arial" w:hAnsi="Arial" w:cs="Arial"/>
+          <w:sz w:val="24"/>
+          <w:szCs w:val="24"/>
+        </w:rPr>
+        <w:t xml:space="preserve"> se implementan con paquetes (</w:t>
+      </w:r>
+      <w:proofErr w:type="spellStart"/>
+      <w:r>
+        <w:rPr>
+          <w:rFonts w:ascii="Arial" w:hAnsi="Arial" w:cs="Arial"/>
+          <w:sz w:val="24"/>
+          <w:szCs w:val="24"/>
+        </w:rPr>
+        <w:t>FrameworkBundle</w:t>
+      </w:r>
+      <w:proofErr w:type="spellEnd"/>
+      <w:r>
+        <w:rPr>
+          <w:rFonts w:ascii="Arial" w:hAnsi="Arial" w:cs="Arial"/>
+          <w:sz w:val="24"/>
+          <w:szCs w:val="24"/>
+        </w:rPr>
+        <w:t xml:space="preserve">, </w:t>
+      </w:r>
+      <w:proofErr w:type="spellStart"/>
+      <w:r>
+        <w:rPr>
+          <w:rFonts w:ascii="Arial" w:hAnsi="Arial" w:cs="Arial"/>
+          <w:sz w:val="24"/>
+          <w:szCs w:val="24"/>
+        </w:rPr>
+        <w:t>SecurityBundle</w:t>
+      </w:r>
+      <w:proofErr w:type="spellEnd"/>
+      <w:r>
+        <w:rPr>
+          <w:rFonts w:ascii="Arial" w:hAnsi="Arial" w:cs="Arial"/>
+          <w:sz w:val="24"/>
+          <w:szCs w:val="24"/>
+        </w:rPr>
+        <w:t xml:space="preserve">, </w:t>
+      </w:r>
+      <w:proofErr w:type="spellStart"/>
+      <w:r>
+        <w:rPr>
+          <w:rFonts w:ascii="Arial" w:hAnsi="Arial" w:cs="Arial"/>
+          <w:sz w:val="24"/>
+          <w:szCs w:val="24"/>
+        </w:rPr>
+        <w:t>DebugBundle</w:t>
+      </w:r>
+      <w:proofErr w:type="spellEnd"/>
+      <w:r>
+        <w:rPr>
+          <w:rFonts w:ascii="Arial" w:hAnsi="Arial" w:cs="Arial"/>
+          <w:sz w:val="24"/>
+          <w:szCs w:val="24"/>
+        </w:rPr>
+        <w:t xml:space="preserve">, etc.) También se usan para agregar nuevas características </w:t>
+      </w:r>
+      <w:r>
+        <w:rPr>
+          <w:rFonts w:ascii="Arial" w:hAnsi="Arial" w:cs="Arial"/>
+          <w:sz w:val="24"/>
+          <w:szCs w:val="24"/>
+        </w:rPr>
+        <w:t>a la</w:t>
+      </w:r>
+      <w:r>
+        <w:rPr>
+          <w:rFonts w:ascii="Arial" w:hAnsi="Arial" w:cs="Arial"/>
+          <w:sz w:val="24"/>
+          <w:szCs w:val="24"/>
+        </w:rPr>
+        <w:t xml:space="preserve"> aplicación a través de paquetes de terceros.</w:t>
+      </w:r>
+      <w:r>
+        <w:rPr>
+          <w:rFonts w:ascii="Arial" w:hAnsi="Arial" w:cs="Arial"/>
+          <w:sz w:val="24"/>
+          <w:szCs w:val="24"/>
+        </w:rPr>
+        <w:t xml:space="preserve"> En el desarrollo de la API se han utilizado varios, como son:</w:t>
+      </w:r>
+    </w:p>
+    <w:p>
+      <w:pPr>
+        <w:jc w:val="both"/>
+        <w:rPr>
+          <w:rFonts w:ascii="Arial" w:hAnsi="Arial" w:cs="Arial"/>
+          <w:sz w:val="24"/>
+          <w:szCs w:val="24"/>
+        </w:rPr>
+      </w:pPr>
+      <w:proofErr w:type="spellStart"/>
+      <w:r>
+        <w:rPr>
+          <w:rFonts w:ascii="Arial" w:hAnsi="Arial" w:cs="Arial"/>
+          <w:b/>
+          <w:sz w:val="24"/>
+          <w:szCs w:val="24"/>
+        </w:rPr>
+        <w:t>S</w:t>
+      </w:r>
+      <w:r>
+        <w:rPr>
+          <w:rFonts w:ascii="Arial" w:hAnsi="Arial" w:cs="Arial"/>
+          <w:b/>
+          <w:sz w:val="24"/>
+          <w:szCs w:val="24"/>
+        </w:rPr>
+        <w:t>ymfony</w:t>
+      </w:r>
+      <w:proofErr w:type="spellEnd"/>
+      <w:r>
+        <w:rPr>
+          <w:rFonts w:ascii="Arial" w:hAnsi="Arial" w:cs="Arial"/>
+          <w:b/>
+          <w:sz w:val="24"/>
+          <w:szCs w:val="24"/>
+        </w:rPr>
+        <w:t>/</w:t>
+      </w:r>
+      <w:proofErr w:type="spellStart"/>
+      <w:r>
+        <w:rPr>
+          <w:rFonts w:ascii="Arial" w:hAnsi="Arial" w:cs="Arial"/>
+          <w:b/>
+          <w:sz w:val="24"/>
+          <w:szCs w:val="24"/>
+        </w:rPr>
+        <w:t>maker-bundle</w:t>
+      </w:r>
+      <w:proofErr w:type="spellEnd"/>
+      <w:r>
+        <w:rPr>
+          <w:rFonts w:ascii="Arial" w:hAnsi="Arial" w:cs="Arial"/>
+          <w:b/>
+          <w:sz w:val="24"/>
+          <w:szCs w:val="24"/>
+        </w:rPr>
+        <w:t>:</w:t>
+      </w:r>
+      <w:r>
+        <w:rPr>
+          <w:rFonts w:ascii="Arial" w:hAnsi="Arial" w:cs="Arial"/>
+          <w:sz w:val="24"/>
+          <w:szCs w:val="24"/>
+        </w:rPr>
+        <w:t xml:space="preserve"> </w:t>
+      </w:r>
+      <w:proofErr w:type="spellStart"/>
+      <w:r>
+        <w:rPr>
+          <w:rFonts w:ascii="Arial" w:hAnsi="Arial" w:cs="Arial"/>
+          <w:sz w:val="24"/>
+          <w:szCs w:val="24"/>
+        </w:rPr>
+        <w:t>Symfony</w:t>
+      </w:r>
+      <w:proofErr w:type="spellEnd"/>
+      <w:r>
+        <w:rPr>
+          <w:rFonts w:ascii="Arial" w:hAnsi="Arial" w:cs="Arial"/>
+          <w:sz w:val="24"/>
+          <w:szCs w:val="24"/>
+        </w:rPr>
+        <w:t xml:space="preserve"> </w:t>
+      </w:r>
+      <w:proofErr w:type="spellStart"/>
+      <w:r>
+        <w:rPr>
+          <w:rFonts w:ascii="Arial" w:hAnsi="Arial" w:cs="Arial"/>
+          <w:sz w:val="24"/>
+          <w:szCs w:val="24"/>
+        </w:rPr>
+        <w:t>Maker</w:t>
+      </w:r>
+      <w:proofErr w:type="spellEnd"/>
+      <w:r>
+        <w:rPr>
+          <w:rFonts w:ascii="Arial" w:hAnsi="Arial" w:cs="Arial"/>
+          <w:sz w:val="24"/>
+          <w:szCs w:val="24"/>
+        </w:rPr>
+        <w:t xml:space="preserve"> </w:t>
+      </w:r>
+      <w:r>
+        <w:rPr>
+          <w:rFonts w:ascii="Arial" w:hAnsi="Arial" w:cs="Arial"/>
+          <w:sz w:val="24"/>
+          <w:szCs w:val="24"/>
+        </w:rPr>
+        <w:t xml:space="preserve">automatiza el proceso de </w:t>
+      </w:r>
+      <w:r>
+        <w:rPr>
+          <w:rFonts w:ascii="Arial" w:hAnsi="Arial" w:cs="Arial"/>
+          <w:sz w:val="24"/>
+          <w:szCs w:val="24"/>
+        </w:rPr>
+        <w:t>crea</w:t>
+      </w:r>
+      <w:r>
+        <w:rPr>
+          <w:rFonts w:ascii="Arial" w:hAnsi="Arial" w:cs="Arial"/>
+          <w:sz w:val="24"/>
+          <w:szCs w:val="24"/>
+        </w:rPr>
+        <w:t>ción de</w:t>
+      </w:r>
+      <w:r>
+        <w:rPr>
+          <w:rFonts w:ascii="Arial" w:hAnsi="Arial" w:cs="Arial"/>
+          <w:sz w:val="24"/>
+          <w:szCs w:val="24"/>
+        </w:rPr>
+        <w:t xml:space="preserve"> comandos</w:t>
+      </w:r>
+      <w:r>
+        <w:rPr>
+          <w:rFonts w:ascii="Arial" w:hAnsi="Arial" w:cs="Arial"/>
+          <w:sz w:val="24"/>
+          <w:szCs w:val="24"/>
+        </w:rPr>
+        <w:t>,</w:t>
+      </w:r>
+      <w:r>
+        <w:rPr>
+          <w:rFonts w:ascii="Arial" w:hAnsi="Arial" w:cs="Arial"/>
+          <w:sz w:val="24"/>
+          <w:szCs w:val="24"/>
+        </w:rPr>
+        <w:t xml:space="preserve"> controladores, </w:t>
+      </w:r>
+      <w:r>
+        <w:rPr>
+          <w:rFonts w:ascii="Arial" w:hAnsi="Arial" w:cs="Arial"/>
+          <w:sz w:val="24"/>
+          <w:szCs w:val="24"/>
+        </w:rPr>
+        <w:t xml:space="preserve">test, etc. Evitando tener que repetir continuadamente la </w:t>
+      </w:r>
+      <w:proofErr w:type="spellStart"/>
+      <w:r>
+        <w:rPr>
+          <w:rFonts w:ascii="Arial" w:hAnsi="Arial" w:cs="Arial"/>
+          <w:sz w:val="24"/>
+          <w:szCs w:val="24"/>
+        </w:rPr>
+        <w:t>creacion</w:t>
+      </w:r>
+      <w:proofErr w:type="spellEnd"/>
+      <w:r>
+        <w:rPr>
+          <w:rFonts w:ascii="Arial" w:hAnsi="Arial" w:cs="Arial"/>
+          <w:sz w:val="24"/>
+          <w:szCs w:val="24"/>
+        </w:rPr>
+        <w:t xml:space="preserve"> de código análogo como pudiera ser la </w:t>
+      </w:r>
+      <w:r>
+        <w:rPr>
+          <w:rFonts w:ascii="Arial" w:hAnsi="Arial" w:cs="Arial"/>
+          <w:sz w:val="24"/>
+          <w:szCs w:val="24"/>
+        </w:rPr>
+        <w:t>creación</w:t>
+      </w:r>
+      <w:r>
+        <w:rPr>
+          <w:rFonts w:ascii="Arial" w:hAnsi="Arial" w:cs="Arial"/>
+          <w:sz w:val="24"/>
+          <w:szCs w:val="24"/>
+        </w:rPr>
+        <w:t xml:space="preserve"> individual de controladores</w:t>
+      </w:r>
+      <w:r>
+        <w:rPr>
+          <w:rFonts w:ascii="Arial" w:hAnsi="Arial" w:cs="Arial"/>
+          <w:sz w:val="24"/>
+          <w:szCs w:val="24"/>
+        </w:rPr>
+        <w:t>. Se ha utilizado en la fase de desarrollo para crear todos los controladores y comandos.</w:t>
+      </w:r>
+    </w:p>
+    <w:p>
+      <w:pPr>
+        <w:jc w:val="both"/>
+        <w:rPr>
+          <w:rFonts w:ascii="Arial" w:hAnsi="Arial" w:cs="Arial"/>
+          <w:sz w:val="24"/>
+          <w:szCs w:val="24"/>
+        </w:rPr>
+      </w:pPr>
+      <w:proofErr w:type="spellStart"/>
+      <w:r>
+        <w:rPr>
+          <w:rFonts w:ascii="Arial" w:hAnsi="Arial" w:cs="Arial"/>
+          <w:b/>
+          <w:sz w:val="24"/>
+          <w:szCs w:val="24"/>
+        </w:rPr>
+        <w:t>NelmioCorsBundle</w:t>
+      </w:r>
+      <w:proofErr w:type="spellEnd"/>
+      <w:r>
+        <w:rPr>
+          <w:rFonts w:ascii="Arial" w:hAnsi="Arial" w:cs="Arial"/>
+          <w:b/>
+          <w:sz w:val="24"/>
+          <w:szCs w:val="24"/>
+        </w:rPr>
+        <w:t>:</w:t>
+      </w:r>
+      <w:r>
+        <w:rPr>
+          <w:rFonts w:ascii="Arial" w:hAnsi="Arial" w:cs="Arial"/>
+          <w:sz w:val="24"/>
+          <w:szCs w:val="24"/>
+        </w:rPr>
+        <w:t xml:space="preserve"> </w:t>
+      </w:r>
+      <w:r>
+        <w:rPr>
+          <w:rFonts w:ascii="Arial" w:hAnsi="Arial" w:cs="Arial"/>
+          <w:sz w:val="24"/>
+          <w:szCs w:val="24"/>
+        </w:rPr>
+        <w:t>P</w:t>
+      </w:r>
+      <w:r>
+        <w:rPr>
+          <w:rFonts w:ascii="Arial" w:hAnsi="Arial" w:cs="Arial"/>
+          <w:sz w:val="24"/>
+          <w:szCs w:val="24"/>
+        </w:rPr>
+        <w:t>ermite enviar encabezados de uso compartido de recursos de origen cruzado con una configuración por URL de estilo ACL.</w:t>
+      </w:r>
+      <w:r>
+        <w:rPr>
+          <w:rFonts w:ascii="Arial" w:hAnsi="Arial" w:cs="Arial"/>
+          <w:sz w:val="24"/>
+          <w:szCs w:val="24"/>
+        </w:rPr>
+        <w:t xml:space="preserve"> Se ha utilizado para permitir la peticiones por parte del frontend a la API, para evitar los ataques de tipo </w:t>
+      </w:r>
+      <w:proofErr w:type="spellStart"/>
+      <w:r>
+        <w:rPr>
+          <w:rFonts w:ascii="Arial" w:hAnsi="Arial" w:cs="Arial"/>
+          <w:sz w:val="24"/>
+          <w:szCs w:val="24"/>
+        </w:rPr>
+        <w:t>cross</w:t>
+      </w:r>
+      <w:proofErr w:type="spellEnd"/>
+      <w:r>
+        <w:rPr>
+          <w:rFonts w:ascii="Arial" w:hAnsi="Arial" w:cs="Arial"/>
+          <w:sz w:val="24"/>
+          <w:szCs w:val="24"/>
+        </w:rPr>
+        <w:t xml:space="preserve"> </w:t>
+      </w:r>
+      <w:proofErr w:type="spellStart"/>
+      <w:r>
+        <w:rPr>
+          <w:rFonts w:ascii="Arial" w:hAnsi="Arial" w:cs="Arial"/>
+          <w:sz w:val="24"/>
+          <w:szCs w:val="24"/>
+        </w:rPr>
+        <w:t>site</w:t>
+      </w:r>
+      <w:proofErr w:type="spellEnd"/>
+      <w:r>
+        <w:rPr>
+          <w:rFonts w:ascii="Arial" w:hAnsi="Arial" w:cs="Arial"/>
+          <w:sz w:val="24"/>
+          <w:szCs w:val="24"/>
+        </w:rPr>
+        <w:t xml:space="preserve"> scripting.</w:t>
+      </w:r>
+      <w:bookmarkStart w:id="0" w:name="_GoBack"/>
+      <w:bookmarkEnd w:id="0"/>
     </w:p>
     <w:p>
       <w:pPr>
@@ -748,6 +2257,7 @@
           <w:sz w:val="24"/>
           <w:szCs w:val="24"/>
         </w:rPr>
+        <w:lastRenderedPageBreak/>
         <w:drawing>
           <wp:inline distT="0" distB="0" distL="0" distR="0" wp14:anchorId="604CF6A7" wp14:editId="15500976">
             <wp:extent cx="2089150" cy="1078055"/>
@@ -926,24 +2436,32 @@
           <w:sz w:val="24"/>
           <w:szCs w:val="24"/>
         </w:rPr>
+        <w:t xml:space="preserve">Como se puede observar se han definido varios índices que agilizaran el proceso de búsqueda de datos, los </w:t>
+      </w:r>
+      <w:r>
+        <w:rPr>
+          <w:rFonts w:ascii="Arial" w:hAnsi="Arial" w:cs="Arial"/>
+          <w:sz w:val="24"/>
+          <w:szCs w:val="24"/>
+        </w:rPr>
+        <w:t xml:space="preserve">tamaños de campos y los tipos de datos se han escogido teniendo en cuenta los valores que se persistirán, se ha escogido la codificación de caracteres utf8 que </w:t>
+      </w:r>
+      <w:r>
+        <w:rPr>
+          <w:rFonts w:ascii="Arial" w:hAnsi="Arial" w:cs="Arial"/>
+          <w:sz w:val="24"/>
+          <w:szCs w:val="24"/>
+        </w:rPr>
+        <w:t xml:space="preserve">es capaz de reconocer cualquier carácter Unicode, teniendo en cuanta que la aplicación Meteosalle en general podrá ser accedida por cualquier persona y los caracteres del idioma no son iguales en </w:t>
+      </w:r>
+      <w:r>
+        <w:rPr>
+          <w:rFonts w:ascii="Arial" w:hAnsi="Arial" w:cs="Arial"/>
+          <w:sz w:val="24"/>
+          <w:szCs w:val="24"/>
+        </w:rPr>
         <w:lastRenderedPageBreak/>
-        <w:t xml:space="preserve">Como se puede observar se han definido varios índices que agilizaran el proceso de búsqueda de datos, los </w:t>
-      </w:r>
-      <w:r>
-        <w:rPr>
-          <w:rFonts w:ascii="Arial" w:hAnsi="Arial" w:cs="Arial"/>
-          <w:sz w:val="24"/>
-          <w:szCs w:val="24"/>
-        </w:rPr>
-        <w:t xml:space="preserve">tamaños de campos y los tipos de datos se han escogido teniendo en cuenta los valores que se persistirán, se ha escogido la codificación de caracteres utf8 que </w:t>
-      </w:r>
-      <w:r>
-        <w:rPr>
-          <w:rFonts w:ascii="Arial" w:hAnsi="Arial" w:cs="Arial"/>
-          <w:sz w:val="24"/>
-          <w:szCs w:val="24"/>
-        </w:rPr>
-        <w:t xml:space="preserve">es capaz de reconocer cualquier carácter Unicode, teniendo en cuanta que la aplicación Meteosalle en general podrá ser accedida por cualquier persona y los caracteres del idioma no son iguales en todos los </w:t>
+        <w:t xml:space="preserve">todos los </w:t>
       </w:r>
       <w:r>
         <w:rPr>
@@ -1801,119 +3319,119 @@
         <w:rPr>
           <w:lang w:val="en-US"/>
         </w:rPr>
+        <w:t xml:space="preserve">  `location` </w:t>
+      </w:r>
+      <w:proofErr w:type="gramStart"/>
+      <w:r>
+        <w:rPr>
+          <w:lang w:val="en-US"/>
+        </w:rPr>
+        <w:t>varchar(</w:t>
+      </w:r>
+      <w:proofErr w:type="gramEnd"/>
+      <w:r>
+        <w:rPr>
+          <w:lang w:val="en-US"/>
+        </w:rPr>
+        <w:t>255) DEFAULT NULL,</w:t>
+      </w:r>
+    </w:p>
+    <w:p>
+      <w:pPr>
+        <w:pStyle w:val="Sinespaciado"/>
+        <w:rPr>
+          <w:lang w:val="en-US"/>
+        </w:rPr>
+      </w:pPr>
+      <w:r>
+        <w:rPr>
+          <w:lang w:val="en-US"/>
+        </w:rPr>
+        <w:t xml:space="preserve">  `timestamp` timestamp NULL DEFAULT CURRENT_TIMESTAMP,</w:t>
+      </w:r>
+    </w:p>
+    <w:p>
+      <w:pPr>
+        <w:pStyle w:val="Sinespaciado"/>
+        <w:rPr>
+          <w:lang w:val="en-US"/>
+        </w:rPr>
+      </w:pPr>
+      <w:r>
+        <w:rPr>
+          <w:lang w:val="en-US"/>
+        </w:rPr>
+        <w:t xml:space="preserve">  `</w:t>
+      </w:r>
+      <w:proofErr w:type="spellStart"/>
+      <w:r>
+        <w:rPr>
+          <w:lang w:val="en-US"/>
+        </w:rPr>
+        <w:t>deletedStation</w:t>
+      </w:r>
+      <w:proofErr w:type="spellEnd"/>
+      <w:r>
+        <w:rPr>
+          <w:lang w:val="en-US"/>
+        </w:rPr>
+        <w:t xml:space="preserve">` </w:t>
+      </w:r>
+      <w:proofErr w:type="gramStart"/>
+      <w:r>
+        <w:rPr>
+          <w:lang w:val="en-US"/>
+        </w:rPr>
+        <w:t>char(</w:t>
+      </w:r>
+      <w:proofErr w:type="gramEnd"/>
+      <w:r>
+        <w:rPr>
+          <w:lang w:val="en-US"/>
+        </w:rPr>
+        <w:t>1) NOT NULL DEFAULT '0',</w:t>
+      </w:r>
+    </w:p>
+    <w:p>
+      <w:pPr>
+        <w:pStyle w:val="Sinespaciado"/>
+        <w:rPr>
+          <w:lang w:val="en-US"/>
+        </w:rPr>
+      </w:pPr>
+      <w:r>
+        <w:rPr>
+          <w:lang w:val="en-US"/>
+        </w:rPr>
+        <w:t xml:space="preserve">  `state` </w:t>
+      </w:r>
+      <w:proofErr w:type="gramStart"/>
+      <w:r>
+        <w:rPr>
+          <w:lang w:val="en-US"/>
+        </w:rPr>
+        <w:t>varchar(</w:t>
+      </w:r>
+      <w:proofErr w:type="gramEnd"/>
+      <w:r>
+        <w:rPr>
+          <w:lang w:val="en-US"/>
+        </w:rPr>
+        <w:t>45) DEFAULT NULL,</w:t>
+      </w:r>
+    </w:p>
+    <w:p>
+      <w:pPr>
+        <w:pStyle w:val="Sinespaciado"/>
+        <w:rPr>
+          <w:lang w:val="en-US"/>
+        </w:rPr>
+      </w:pPr>
+      <w:r>
+        <w:rPr>
+          <w:lang w:val="en-US"/>
+        </w:rPr>
         <w:lastRenderedPageBreak/>
-        <w:t xml:space="preserve">  `location` </w:t>
-      </w:r>
-      <w:proofErr w:type="gramStart"/>
-      <w:r>
-        <w:rPr>
-          <w:lang w:val="en-US"/>
-        </w:rPr>
-        <w:t>varchar(</w:t>
-      </w:r>
-      <w:proofErr w:type="gramEnd"/>
-      <w:r>
-        <w:rPr>
-          <w:lang w:val="en-US"/>
-        </w:rPr>
-        <w:t>255) DEFAULT NULL,</w:t>
-      </w:r>
-    </w:p>
-    <w:p>
-      <w:pPr>
-        <w:pStyle w:val="Sinespaciado"/>
-        <w:rPr>
-          <w:lang w:val="en-US"/>
-        </w:rPr>
-      </w:pPr>
-      <w:r>
-        <w:rPr>
-          <w:lang w:val="en-US"/>
-        </w:rPr>
-        <w:t xml:space="preserve">  `timestamp` timestamp NULL DEFAULT CURRENT_TIMESTAMP,</w:t>
-      </w:r>
-    </w:p>
-    <w:p>
-      <w:pPr>
-        <w:pStyle w:val="Sinespaciado"/>
-        <w:rPr>
-          <w:lang w:val="en-US"/>
-        </w:rPr>
-      </w:pPr>
-      <w:r>
-        <w:rPr>
-          <w:lang w:val="en-US"/>
-        </w:rPr>
-        <w:t xml:space="preserve">  `</w:t>
-      </w:r>
-      <w:proofErr w:type="spellStart"/>
-      <w:r>
-        <w:rPr>
-          <w:lang w:val="en-US"/>
-        </w:rPr>
-        <w:t>deletedStation</w:t>
-      </w:r>
-      <w:proofErr w:type="spellEnd"/>
-      <w:r>
-        <w:rPr>
-          <w:lang w:val="en-US"/>
-        </w:rPr>
-        <w:t xml:space="preserve">` </w:t>
-      </w:r>
-      <w:proofErr w:type="gramStart"/>
-      <w:r>
-        <w:rPr>
-          <w:lang w:val="en-US"/>
-        </w:rPr>
-        <w:t>char(</w:t>
-      </w:r>
-      <w:proofErr w:type="gramEnd"/>
-      <w:r>
-        <w:rPr>
-          <w:lang w:val="en-US"/>
-        </w:rPr>
-        <w:t>1) NOT NULL DEFAULT '0',</w:t>
-      </w:r>
-    </w:p>
-    <w:p>
-      <w:pPr>
-        <w:pStyle w:val="Sinespaciado"/>
-        <w:rPr>
-          <w:lang w:val="en-US"/>
-        </w:rPr>
-      </w:pPr>
-      <w:r>
-        <w:rPr>
-          <w:lang w:val="en-US"/>
-        </w:rPr>
-        <w:t xml:space="preserve">  `state` </w:t>
-      </w:r>
-      <w:proofErr w:type="gramStart"/>
-      <w:r>
-        <w:rPr>
-          <w:lang w:val="en-US"/>
-        </w:rPr>
-        <w:t>varchar(</w:t>
-      </w:r>
-      <w:proofErr w:type="gramEnd"/>
-      <w:r>
-        <w:rPr>
-          <w:lang w:val="en-US"/>
-        </w:rPr>
-        <w:t>45) DEFAULT NULL,</w:t>
-      </w:r>
-    </w:p>
-    <w:p>
-      <w:pPr>
-        <w:pStyle w:val="Sinespaciado"/>
-        <w:rPr>
-          <w:lang w:val="en-US"/>
-        </w:rPr>
-      </w:pPr>
-      <w:r>
-        <w:rPr>
-          <w:lang w:val="en-US"/>
-        </w:rPr>
         <w:t xml:space="preserve">  PRIMARY KEY (`id`),</w:t>
       </w:r>
     </w:p>
@@ -2966,7 +4484,7 @@
           <w:sz w:val="24"/>
           <w:szCs w:val="24"/>
         </w:rPr>
-        <w:t xml:space="preserve">es un protocolo de estándar abierto en la capa de aplicaciones de un sistema de </w:t>
+        <w:t>es un protocolo de estándar abierto en la capa de aplicaciones de un sistema de comunicación. Las características que definen al protocolo AMQP son la orientación a mensajes, encolamiento ("queuing"), enrutamiento (tanto punto-a-</w:t>
       </w:r>
       <w:r>
         <w:rPr>
@@ -2975,7 +4493,7 @@
           <w:szCs w:val="24"/>
         </w:rPr>
         <w:lastRenderedPageBreak/>
-        <w:t xml:space="preserve">comunicación. Las características que definen al protocolo AMQP son la orientación a mensajes, encolamiento ("queuing"), enrutamiento (tanto punto-a-punto como publicación-subscripción), exactitud y seguridad. El código fuente está liberado bajo la licencia Mozilla Public License. En el proyecto se utiliza principalmente para crear un proceso paralelo que actualice los valores de las estaciones en la base de datos de </w:t>
+        <w:t xml:space="preserve">punto como publicación-subscripción), exactitud y seguridad. El código fuente está liberado bajo la licencia Mozilla Public License. En el proyecto se utiliza principalmente para crear un proceso paralelo que actualice los valores de las estaciones en la base de datos de </w:t>
       </w:r>
       <w:r>
         <w:rPr>
@@ -3777,7 +5295,18 @@
           <w:szCs w:val="24"/>
           <w:shd w:val="clear" w:color="auto" w:fill="FFFFFF"/>
         </w:rPr>
-        <w:t xml:space="preserve">través del intercambio de representaciones de recursos y utilizando verbos HTTP para realizar operaciones sobre los recursos. </w:t>
+        <w:t xml:space="preserve">través del intercambio de representaciones de recursos y utilizando </w:t>
+      </w:r>
+      <w:r>
+        <w:rPr>
+          <w:rFonts w:ascii="Arial" w:hAnsi="Arial" w:cs="Arial"/>
+          <w:color w:val="000000"/>
+          <w:sz w:val="24"/>
+          <w:szCs w:val="24"/>
+          <w:shd w:val="clear" w:color="auto" w:fill="FFFFFF"/>
+        </w:rPr>
+        <w:lastRenderedPageBreak/>
+        <w:t xml:space="preserve">verbos HTTP para realizar operaciones sobre los recursos. </w:t>
       </w:r>
       <w:r>
         <w:rPr>
@@ -3830,7 +5359,6 @@
           <w:szCs w:val="24"/>
           <w:shd w:val="clear" w:color="auto" w:fill="FFFFFF"/>
         </w:rPr>
-        <w:lastRenderedPageBreak/>
         <w:t xml:space="preserve">Los verbos http utilizados en la aplicación </w:t>
       </w:r>
       <w:r>
@@ -4783,7 +6311,6 @@
           <w:szCs w:val="24"/>
           <w:lang w:val="en-US"/>
         </w:rPr>
-        <w:lastRenderedPageBreak/>
         <w:t>Response on fail header code 400</w:t>
       </w:r>
     </w:p>
@@ -6682,6 +8209,7 @@
           <w:szCs w:val="18"/>
           <w:lang w:eastAsia="es-ES"/>
         </w:rPr>
+        <w:lastRenderedPageBreak/>
         <w:t xml:space="preserve">            </w:t>
       </w:r>
       <w:r>
@@ -7274,7 +8802,6 @@
           <w:szCs w:val="18"/>
           <w:lang w:eastAsia="es-ES"/>
         </w:rPr>
-        <w:lastRenderedPageBreak/>
         <w:t xml:space="preserve">    </w:t>
       </w:r>
       <w:r>
@@ -10077,6 +11604,7 @@
           <w:szCs w:val="18"/>
           <w:lang w:eastAsia="es-ES"/>
         </w:rPr>
+        <w:lastRenderedPageBreak/>
         <w:t xml:space="preserve">            </w:t>
       </w:r>
       <w:r>
@@ -10943,7 +12471,6 @@
           <w:szCs w:val="18"/>
           <w:lang w:eastAsia="es-ES"/>
         </w:rPr>
-        <w:lastRenderedPageBreak/>
         <w:t xml:space="preserve">        </w:t>
       </w:r>
       <w:r>
@@ -12325,7 +13852,6 @@
           <w:szCs w:val="24"/>
           <w:lang w:val="en-US"/>
         </w:rPr>
-        <w:lastRenderedPageBreak/>
         <w:t>Response on fail header code 400</w:t>
       </w:r>
     </w:p>
@@ -13670,6 +15196,7 @@
           <w:szCs w:val="18"/>
           <w:lang w:eastAsia="es-ES"/>
         </w:rPr>
+        <w:lastRenderedPageBreak/>
         <w:t xml:space="preserve">        </w:t>
       </w:r>
       <w:r>
@@ -14876,7 +16403,6 @@
           <w:szCs w:val="18"/>
           <w:lang w:eastAsia="es-ES"/>
         </w:rPr>
-        <w:lastRenderedPageBreak/>
         <w:t xml:space="preserve">        </w:t>
       </w:r>
       <w:r>
@@ -17008,6 +18534,7 @@
           <w:szCs w:val="24"/>
           <w:lang w:val="en-US"/>
         </w:rPr>
+        <w:lastRenderedPageBreak/>
         <w:t>Response on fail header code 400 404</w:t>
       </w:r>
       <w:r>
@@ -17262,7 +18789,6 @@
           <w:szCs w:val="24"/>
           <w:lang w:val="en-US"/>
         </w:rPr>
-        <w:lastRenderedPageBreak/>
         <w:t>header code 404</w:t>
       </w:r>
     </w:p>
@@ -18172,6 +19698,7 @@
           <w:szCs w:val="18"/>
           <w:lang w:eastAsia="es-ES"/>
         </w:rPr>
+        <w:lastRenderedPageBreak/>
         <w:t xml:space="preserve">        </w:t>
       </w:r>
       <w:r>
@@ -20306,6 +21833,7 @@
           <w:szCs w:val="18"/>
           <w:lang w:eastAsia="es-ES"/>
         </w:rPr>
+        <w:lastRenderedPageBreak/>
         <w:t xml:space="preserve">        </w:t>
       </w:r>
       <w:r>
@@ -22304,7 +23832,6 @@
           <w:szCs w:val="18"/>
           <w:lang w:eastAsia="es-ES"/>
         </w:rPr>
-        <w:lastRenderedPageBreak/>
         <w:t xml:space="preserve">        </w:t>
       </w:r>
       <w:r>
@@ -22837,6 +24364,7 @@
           <w:sz w:val="24"/>
           <w:szCs w:val="24"/>
         </w:rPr>
+        <w:lastRenderedPageBreak/>
         <w:t>postalCode</w:t>
       </w:r>
     </w:p>
@@ -23319,7 +24847,6 @@
           <w:sz w:val="24"/>
           <w:szCs w:val="24"/>
         </w:rPr>
-        <w:lastRenderedPageBreak/>
         <w:t>Request</w:t>
       </w:r>
     </w:p>
@@ -23694,6 +25221,7 @@
           <w:sz w:val="24"/>
           <w:szCs w:val="24"/>
         </w:rPr>
+        <w:lastRenderedPageBreak/>
         <w:t>Parámetros</w:t>
       </w:r>
       <w:r>
@@ -24431,7 +25959,6 @@
           <w:szCs w:val="24"/>
           <w:lang w:val="en-US"/>
         </w:rPr>
-        <w:lastRenderedPageBreak/>
         <w:t xml:space="preserve">Response on fail header code </w:t>
       </w:r>
       <w:r>
@@ -24786,6 +26313,7 @@
           <w:szCs w:val="24"/>
           <w:lang w:val="en-US"/>
         </w:rPr>
+        <w:lastRenderedPageBreak/>
         <w:t>{</w:t>
       </w:r>
     </w:p>
@@ -25376,7 +26904,6 @@
           <w:sz w:val="24"/>
           <w:szCs w:val="24"/>
         </w:rPr>
-        <w:lastRenderedPageBreak/>
         <w:t>Servicio</w:t>
       </w:r>
     </w:p>
@@ -25785,6 +27312,7 @@
           <w:szCs w:val="18"/>
           <w:lang w:val="en-US" w:eastAsia="es-ES"/>
         </w:rPr>
+        <w:lastRenderedPageBreak/>
         <w:t xml:space="preserve">        </w:t>
       </w:r>
       <w:r>
@@ -28223,7 +29751,6 @@
           <w:szCs w:val="18"/>
           <w:lang w:val="en-US" w:eastAsia="es-ES"/>
         </w:rPr>
-        <w:lastRenderedPageBreak/>
         <w:t xml:space="preserve">            </w:t>
       </w:r>
       <w:r>
@@ -29118,6 +30645,7 @@
           <w:szCs w:val="18"/>
           <w:lang w:val="en-US" w:eastAsia="es-ES"/>
         </w:rPr>
+        <w:lastRenderedPageBreak/>
         <w:t xml:space="preserve">                </w:t>
       </w:r>
       <w:r>
@@ -31945,7 +33473,6 @@
           <w:szCs w:val="18"/>
           <w:lang w:val="en-US" w:eastAsia="es-ES"/>
         </w:rPr>
-        <w:lastRenderedPageBreak/>
         <w:t xml:space="preserve">                </w:t>
       </w:r>
       <w:r>
@@ -32597,6 +34124,7 @@
           <w:szCs w:val="18"/>
           <w:lang w:eastAsia="es-ES"/>
         </w:rPr>
+        <w:lastRenderedPageBreak/>
         <w:t xml:space="preserve">        </w:t>
       </w:r>
       <w:r>
@@ -33441,7 +34969,6 @@
           <w:szCs w:val="24"/>
           <w:lang w:val="en-US"/>
         </w:rPr>
-        <w:lastRenderedPageBreak/>
         <w:t xml:space="preserve">Response on fail header code </w:t>
       </w:r>
       <w:r>
@@ -33900,8 +35427,6 @@
         </w:rPr>
         <w:t>{</w:t>
       </w:r>
-      <w:bookmarkStart w:id="0" w:name="_GoBack"/>
-      <w:bookmarkEnd w:id="0"/>
     </w:p>
     <w:p>
       <w:pPr>
@@ -34343,11 +35868,6 @@
     <w:p>
       <w:pPr>
         <w:pStyle w:val="Sinespaciado"/>
-        <w:rPr>
-          <w:rFonts w:ascii="Arial" w:hAnsi="Arial" w:cs="Arial"/>
-          <w:sz w:val="24"/>
-          <w:szCs w:val="24"/>
-        </w:rPr>
       </w:pPr>
       <w:hyperlink r:id="rId33" w:history="1">
         <w:r>
@@ -34360,6 +35880,32 @@
     </w:p>
     <w:p>
       <w:pPr>
+        <w:pStyle w:val="Sinespaciado"/>
+      </w:pPr>
+      <w:r>
+        <w:t>Componente de consola</w:t>
+      </w:r>
+    </w:p>
+    <w:p>
+      <w:pPr>
+        <w:pStyle w:val="Sinespaciado"/>
+        <w:rPr>
+          <w:rFonts w:ascii="Arial" w:hAnsi="Arial" w:cs="Arial"/>
+          <w:sz w:val="24"/>
+          <w:szCs w:val="24"/>
+        </w:rPr>
+      </w:pPr>
+      <w:hyperlink r:id="rId34" w:history="1">
+        <w:r>
+          <w:rPr>
+            <w:rStyle w:val="Hipervnculo"/>
+          </w:rPr>
+          <w:t>https://symfony.com/doc/current/components/console.html</w:t>
+        </w:r>
+      </w:hyperlink>
+    </w:p>
+    <w:p>
+      <w:pPr>
         <w:jc w:val="both"/>
         <w:rPr>
           <w:rFonts w:ascii="Arial" w:hAnsi="Arial" w:cs="Arial"/>
@@ -34449,7 +35995,7 @@
       </w:pPr>
     </w:p>
     <w:sectPr>
-      <w:footerReference w:type="default" r:id="rId34"/>
+      <w:footerReference w:type="default" r:id="rId35"/>
       <w:pgSz w:w="11906" w:h="16838"/>
       <w:pgMar w:top="1417" w:right="1701" w:bottom="1417" w:left="1701" w:header="708" w:footer="708" w:gutter="0"/>
       <w:cols w:space="708"/>
@@ -34637,6 +36183,64 @@
         <w:szCs w:val="18"/>
       </w:rPr>
       <w:t xml:space="preserve"> 4</w:t>
+    </w:r>
+  </w:p>
+  <w:p>
+    <w:pPr>
+      <w:pStyle w:val="Piedepgina"/>
+      <w:numPr>
+        <w:ilvl w:val="0"/>
+        <w:numId w:val="1"/>
+      </w:numPr>
+      <w:rPr>
+        <w:rFonts w:asciiTheme="majorHAnsi" w:hAnsiTheme="majorHAnsi" w:cstheme="majorHAnsi"/>
+        <w:sz w:val="18"/>
+        <w:szCs w:val="18"/>
+      </w:rPr>
+    </w:pPr>
+    <w:proofErr w:type="spellStart"/>
+    <w:r>
+      <w:rPr>
+        <w:rFonts w:asciiTheme="majorHAnsi" w:hAnsiTheme="majorHAnsi" w:cstheme="majorHAnsi"/>
+        <w:sz w:val="18"/>
+        <w:szCs w:val="18"/>
+      </w:rPr>
+      <w:t>cURL</w:t>
+    </w:r>
+    <w:proofErr w:type="spellEnd"/>
+    <w:r>
+      <w:rPr>
+        <w:rFonts w:asciiTheme="majorHAnsi" w:hAnsiTheme="majorHAnsi" w:cstheme="majorHAnsi"/>
+        <w:sz w:val="18"/>
+        <w:szCs w:val="18"/>
+      </w:rPr>
+      <w:t xml:space="preserve"> es un proyecto de software consistente en una biblioteca y un intérprete de comandos orientado a la transferencia de archivos. Soporta los protocolos FTP, FTPS, HTTP, HTTPS, TFTP, SCP, SFTP, Telnet, DICT, FILE y LDAP, entre otros</w:t>
+    </w:r>
+    <w:r>
+      <w:rPr>
+        <w:rFonts w:asciiTheme="majorHAnsi" w:hAnsiTheme="majorHAnsi" w:cstheme="majorHAnsi"/>
+        <w:sz w:val="18"/>
+        <w:szCs w:val="18"/>
+      </w:rPr>
+      <w:t xml:space="preserve"> </w:t>
+    </w:r>
+    <w:proofErr w:type="spellStart"/>
+    <w:r>
+      <w:rPr>
+        <w:rFonts w:asciiTheme="majorHAnsi" w:hAnsiTheme="majorHAnsi" w:cstheme="majorHAnsi"/>
+        <w:sz w:val="18"/>
+        <w:szCs w:val="18"/>
+      </w:rPr>
+      <w:t>pagina</w:t>
+    </w:r>
+    <w:proofErr w:type="spellEnd"/>
+    <w:r>
+      <w:rPr>
+        <w:rFonts w:asciiTheme="majorHAnsi" w:hAnsiTheme="majorHAnsi" w:cstheme="majorHAnsi"/>
+        <w:sz w:val="18"/>
+        <w:szCs w:val="18"/>
+      </w:rPr>
+      <w:t xml:space="preserve"> 2</w:t>
     </w:r>
   </w:p>
   <w:p>
@@ -36981,7 +38585,7 @@
 </file>
 
 <file path=customXml/itemProps1.xml><?xml version="1.0" encoding="utf-8"?>
-<ds:datastoreItem xmlns:ds="http://schemas.openxmlformats.org/officeDocument/2006/customXml" ds:itemID="{56894E6C-8C86-490B-B8A9-D1E87384CB90}">
+<ds:datastoreItem xmlns:ds="http://schemas.openxmlformats.org/officeDocument/2006/customXml" ds:itemID="{D511C308-084F-4381-8167-05A97C95063D}">
   <ds:schemaRefs>
     <ds:schemaRef ds:uri="http://schemas.openxmlformats.org/officeDocument/2006/bibliography"/>
   </ds:schemaRefs>

</xml_diff>

<commit_message>
Movidos los listener a infraestructura debido a que dependen de interfaces del framework
</commit_message>
<xml_diff>
--- a/documentacion/memoria David.docx
+++ b/documentacion/memoria David.docx
@@ -17622,7 +17622,27 @@
           <w:szCs w:val="24"/>
           <w:shd w:val="clear" w:color="auto" w:fill="FFFFFF"/>
         </w:rPr>
-        <w:t>Midelware</w:t>
+        <w:t>Midel</w:t>
+      </w:r>
+      <w:r>
+        <w:rPr>
+          <w:rFonts w:ascii="Arial" w:hAnsi="Arial" w:cs="Arial"/>
+          <w:color w:val="000000"/>
+          <w:sz w:val="24"/>
+          <w:szCs w:val="24"/>
+          <w:shd w:val="clear" w:color="auto" w:fill="FFFFFF"/>
+        </w:rPr>
+        <w:t>l</w:t>
+      </w:r>
+      <w:r>
+        <w:rPr>
+          <w:rFonts w:ascii="Arial" w:hAnsi="Arial" w:cs="Arial"/>
+          <w:color w:val="000000"/>
+          <w:sz w:val="24"/>
+          <w:szCs w:val="24"/>
+          <w:shd w:val="clear" w:color="auto" w:fill="FFFFFF"/>
+        </w:rPr>
+        <w:t>ware</w:t>
       </w:r>
       <w:proofErr w:type="spellEnd"/>
       <w:r>
@@ -17867,6 +17887,56 @@
           <w:szCs w:val="24"/>
         </w:rPr>
       </w:pPr>
+      <w:r>
+        <w:rPr>
+          <w:rFonts w:ascii="Arial" w:hAnsi="Arial" w:cs="Arial"/>
+          <w:noProof/>
+          <w:sz w:val="24"/>
+          <w:szCs w:val="24"/>
+        </w:rPr>
+        <w:lastRenderedPageBreak/>
+        <w:drawing>
+          <wp:inline distT="0" distB="0" distL="0" distR="0" wp14:anchorId="4C96B153" wp14:editId="2048C1FD">
+            <wp:extent cx="5400040" cy="6687185"/>
+            <wp:effectExtent l="0" t="0" r="0" b="0"/>
+            <wp:docPr id="14" name="Imagen 14"/>
+            <wp:cNvGraphicFramePr>
+              <a:graphicFrameLocks xmlns:a="http://schemas.openxmlformats.org/drawingml/2006/main" noChangeAspect="1"/>
+            </wp:cNvGraphicFramePr>
+            <a:graphic xmlns:a="http://schemas.openxmlformats.org/drawingml/2006/main">
+              <a:graphicData uri="http://schemas.openxmlformats.org/drawingml/2006/picture">
+                <pic:pic xmlns:pic="http://schemas.openxmlformats.org/drawingml/2006/picture">
+                  <pic:nvPicPr>
+                    <pic:cNvPr id="14" name="ArquitecturaHexagonal API MeteoSalle.jpg"/>
+                    <pic:cNvPicPr/>
+                  </pic:nvPicPr>
+                  <pic:blipFill>
+                    <a:blip r:embed="rId20">
+                      <a:extLst>
+                        <a:ext uri="{28A0092B-C50C-407E-A947-70E740481C1C}">
+                          <a14:useLocalDpi xmlns:a14="http://schemas.microsoft.com/office/drawing/2010/main" val="0"/>
+                        </a:ext>
+                      </a:extLst>
+                    </a:blip>
+                    <a:stretch>
+                      <a:fillRect/>
+                    </a:stretch>
+                  </pic:blipFill>
+                  <pic:spPr>
+                    <a:xfrm>
+                      <a:off x="0" y="0"/>
+                      <a:ext cx="5400040" cy="6687185"/>
+                    </a:xfrm>
+                    <a:prstGeom prst="rect">
+                      <a:avLst/>
+                    </a:prstGeom>
+                  </pic:spPr>
+                </pic:pic>
+              </a:graphicData>
+            </a:graphic>
+          </wp:inline>
+        </w:drawing>
+      </w:r>
       <w:bookmarkStart w:id="1" w:name="_GoBack"/>
       <w:bookmarkEnd w:id="1"/>
     </w:p>
@@ -18015,7 +18085,7 @@
         </w:rPr>
         <w:t xml:space="preserve">Protocolo http: </w:t>
       </w:r>
-      <w:hyperlink r:id="rId20" w:history="1">
+      <w:hyperlink r:id="rId21" w:history="1">
         <w:r>
           <w:rPr>
             <w:rStyle w:val="Hipervnculo"/>
@@ -18036,7 +18106,7 @@
           <w:szCs w:val="24"/>
         </w:rPr>
       </w:pPr>
-      <w:hyperlink r:id="rId21" w:history="1">
+      <w:hyperlink r:id="rId22" w:history="1">
         <w:r>
           <w:rPr>
             <w:rStyle w:val="Hipervnculo"/>
@@ -18057,7 +18127,7 @@
           <w:szCs w:val="24"/>
         </w:rPr>
       </w:pPr>
-      <w:hyperlink r:id="rId22" w:history="1">
+      <w:hyperlink r:id="rId23" w:history="1">
         <w:r>
           <w:rPr>
             <w:rStyle w:val="Hipervnculo"/>
@@ -18078,7 +18148,7 @@
           <w:szCs w:val="24"/>
         </w:rPr>
       </w:pPr>
-      <w:hyperlink r:id="rId23" w:history="1">
+      <w:hyperlink r:id="rId24" w:history="1">
         <w:r>
           <w:rPr>
             <w:rStyle w:val="Hipervnculo"/>
@@ -18099,7 +18169,7 @@
           <w:szCs w:val="24"/>
         </w:rPr>
       </w:pPr>
-      <w:hyperlink r:id="rId24" w:history="1">
+      <w:hyperlink r:id="rId25" w:history="1">
         <w:r>
           <w:rPr>
             <w:rStyle w:val="Hipervnculo"/>
@@ -18120,7 +18190,7 @@
           <w:szCs w:val="24"/>
         </w:rPr>
       </w:pPr>
-      <w:hyperlink r:id="rId25" w:history="1">
+      <w:hyperlink r:id="rId26" w:history="1">
         <w:r>
           <w:rPr>
             <w:rStyle w:val="Hipervnculo"/>
@@ -18141,7 +18211,7 @@
           <w:szCs w:val="24"/>
         </w:rPr>
       </w:pPr>
-      <w:hyperlink r:id="rId26" w:history="1">
+      <w:hyperlink r:id="rId27" w:history="1">
         <w:r>
           <w:rPr>
             <w:rStyle w:val="Hipervnculo"/>
@@ -18163,7 +18233,7 @@
           <w:szCs w:val="24"/>
         </w:rPr>
       </w:pPr>
-      <w:hyperlink r:id="rId27" w:history="1">
+      <w:hyperlink r:id="rId28" w:history="1">
         <w:r>
           <w:rPr>
             <w:rStyle w:val="Hipervnculo"/>
@@ -18182,7 +18252,7 @@
           <w:rStyle w:val="Hipervnculo"/>
         </w:rPr>
       </w:pPr>
-      <w:hyperlink r:id="rId28" w:history="1">
+      <w:hyperlink r:id="rId29" w:history="1">
         <w:r>
           <w:rPr>
             <w:rStyle w:val="Hipervnculo"/>
@@ -18205,7 +18275,7 @@
         <w:pStyle w:val="Sinespaciado"/>
         <w:jc w:val="both"/>
       </w:pPr>
-      <w:hyperlink r:id="rId29" w:history="1">
+      <w:hyperlink r:id="rId30" w:history="1">
         <w:r>
           <w:rPr>
             <w:rStyle w:val="Hipervnculo"/>
@@ -18233,7 +18303,7 @@
           <w:szCs w:val="24"/>
         </w:rPr>
       </w:pPr>
-      <w:hyperlink r:id="rId30" w:history="1">
+      <w:hyperlink r:id="rId31" w:history="1">
         <w:r>
           <w:rPr>
             <w:rStyle w:val="Hipervnculo"/>
@@ -18333,7 +18403,7 @@
       </w:pPr>
     </w:p>
     <w:sectPr>
-      <w:footerReference w:type="default" r:id="rId31"/>
+      <w:footerReference w:type="default" r:id="rId32"/>
       <w:pgSz w:w="11906" w:h="16838"/>
       <w:pgMar w:top="1417" w:right="1701" w:bottom="1417" w:left="1701" w:header="708" w:footer="708" w:gutter="0"/>
       <w:cols w:space="708"/>
@@ -21331,7 +21401,7 @@
 </file>
 
 <file path=customXml/itemProps1.xml><?xml version="1.0" encoding="utf-8"?>
-<ds:datastoreItem xmlns:ds="http://schemas.openxmlformats.org/officeDocument/2006/customXml" ds:itemID="{C0280313-FC83-4698-9E8D-F3E01B5364EF}">
+<ds:datastoreItem xmlns:ds="http://schemas.openxmlformats.org/officeDocument/2006/customXml" ds:itemID="{A7FBEC6A-B7A9-4FDC-85F0-FA793EBCAA59}">
   <ds:schemaRefs>
     <ds:schemaRef ds:uri="http://schemas.openxmlformats.org/officeDocument/2006/bibliography"/>
   </ds:schemaRefs>

</xml_diff>

<commit_message>
Refactor de station repository
</commit_message>
<xml_diff>
--- a/documentacion/memoria David.docx
+++ b/documentacion/memoria David.docx
@@ -3459,7 +3459,6 @@
           <w:b/>
           <w:sz w:val="24"/>
           <w:szCs w:val="24"/>
-          <w:lang w:val="en-US"/>
         </w:rPr>
       </w:pPr>
       <w:r>
@@ -3468,7 +3467,6 @@
           <w:b/>
           <w:sz w:val="24"/>
           <w:szCs w:val="24"/>
-          <w:lang w:val="en-US"/>
         </w:rPr>
         <w:t>Table</w:t>
       </w:r>
@@ -3478,20 +3476,20 @@
           <w:b/>
           <w:sz w:val="24"/>
           <w:szCs w:val="24"/>
-          <w:lang w:val="en-US"/>
         </w:rPr>
         <w:t xml:space="preserve"> </w:t>
       </w:r>
+      <w:proofErr w:type="spellStart"/>
       <w:r>
         <w:rPr>
           <w:rFonts w:ascii="Arial" w:hAnsi="Arial" w:cs="Arial"/>
           <w:b/>
           <w:sz w:val="24"/>
           <w:szCs w:val="24"/>
-          <w:lang w:val="en-US"/>
         </w:rPr>
         <w:t>Station</w:t>
       </w:r>
+      <w:proofErr w:type="spellEnd"/>
     </w:p>
     <w:p>
       <w:pPr>
@@ -7163,6 +7161,7 @@
           <w:b/>
           <w:sz w:val="24"/>
           <w:szCs w:val="24"/>
+          <w:lang w:val="en-US"/>
         </w:rPr>
       </w:pPr>
     </w:p>
@@ -7174,6 +7173,7 @@
           <w:b/>
           <w:sz w:val="24"/>
           <w:szCs w:val="24"/>
+          <w:lang w:val="en-US"/>
         </w:rPr>
       </w:pPr>
     </w:p>
@@ -8299,48 +8299,15 @@
           <w:rFonts w:ascii="Arial" w:hAnsi="Arial" w:cs="Arial"/>
           <w:sz w:val="24"/>
           <w:szCs w:val="24"/>
-          <w:lang w:val="en-US"/>
-        </w:rPr>
-      </w:pPr>
-      <w:proofErr w:type="spellStart"/>
-      <w:r>
-        <w:rPr>
-          <w:rFonts w:ascii="Arial" w:hAnsi="Arial" w:cs="Arial"/>
-          <w:sz w:val="24"/>
-          <w:szCs w:val="24"/>
-          <w:lang w:val="en-US"/>
-        </w:rPr>
-        <w:t>Implementación</w:t>
-      </w:r>
-      <w:proofErr w:type="spellEnd"/>
-      <w:r>
-        <w:rPr>
-          <w:rFonts w:ascii="Arial" w:hAnsi="Arial" w:cs="Arial"/>
-          <w:sz w:val="24"/>
-          <w:szCs w:val="24"/>
-          <w:lang w:val="en-US"/>
-        </w:rPr>
-        <w:t xml:space="preserve"> </w:t>
-      </w:r>
-      <w:proofErr w:type="spellStart"/>
-      <w:r>
-        <w:rPr>
-          <w:rFonts w:ascii="Arial" w:hAnsi="Arial" w:cs="Arial"/>
-          <w:sz w:val="24"/>
-          <w:szCs w:val="24"/>
-          <w:lang w:val="en-US"/>
-        </w:rPr>
-        <w:t>concreta</w:t>
-      </w:r>
-      <w:proofErr w:type="spellEnd"/>
-      <w:r>
-        <w:rPr>
-          <w:rFonts w:ascii="Arial" w:hAnsi="Arial" w:cs="Arial"/>
-          <w:sz w:val="24"/>
-          <w:szCs w:val="24"/>
-          <w:lang w:val="en-US"/>
-        </w:rPr>
-        <w:t>.</w:t>
+        </w:rPr>
+      </w:pPr>
+      <w:r>
+        <w:rPr>
+          <w:rFonts w:ascii="Arial" w:hAnsi="Arial" w:cs="Arial"/>
+          <w:sz w:val="24"/>
+          <w:szCs w:val="24"/>
+        </w:rPr>
+        <w:t>Implementación concreta.</w:t>
       </w:r>
     </w:p>
     <w:p>
@@ -8350,7 +8317,6 @@
         <w:rPr>
           <w:rFonts w:ascii="Fira Code" w:hAnsi="Fira Code"/>
           <w:color w:val="A9B7C6"/>
-          <w:lang w:val="en-US"/>
         </w:rPr>
       </w:pPr>
       <w:r>
@@ -8358,17 +8324,33 @@
           <w:rFonts w:ascii="Fira Code" w:hAnsi="Fira Code"/>
           <w:color w:val="CC7832"/>
           <w:shd w:val="clear" w:color="auto" w:fill="232525"/>
-          <w:lang w:val="en-US"/>
-        </w:rPr>
-        <w:t xml:space="preserve">final class </w:t>
+        </w:rPr>
+        <w:t xml:space="preserve">final </w:t>
       </w:r>
       <w:proofErr w:type="spellStart"/>
       <w:r>
         <w:rPr>
           <w:rFonts w:ascii="Fira Code" w:hAnsi="Fira Code"/>
-          <w:color w:val="A9B7C6"/>
-          <w:shd w:val="clear" w:color="auto" w:fill="232525"/>
-          <w:lang w:val="en-US"/>
+          <w:color w:val="CC7832"/>
+          <w:shd w:val="clear" w:color="auto" w:fill="232525"/>
+        </w:rPr>
+        <w:t>class</w:t>
+      </w:r>
+      <w:proofErr w:type="spellEnd"/>
+      <w:r>
+        <w:rPr>
+          <w:rFonts w:ascii="Fira Code" w:hAnsi="Fira Code"/>
+          <w:color w:val="CC7832"/>
+          <w:shd w:val="clear" w:color="auto" w:fill="232525"/>
+        </w:rPr>
+        <w:t xml:space="preserve"> </w:t>
+      </w:r>
+      <w:proofErr w:type="spellStart"/>
+      <w:r>
+        <w:rPr>
+          <w:rFonts w:ascii="Fira Code" w:hAnsi="Fira Code"/>
+          <w:color w:val="A9B7C6"/>
+          <w:shd w:val="clear" w:color="auto" w:fill="232525"/>
         </w:rPr>
         <w:t>CacheDataRepositoryRedis</w:t>
       </w:r>
@@ -8378,18 +8360,26 @@
           <w:rFonts w:ascii="Fira Code" w:hAnsi="Fira Code"/>
           <w:color w:val="A9B7C6"/>
           <w:shd w:val="clear" w:color="auto" w:fill="232525"/>
-          <w:lang w:val="en-US"/>
         </w:rPr>
         <w:t xml:space="preserve"> </w:t>
       </w:r>
+      <w:proofErr w:type="spellStart"/>
       <w:r>
         <w:rPr>
           <w:rFonts w:ascii="Fira Code" w:hAnsi="Fira Code"/>
           <w:color w:val="CC7832"/>
           <w:shd w:val="clear" w:color="auto" w:fill="232525"/>
-          <w:lang w:val="en-US"/>
-        </w:rPr>
-        <w:t xml:space="preserve">implements </w:t>
+        </w:rPr>
+        <w:t>implements</w:t>
+      </w:r>
+      <w:proofErr w:type="spellEnd"/>
+      <w:r>
+        <w:rPr>
+          <w:rFonts w:ascii="Fira Code" w:hAnsi="Fira Code"/>
+          <w:color w:val="CC7832"/>
+          <w:shd w:val="clear" w:color="auto" w:fill="232525"/>
+        </w:rPr>
+        <w:t xml:space="preserve"> </w:t>
       </w:r>
       <w:proofErr w:type="spellStart"/>
       <w:r>
@@ -8397,7 +8387,6 @@
           <w:rFonts w:ascii="Fira Code" w:hAnsi="Fira Code"/>
           <w:color w:val="A9B7C6"/>
           <w:shd w:val="clear" w:color="auto" w:fill="232525"/>
-          <w:lang w:val="en-US"/>
         </w:rPr>
         <w:t>CacheDataRepository</w:t>
       </w:r>
@@ -8411,7 +8400,6 @@
           <w:rFonts w:ascii="Fira Code" w:hAnsi="Fira Code"/>
           <w:color w:val="CC7832"/>
           <w:shd w:val="clear" w:color="auto" w:fill="232525"/>
-          <w:lang w:val="en-US"/>
         </w:rPr>
       </w:pPr>
     </w:p>
@@ -8423,6 +8411,7 @@
           <w:rFonts w:ascii="Arial" w:hAnsi="Arial" w:cs="Arial"/>
           <w:sz w:val="24"/>
           <w:szCs w:val="24"/>
+          <w:lang w:val="en-US"/>
         </w:rPr>
       </w:pPr>
       <w:r>
@@ -10408,14 +10397,12 @@
         <w:rPr>
           <w:rFonts w:ascii="Fira Code" w:hAnsi="Fira Code"/>
           <w:color w:val="A9B7C6"/>
-          <w:lang w:val="en-US"/>
-        </w:rPr>
-      </w:pPr>
-      <w:r>
-        <w:rPr>
-          <w:rFonts w:ascii="Fira Code" w:hAnsi="Fira Code"/>
-          <w:color w:val="A9B7C6"/>
-          <w:lang w:val="en-US"/>
+        </w:rPr>
+      </w:pPr>
+      <w:r>
+        <w:rPr>
+          <w:rFonts w:ascii="Fira Code" w:hAnsi="Fira Code"/>
+          <w:color w:val="A9B7C6"/>
         </w:rPr>
         <w:t>…</w:t>
       </w:r>
@@ -10427,14 +10414,12 @@
         <w:rPr>
           <w:rFonts w:ascii="Fira Code" w:hAnsi="Fira Code"/>
           <w:color w:val="A9B7C6"/>
-          <w:lang w:val="en-US"/>
         </w:rPr>
       </w:pPr>
       <w:r>
         <w:rPr>
           <w:rFonts w:ascii="Fira Code" w:hAnsi="Fira Code"/>
           <w:color w:val="CC7832"/>
-          <w:lang w:val="en-US"/>
         </w:rPr>
         <w:lastRenderedPageBreak/>
         <w:t xml:space="preserve"> </w:t>
@@ -10444,7 +10429,6 @@
         <w:rPr>
           <w:rFonts w:ascii="Fira Code" w:hAnsi="Fira Code"/>
           <w:color w:val="CC7832"/>
-          <w:lang w:val="en-US"/>
         </w:rPr>
         <w:t>nginx</w:t>
       </w:r>
@@ -10453,7 +10437,6 @@
         <w:rPr>
           <w:rFonts w:ascii="Fira Code" w:hAnsi="Fira Code"/>
           <w:color w:val="A9B7C6"/>
-          <w:lang w:val="en-US"/>
         </w:rPr>
         <w:t>:</w:t>
       </w:r>
@@ -10465,14 +10448,12 @@
         <w:rPr>
           <w:rFonts w:ascii="Fira Code" w:hAnsi="Fira Code"/>
           <w:color w:val="A9B7C6"/>
-          <w:lang w:val="en-US"/>
-        </w:rPr>
-      </w:pPr>
-      <w:r>
-        <w:rPr>
-          <w:rFonts w:ascii="Fira Code" w:hAnsi="Fira Code"/>
-          <w:color w:val="A9B7C6"/>
-          <w:lang w:val="en-US"/>
+        </w:rPr>
+      </w:pPr>
+      <w:r>
+        <w:rPr>
+          <w:rFonts w:ascii="Fira Code" w:hAnsi="Fira Code"/>
+          <w:color w:val="A9B7C6"/>
         </w:rPr>
         <w:t>…</w:t>
       </w:r>
@@ -10490,7 +10471,6 @@
         <w:rPr>
           <w:rFonts w:ascii="Fira Code" w:hAnsi="Fira Code"/>
           <w:color w:val="CC7832"/>
-          <w:lang w:val="en-US"/>
         </w:rPr>
         <w:t xml:space="preserve"> </w:t>
       </w:r>
@@ -13556,16 +13536,38 @@
         </w:rPr>
         <w:t xml:space="preserve">backend1 o </w:t>
       </w:r>
-      <w:proofErr w:type="spellStart"/>
-      <w:r>
-        <w:rPr>
-          <w:rFonts w:ascii="Arial" w:hAnsi="Arial" w:cs="Arial"/>
-          <w:sz w:val="24"/>
-          <w:szCs w:val="24"/>
-        </w:rPr>
-        <w:t>middellware</w:t>
-      </w:r>
-      <w:proofErr w:type="spellEnd"/>
+      <w:r>
+        <w:rPr>
+          <w:rFonts w:ascii="Arial" w:hAnsi="Arial" w:cs="Arial"/>
+          <w:sz w:val="24"/>
+          <w:szCs w:val="24"/>
+        </w:rPr>
+        <w:t>M</w:t>
+      </w:r>
+      <w:r>
+        <w:rPr>
+          <w:rFonts w:ascii="Arial" w:hAnsi="Arial" w:cs="Arial"/>
+          <w:sz w:val="24"/>
+          <w:szCs w:val="24"/>
+        </w:rPr>
+        <w:t>idd</w:t>
+      </w:r>
+      <w:r>
+        <w:rPr>
+          <w:rFonts w:ascii="Arial" w:hAnsi="Arial" w:cs="Arial"/>
+          <w:sz w:val="24"/>
+          <w:szCs w:val="24"/>
+        </w:rPr>
+        <w:t>le</w:t>
+      </w:r>
+      <w:r>
+        <w:rPr>
+          <w:rFonts w:ascii="Arial" w:hAnsi="Arial" w:cs="Arial"/>
+          <w:sz w:val="24"/>
+          <w:szCs w:val="24"/>
+        </w:rPr>
+        <w:t>ware</w:t>
+      </w:r>
     </w:p>
     <w:p>
       <w:pPr>
@@ -13588,21 +13590,45 @@
         </w:rPr>
         <w:t xml:space="preserve">En el año 2000, Roy Fielding propuso la transferencia de estado representacional (REST) como enfoque de arquitectura para el diseño de servicios web. REST es independiente de cualquier protocolo subyacente y no está necesariamente unido a HTTP. Sin embargo, en las implementaciones más comunes de REST se usa HTTP como protocolo de aplicación, y la API </w:t>
       </w:r>
-      <w:proofErr w:type="spellStart"/>
-      <w:r>
-        <w:rPr>
-          <w:rFonts w:ascii="Arial" w:hAnsi="Arial" w:cs="Arial"/>
-          <w:sz w:val="24"/>
-          <w:szCs w:val="24"/>
-        </w:rPr>
-        <w:t>middellware</w:t>
-      </w:r>
-      <w:proofErr w:type="spellEnd"/>
-      <w:r>
-        <w:rPr>
-          <w:rFonts w:ascii="Arial" w:hAnsi="Arial" w:cs="Arial"/>
-          <w:sz w:val="24"/>
-          <w:szCs w:val="24"/>
+      <w:r>
+        <w:rPr>
+          <w:rFonts w:ascii="Arial" w:hAnsi="Arial" w:cs="Arial"/>
+          <w:sz w:val="24"/>
+          <w:szCs w:val="24"/>
+        </w:rPr>
+        <w:t>M</w:t>
+      </w:r>
+      <w:r>
+        <w:rPr>
+          <w:rFonts w:ascii="Arial" w:hAnsi="Arial" w:cs="Arial"/>
+          <w:sz w:val="24"/>
+          <w:szCs w:val="24"/>
+        </w:rPr>
+        <w:t>idd</w:t>
+      </w:r>
+      <w:r>
+        <w:rPr>
+          <w:rFonts w:ascii="Arial" w:hAnsi="Arial" w:cs="Arial"/>
+          <w:sz w:val="24"/>
+          <w:szCs w:val="24"/>
+        </w:rPr>
+        <w:t>le</w:t>
+      </w:r>
+      <w:r>
+        <w:rPr>
+          <w:rFonts w:ascii="Arial" w:hAnsi="Arial" w:cs="Arial"/>
+          <w:sz w:val="24"/>
+          <w:szCs w:val="24"/>
+        </w:rPr>
+        <w:t>ware</w:t>
+      </w:r>
+      <w:r>
+        <w:rPr>
+          <w:rFonts w:ascii="Arial" w:hAnsi="Arial" w:cs="Arial"/>
+          <w:color w:val="000000"/>
+          <w:sz w:val="24"/>
+          <w:szCs w:val="24"/>
+          <w:shd w:val="clear" w:color="auto" w:fill="FFFFFF"/>
         </w:rPr>
         <w:t xml:space="preserve"> </w:t>
       </w:r>
@@ -13919,21 +13945,45 @@
         </w:rPr>
         <w:t xml:space="preserve">API </w:t>
       </w:r>
-      <w:proofErr w:type="spellStart"/>
-      <w:r>
-        <w:rPr>
-          <w:rFonts w:ascii="Arial" w:hAnsi="Arial" w:cs="Arial"/>
-          <w:sz w:val="24"/>
-          <w:szCs w:val="24"/>
-        </w:rPr>
-        <w:t>middellware</w:t>
-      </w:r>
-      <w:proofErr w:type="spellEnd"/>
-      <w:r>
-        <w:rPr>
-          <w:rFonts w:ascii="Arial" w:hAnsi="Arial" w:cs="Arial"/>
-          <w:sz w:val="24"/>
-          <w:szCs w:val="24"/>
+      <w:r>
+        <w:rPr>
+          <w:rFonts w:ascii="Arial" w:hAnsi="Arial" w:cs="Arial"/>
+          <w:sz w:val="24"/>
+          <w:szCs w:val="24"/>
+        </w:rPr>
+        <w:t>M</w:t>
+      </w:r>
+      <w:r>
+        <w:rPr>
+          <w:rFonts w:ascii="Arial" w:hAnsi="Arial" w:cs="Arial"/>
+          <w:sz w:val="24"/>
+          <w:szCs w:val="24"/>
+        </w:rPr>
+        <w:t>idd</w:t>
+      </w:r>
+      <w:r>
+        <w:rPr>
+          <w:rFonts w:ascii="Arial" w:hAnsi="Arial" w:cs="Arial"/>
+          <w:sz w:val="24"/>
+          <w:szCs w:val="24"/>
+        </w:rPr>
+        <w:t>le</w:t>
+      </w:r>
+      <w:r>
+        <w:rPr>
+          <w:rFonts w:ascii="Arial" w:hAnsi="Arial" w:cs="Arial"/>
+          <w:sz w:val="24"/>
+          <w:szCs w:val="24"/>
+        </w:rPr>
+        <w:t>ware</w:t>
+      </w:r>
+      <w:r>
+        <w:rPr>
+          <w:rFonts w:ascii="Arial" w:hAnsi="Arial" w:cs="Arial"/>
+          <w:color w:val="000000"/>
+          <w:sz w:val="24"/>
+          <w:szCs w:val="24"/>
+          <w:shd w:val="clear" w:color="auto" w:fill="FFFFFF"/>
         </w:rPr>
         <w:t xml:space="preserve"> </w:t>
       </w:r>
@@ -14390,33 +14440,59 @@
         <w:rPr>
           <w:rFonts w:ascii="Fira Code" w:hAnsi="Fira Code"/>
           <w:color w:val="A9B7C6"/>
-          <w:lang w:val="en-US"/>
-        </w:rPr>
-      </w:pPr>
+        </w:rPr>
+      </w:pPr>
+      <w:proofErr w:type="spellStart"/>
       <w:r>
         <w:rPr>
           <w:rFonts w:ascii="Fira Code" w:hAnsi="Fira Code"/>
           <w:color w:val="CC7832"/>
           <w:shd w:val="clear" w:color="auto" w:fill="232525"/>
-          <w:lang w:val="en-US"/>
-        </w:rPr>
-        <w:t xml:space="preserve">public function </w:t>
-      </w:r>
+        </w:rPr>
+        <w:t>public</w:t>
+      </w:r>
+      <w:proofErr w:type="spellEnd"/>
+      <w:r>
+        <w:rPr>
+          <w:rFonts w:ascii="Fira Code" w:hAnsi="Fira Code"/>
+          <w:color w:val="CC7832"/>
+          <w:shd w:val="clear" w:color="auto" w:fill="232525"/>
+        </w:rPr>
+        <w:t xml:space="preserve"> </w:t>
+      </w:r>
+      <w:proofErr w:type="spellStart"/>
+      <w:r>
+        <w:rPr>
+          <w:rFonts w:ascii="Fira Code" w:hAnsi="Fira Code"/>
+          <w:color w:val="CC7832"/>
+          <w:shd w:val="clear" w:color="auto" w:fill="232525"/>
+        </w:rPr>
+        <w:t>function</w:t>
+      </w:r>
+      <w:proofErr w:type="spellEnd"/>
+      <w:r>
+        <w:rPr>
+          <w:rFonts w:ascii="Fira Code" w:hAnsi="Fira Code"/>
+          <w:color w:val="CC7832"/>
+          <w:shd w:val="clear" w:color="auto" w:fill="232525"/>
+        </w:rPr>
+        <w:t xml:space="preserve"> </w:t>
+      </w:r>
+      <w:proofErr w:type="spellStart"/>
       <w:r>
         <w:rPr>
           <w:rFonts w:ascii="Fira Code" w:hAnsi="Fira Code"/>
           <w:color w:val="FFC66D"/>
           <w:shd w:val="clear" w:color="auto" w:fill="232525"/>
-          <w:lang w:val="en-US"/>
         </w:rPr>
         <w:t>index</w:t>
       </w:r>
-      <w:r>
-        <w:rPr>
-          <w:rFonts w:ascii="Fira Code" w:hAnsi="Fira Code"/>
-          <w:color w:val="A9B7C6"/>
-          <w:shd w:val="clear" w:color="auto" w:fill="232525"/>
-          <w:lang w:val="en-US"/>
+      <w:proofErr w:type="spellEnd"/>
+      <w:r>
+        <w:rPr>
+          <w:rFonts w:ascii="Fira Code" w:hAnsi="Fira Code"/>
+          <w:color w:val="A9B7C6"/>
+          <w:shd w:val="clear" w:color="auto" w:fill="232525"/>
         </w:rPr>
         <w:t>(</w:t>
       </w:r>
@@ -14425,7 +14501,6 @@
           <w:rFonts w:ascii="Fira Code" w:hAnsi="Fira Code"/>
           <w:color w:val="9876AA"/>
           <w:shd w:val="clear" w:color="auto" w:fill="232525"/>
-          <w:lang w:val="en-US"/>
         </w:rPr>
         <w:t>$</w:t>
       </w:r>
@@ -14435,7 +14510,6 @@
           <w:rFonts w:ascii="Fira Code" w:hAnsi="Fira Code"/>
           <w:color w:val="9876AA"/>
           <w:shd w:val="clear" w:color="auto" w:fill="232525"/>
-          <w:lang w:val="en-US"/>
         </w:rPr>
         <w:t>uuidStation</w:t>
       </w:r>
@@ -14445,7 +14519,6 @@
           <w:rFonts w:ascii="Fira Code" w:hAnsi="Fira Code"/>
           <w:color w:val="A9B7C6"/>
           <w:shd w:val="clear" w:color="auto" w:fill="232525"/>
-          <w:lang w:val="en-US"/>
         </w:rPr>
         <w:t>): JsonResponse</w:t>
       </w:r>
@@ -14458,7 +14531,6 @@
         <w:rPr>
           <w:rFonts w:ascii="Fira Code" w:hAnsi="Fira Code"/>
           <w:color w:val="FFFFFF" w:themeColor="background1"/>
-          <w:lang w:val="en-US"/>
         </w:rPr>
       </w:pPr>
     </w:p>
@@ -15424,6 +15496,16 @@
           <w:szCs w:val="24"/>
           <w:shd w:val="clear" w:color="auto" w:fill="FFFFFF"/>
         </w:rPr>
+        <w:t xml:space="preserve">(casos de uso) </w:t>
+      </w:r>
+      <w:r>
+        <w:rPr>
+          <w:rFonts w:ascii="Arial" w:hAnsi="Arial" w:cs="Arial"/>
+          <w:color w:val="000000"/>
+          <w:sz w:val="24"/>
+          <w:szCs w:val="24"/>
+          <w:shd w:val="clear" w:color="auto" w:fill="FFFFFF"/>
+        </w:rPr>
         <w:t xml:space="preserve">se relacionan en el </w:t>
       </w:r>
       <w:r>
@@ -15508,7 +15590,37 @@
           <w:szCs w:val="24"/>
           <w:shd w:val="clear" w:color="auto" w:fill="FFFFFF"/>
         </w:rPr>
-        <w:t xml:space="preserve"> que se podrá utilizar como información técnica para desarrolladores de clientes para la API</w:t>
+        <w:t xml:space="preserve"> que se podrá </w:t>
+      </w:r>
+      <w:r>
+        <w:rPr>
+          <w:rFonts w:ascii="Arial" w:hAnsi="Arial" w:cs="Arial"/>
+          <w:color w:val="000000"/>
+          <w:sz w:val="24"/>
+          <w:szCs w:val="24"/>
+          <w:shd w:val="clear" w:color="auto" w:fill="FFFFFF"/>
+        </w:rPr>
+        <w:t>u</w:t>
+      </w:r>
+      <w:r>
+        <w:rPr>
+          <w:rFonts w:ascii="Arial" w:hAnsi="Arial" w:cs="Arial"/>
+          <w:color w:val="000000"/>
+          <w:sz w:val="24"/>
+          <w:szCs w:val="24"/>
+          <w:shd w:val="clear" w:color="auto" w:fill="FFFFFF"/>
+        </w:rPr>
+        <w:t>til</w:t>
+      </w:r>
+      <w:r>
+        <w:rPr>
+          <w:rFonts w:ascii="Arial" w:hAnsi="Arial" w:cs="Arial"/>
+          <w:color w:val="000000"/>
+          <w:sz w:val="24"/>
+          <w:szCs w:val="24"/>
+          <w:shd w:val="clear" w:color="auto" w:fill="FFFFFF"/>
+        </w:rPr>
+        <w:t>izar como información técnica para desarrolladores de clientes para la API</w:t>
       </w:r>
       <w:r>
         <w:rPr>
@@ -18601,6 +18713,7 @@
           <w:sz w:val="24"/>
           <w:szCs w:val="24"/>
           <w:shd w:val="clear" w:color="auto" w:fill="FFFFFF"/>
+          <w:lang w:val="en-US"/>
         </w:rPr>
       </w:pPr>
       <w:r>
@@ -18627,6 +18740,7 @@
           <w:sz w:val="24"/>
           <w:szCs w:val="24"/>
           <w:shd w:val="clear" w:color="auto" w:fill="FFFFFF"/>
+          <w:lang w:val="en-US"/>
         </w:rPr>
         <w:t>{</w:t>
       </w:r>
@@ -18649,6 +18763,7 @@
           <w:sz w:val="24"/>
           <w:szCs w:val="24"/>
           <w:shd w:val="clear" w:color="auto" w:fill="FFFFFF"/>
+          <w:lang w:val="en-US"/>
         </w:rPr>
         <w:t xml:space="preserve">            </w:t>
       </w:r>
@@ -20338,6 +20453,7 @@
           <w:sz w:val="24"/>
           <w:szCs w:val="24"/>
           <w:shd w:val="clear" w:color="auto" w:fill="FFFFFF"/>
+          <w:lang w:val="en-US"/>
         </w:rPr>
       </w:pPr>
       <w:r>
@@ -20356,28 +20472,9 @@
           <w:sz w:val="24"/>
           <w:szCs w:val="24"/>
           <w:shd w:val="clear" w:color="auto" w:fill="FFFFFF"/>
-        </w:rPr>
-        <w:t>"</w:t>
-      </w:r>
-      <w:proofErr w:type="spellStart"/>
-      <w:r>
-        <w:rPr>
-          <w:rFonts w:ascii="Arial" w:hAnsi="Arial" w:cs="Arial"/>
-          <w:sz w:val="24"/>
-          <w:szCs w:val="24"/>
-          <w:shd w:val="clear" w:color="auto" w:fill="FFFFFF"/>
-        </w:rPr>
-        <w:t>action</w:t>
-      </w:r>
-      <w:proofErr w:type="spellEnd"/>
-      <w:r>
-        <w:rPr>
-          <w:rFonts w:ascii="Arial" w:hAnsi="Arial" w:cs="Arial"/>
-          <w:sz w:val="24"/>
-          <w:szCs w:val="24"/>
-          <w:shd w:val="clear" w:color="auto" w:fill="FFFFFF"/>
-        </w:rPr>
-        <w:t>": "PUT ",</w:t>
+          <w:lang w:val="en-US"/>
+        </w:rPr>
+        <w:t>"action": "PUT ",</w:t>
       </w:r>
     </w:p>
     <w:p>
@@ -20398,6 +20495,7 @@
           <w:sz w:val="24"/>
           <w:szCs w:val="24"/>
           <w:shd w:val="clear" w:color="auto" w:fill="FFFFFF"/>
+          <w:lang w:val="en-US"/>
         </w:rPr>
         <w:t xml:space="preserve">            </w:t>
       </w:r>
@@ -20855,6 +20953,7 @@
           <w:sz w:val="24"/>
           <w:szCs w:val="24"/>
           <w:shd w:val="clear" w:color="auto" w:fill="FFFFFF"/>
+          <w:lang w:val="en-US"/>
         </w:rPr>
       </w:pPr>
       <w:r>
@@ -20873,6 +20972,7 @@
           <w:sz w:val="24"/>
           <w:szCs w:val="24"/>
           <w:shd w:val="clear" w:color="auto" w:fill="FFFFFF"/>
+          <w:lang w:val="en-US"/>
         </w:rPr>
         <w:t>]</w:t>
       </w:r>
@@ -20886,14 +20986,16 @@
           <w:sz w:val="24"/>
           <w:szCs w:val="24"/>
           <w:shd w:val="clear" w:color="auto" w:fill="FFFFFF"/>
-        </w:rPr>
-      </w:pPr>
-      <w:r>
-        <w:rPr>
-          <w:rFonts w:ascii="Arial" w:hAnsi="Arial" w:cs="Arial"/>
-          <w:sz w:val="24"/>
-          <w:szCs w:val="24"/>
-          <w:shd w:val="clear" w:color="auto" w:fill="FFFFFF"/>
+          <w:lang w:val="en-US"/>
+        </w:rPr>
+      </w:pPr>
+      <w:r>
+        <w:rPr>
+          <w:rFonts w:ascii="Arial" w:hAnsi="Arial" w:cs="Arial"/>
+          <w:sz w:val="24"/>
+          <w:szCs w:val="24"/>
+          <w:shd w:val="clear" w:color="auto" w:fill="FFFFFF"/>
+          <w:lang w:val="en-US"/>
         </w:rPr>
         <w:t xml:space="preserve">        },</w:t>
       </w:r>
@@ -20916,6 +21018,7 @@
           <w:sz w:val="24"/>
           <w:szCs w:val="24"/>
           <w:shd w:val="clear" w:color="auto" w:fill="FFFFFF"/>
+          <w:lang w:val="en-US"/>
         </w:rPr>
         <w:t xml:space="preserve">        </w:t>
       </w:r>
@@ -21729,6 +21832,26 @@
           <w:shd w:val="clear" w:color="auto" w:fill="FFFFFF"/>
         </w:rPr>
         <w:t>Arquitectura de software</w:t>
+      </w:r>
+      <w:r>
+        <w:rPr>
+          <w:rFonts w:ascii="Arial" w:hAnsi="Arial" w:cs="Arial"/>
+          <w:b/>
+          <w:color w:val="000000"/>
+          <w:sz w:val="24"/>
+          <w:szCs w:val="24"/>
+          <w:shd w:val="clear" w:color="auto" w:fill="FFFFFF"/>
+        </w:rPr>
+        <w:t xml:space="preserve"> </w:t>
+      </w:r>
+      <w:r>
+        <w:rPr>
+          <w:rFonts w:ascii="Arial" w:hAnsi="Arial" w:cs="Arial"/>
+          <w:b/>
+          <w:sz w:val="24"/>
+          <w:szCs w:val="24"/>
+        </w:rPr>
+        <w:t>de la API Middleware</w:t>
       </w:r>
     </w:p>
     <w:p>
@@ -26861,6 +26984,7 @@
           <w:sz w:val="24"/>
           <w:szCs w:val="24"/>
           <w:shd w:val="clear" w:color="auto" w:fill="FFFFFF"/>
+          <w:lang w:val="en-US"/>
         </w:rPr>
       </w:pPr>
       <w:r>
@@ -26911,7 +27035,7 @@
           <w:szCs w:val="24"/>
           <w:shd w:val="clear" w:color="auto" w:fill="FFFFFF"/>
         </w:rPr>
-        <w:t xml:space="preserve"> Notar como implementa la interfaz </w:t>
+        <w:t xml:space="preserve"> </w:t>
       </w:r>
       <w:proofErr w:type="spellStart"/>
       <w:r>
@@ -26921,6 +27045,103 @@
           <w:sz w:val="24"/>
           <w:szCs w:val="24"/>
           <w:shd w:val="clear" w:color="auto" w:fill="FFFFFF"/>
+          <w:lang w:val="en-US"/>
+        </w:rPr>
+        <w:t>Notar</w:t>
+      </w:r>
+      <w:proofErr w:type="spellEnd"/>
+      <w:r>
+        <w:rPr>
+          <w:rFonts w:ascii="Arial" w:hAnsi="Arial" w:cs="Arial"/>
+          <w:color w:val="000000"/>
+          <w:sz w:val="24"/>
+          <w:szCs w:val="24"/>
+          <w:shd w:val="clear" w:color="auto" w:fill="FFFFFF"/>
+          <w:lang w:val="en-US"/>
+        </w:rPr>
+        <w:t xml:space="preserve"> </w:t>
+      </w:r>
+      <w:proofErr w:type="spellStart"/>
+      <w:r>
+        <w:rPr>
+          <w:rFonts w:ascii="Arial" w:hAnsi="Arial" w:cs="Arial"/>
+          <w:color w:val="000000"/>
+          <w:sz w:val="24"/>
+          <w:szCs w:val="24"/>
+          <w:shd w:val="clear" w:color="auto" w:fill="FFFFFF"/>
+          <w:lang w:val="en-US"/>
+        </w:rPr>
+        <w:t>como</w:t>
+      </w:r>
+      <w:proofErr w:type="spellEnd"/>
+      <w:r>
+        <w:rPr>
+          <w:rFonts w:ascii="Arial" w:hAnsi="Arial" w:cs="Arial"/>
+          <w:color w:val="000000"/>
+          <w:sz w:val="24"/>
+          <w:szCs w:val="24"/>
+          <w:shd w:val="clear" w:color="auto" w:fill="FFFFFF"/>
+          <w:lang w:val="en-US"/>
+        </w:rPr>
+        <w:t xml:space="preserve"> </w:t>
+      </w:r>
+      <w:proofErr w:type="spellStart"/>
+      <w:r>
+        <w:rPr>
+          <w:rFonts w:ascii="Arial" w:hAnsi="Arial" w:cs="Arial"/>
+          <w:color w:val="000000"/>
+          <w:sz w:val="24"/>
+          <w:szCs w:val="24"/>
+          <w:shd w:val="clear" w:color="auto" w:fill="FFFFFF"/>
+          <w:lang w:val="en-US"/>
+        </w:rPr>
+        <w:t>implementa</w:t>
+      </w:r>
+      <w:proofErr w:type="spellEnd"/>
+      <w:r>
+        <w:rPr>
+          <w:rFonts w:ascii="Arial" w:hAnsi="Arial" w:cs="Arial"/>
+          <w:color w:val="000000"/>
+          <w:sz w:val="24"/>
+          <w:szCs w:val="24"/>
+          <w:shd w:val="clear" w:color="auto" w:fill="FFFFFF"/>
+          <w:lang w:val="en-US"/>
+        </w:rPr>
+        <w:t xml:space="preserve"> la </w:t>
+      </w:r>
+      <w:proofErr w:type="spellStart"/>
+      <w:r>
+        <w:rPr>
+          <w:rFonts w:ascii="Arial" w:hAnsi="Arial" w:cs="Arial"/>
+          <w:color w:val="000000"/>
+          <w:sz w:val="24"/>
+          <w:szCs w:val="24"/>
+          <w:shd w:val="clear" w:color="auto" w:fill="FFFFFF"/>
+          <w:lang w:val="en-US"/>
+        </w:rPr>
+        <w:t>interfaz</w:t>
+      </w:r>
+      <w:proofErr w:type="spellEnd"/>
+      <w:r>
+        <w:rPr>
+          <w:rFonts w:ascii="Arial" w:hAnsi="Arial" w:cs="Arial"/>
+          <w:color w:val="000000"/>
+          <w:sz w:val="24"/>
+          <w:szCs w:val="24"/>
+          <w:shd w:val="clear" w:color="auto" w:fill="FFFFFF"/>
+          <w:lang w:val="en-US"/>
+        </w:rPr>
+        <w:t xml:space="preserve"> </w:t>
+      </w:r>
+      <w:proofErr w:type="spellStart"/>
+      <w:r>
+        <w:rPr>
+          <w:rFonts w:ascii="Arial" w:hAnsi="Arial" w:cs="Arial"/>
+          <w:color w:val="000000"/>
+          <w:sz w:val="24"/>
+          <w:szCs w:val="24"/>
+          <w:shd w:val="clear" w:color="auto" w:fill="FFFFFF"/>
+          <w:lang w:val="en-US"/>
         </w:rPr>
         <w:t>StationRepository</w:t>
       </w:r>
@@ -26934,6 +27155,7 @@
           <w:rFonts w:ascii="Fira Code" w:hAnsi="Fira Code"/>
           <w:color w:val="A9B7C6"/>
           <w:shd w:val="clear" w:color="auto" w:fill="232525"/>
+          <w:lang w:val="en-US"/>
         </w:rPr>
       </w:pPr>
       <w:r>
@@ -26941,26 +27163,38 @@
           <w:rFonts w:ascii="Fira Code" w:hAnsi="Fira Code"/>
           <w:color w:val="CC7832"/>
           <w:shd w:val="clear" w:color="auto" w:fill="232525"/>
-        </w:rPr>
-        <w:t xml:space="preserve">final </w:t>
+          <w:lang w:val="en-US"/>
+        </w:rPr>
+        <w:t xml:space="preserve">final class </w:t>
       </w:r>
       <w:proofErr w:type="spellStart"/>
       <w:r>
         <w:rPr>
           <w:rFonts w:ascii="Fira Code" w:hAnsi="Fira Code"/>
+          <w:color w:val="A9B7C6"/>
+          <w:shd w:val="clear" w:color="auto" w:fill="232525"/>
+          <w:lang w:val="en-US"/>
+        </w:rPr>
+        <w:t>StationRepositoryMysql</w:t>
+      </w:r>
+      <w:proofErr w:type="spellEnd"/>
+      <w:r>
+        <w:rPr>
+          <w:rFonts w:ascii="Fira Code" w:hAnsi="Fira Code"/>
+          <w:color w:val="A9B7C6"/>
+          <w:shd w:val="clear" w:color="auto" w:fill="232525"/>
+          <w:lang w:val="en-US"/>
+        </w:rPr>
+        <w:t xml:space="preserve"> </w:t>
+      </w:r>
+      <w:r>
+        <w:rPr>
+          <w:rFonts w:ascii="Fira Code" w:hAnsi="Fira Code"/>
           <w:color w:val="CC7832"/>
           <w:shd w:val="clear" w:color="auto" w:fill="232525"/>
-        </w:rPr>
-        <w:t>class</w:t>
-      </w:r>
-      <w:proofErr w:type="spellEnd"/>
-      <w:r>
-        <w:rPr>
-          <w:rFonts w:ascii="Fira Code" w:hAnsi="Fira Code"/>
-          <w:color w:val="CC7832"/>
-          <w:shd w:val="clear" w:color="auto" w:fill="232525"/>
-        </w:rPr>
-        <w:t xml:space="preserve"> </w:t>
+          <w:lang w:val="en-US"/>
+        </w:rPr>
+        <w:t xml:space="preserve">implements </w:t>
       </w:r>
       <w:proofErr w:type="spellStart"/>
       <w:r>
@@ -26968,42 +27202,7 @@
           <w:rFonts w:ascii="Fira Code" w:hAnsi="Fira Code"/>
           <w:color w:val="A9B7C6"/>
           <w:shd w:val="clear" w:color="auto" w:fill="232525"/>
-        </w:rPr>
-        <w:t>StationRepositoryMysql</w:t>
-      </w:r>
-      <w:proofErr w:type="spellEnd"/>
-      <w:r>
-        <w:rPr>
-          <w:rFonts w:ascii="Fira Code" w:hAnsi="Fira Code"/>
-          <w:color w:val="A9B7C6"/>
-          <w:shd w:val="clear" w:color="auto" w:fill="232525"/>
-        </w:rPr>
-        <w:t xml:space="preserve"> </w:t>
-      </w:r>
-      <w:proofErr w:type="spellStart"/>
-      <w:r>
-        <w:rPr>
-          <w:rFonts w:ascii="Fira Code" w:hAnsi="Fira Code"/>
-          <w:color w:val="CC7832"/>
-          <w:shd w:val="clear" w:color="auto" w:fill="232525"/>
-        </w:rPr>
-        <w:t>implements</w:t>
-      </w:r>
-      <w:proofErr w:type="spellEnd"/>
-      <w:r>
-        <w:rPr>
-          <w:rFonts w:ascii="Fira Code" w:hAnsi="Fira Code"/>
-          <w:color w:val="CC7832"/>
-          <w:shd w:val="clear" w:color="auto" w:fill="232525"/>
-        </w:rPr>
-        <w:t xml:space="preserve"> </w:t>
-      </w:r>
-      <w:proofErr w:type="spellStart"/>
-      <w:r>
-        <w:rPr>
-          <w:rFonts w:ascii="Fira Code" w:hAnsi="Fira Code"/>
-          <w:color w:val="A9B7C6"/>
-          <w:shd w:val="clear" w:color="auto" w:fill="232525"/>
+          <w:lang w:val="en-US"/>
         </w:rPr>
         <w:t>StationRepository</w:t>
       </w:r>
@@ -27035,7 +27234,6 @@
         <w:rPr>
           <w:rFonts w:ascii="Fira Code" w:hAnsi="Fira Code"/>
           <w:color w:val="A9B7C6"/>
-          <w:lang w:val="en-US"/>
         </w:rPr>
       </w:pPr>
       <w:r>
@@ -27521,16 +27719,24 @@
           <w:rFonts w:ascii="Fira Code" w:hAnsi="Fira Code"/>
           <w:color w:val="9876AA"/>
           <w:shd w:val="clear" w:color="auto" w:fill="232525"/>
-          <w:lang w:val="en-US"/>
-        </w:rPr>
-        <w:t>$station</w:t>
-      </w:r>
-      <w:r>
-        <w:rPr>
-          <w:rFonts w:ascii="Fira Code" w:hAnsi="Fira Code"/>
-          <w:color w:val="A9B7C6"/>
-          <w:shd w:val="clear" w:color="auto" w:fill="232525"/>
-          <w:lang w:val="en-US"/>
+        </w:rPr>
+        <w:t>$</w:t>
+      </w:r>
+      <w:proofErr w:type="spellStart"/>
+      <w:r>
+        <w:rPr>
+          <w:rFonts w:ascii="Fira Code" w:hAnsi="Fira Code"/>
+          <w:color w:val="9876AA"/>
+          <w:shd w:val="clear" w:color="auto" w:fill="232525"/>
+        </w:rPr>
+        <w:t>station</w:t>
+      </w:r>
+      <w:proofErr w:type="spellEnd"/>
+      <w:r>
+        <w:rPr>
+          <w:rFonts w:ascii="Fira Code" w:hAnsi="Fira Code"/>
+          <w:color w:val="A9B7C6"/>
+          <w:shd w:val="clear" w:color="auto" w:fill="232525"/>
         </w:rPr>
         <w:t>-&gt;</w:t>
       </w:r>
@@ -27540,7 +27746,6 @@
           <w:rFonts w:ascii="Fira Code" w:hAnsi="Fira Code"/>
           <w:color w:val="FFC66D"/>
           <w:shd w:val="clear" w:color="auto" w:fill="232525"/>
-          <w:lang w:val="en-US"/>
         </w:rPr>
         <w:t>setHistoric</w:t>
       </w:r>
@@ -27550,7 +27755,6 @@
           <w:rFonts w:ascii="Fira Code" w:hAnsi="Fira Code"/>
           <w:color w:val="A9B7C6"/>
           <w:shd w:val="clear" w:color="auto" w:fill="232525"/>
-          <w:lang w:val="en-US"/>
         </w:rPr>
         <w:t>(</w:t>
       </w:r>
@@ -27559,16 +27763,24 @@
           <w:rFonts w:ascii="Fira Code" w:hAnsi="Fira Code"/>
           <w:color w:val="9876AA"/>
           <w:shd w:val="clear" w:color="auto" w:fill="232525"/>
-          <w:lang w:val="en-US"/>
-        </w:rPr>
-        <w:t>$this</w:t>
-      </w:r>
-      <w:r>
-        <w:rPr>
-          <w:rFonts w:ascii="Fira Code" w:hAnsi="Fira Code"/>
-          <w:color w:val="A9B7C6"/>
-          <w:shd w:val="clear" w:color="auto" w:fill="232525"/>
-          <w:lang w:val="en-US"/>
+        </w:rPr>
+        <w:t>$</w:t>
+      </w:r>
+      <w:proofErr w:type="spellStart"/>
+      <w:r>
+        <w:rPr>
+          <w:rFonts w:ascii="Fira Code" w:hAnsi="Fira Code"/>
+          <w:color w:val="9876AA"/>
+          <w:shd w:val="clear" w:color="auto" w:fill="232525"/>
+        </w:rPr>
+        <w:t>this</w:t>
+      </w:r>
+      <w:proofErr w:type="spellEnd"/>
+      <w:r>
+        <w:rPr>
+          <w:rFonts w:ascii="Fira Code" w:hAnsi="Fira Code"/>
+          <w:color w:val="A9B7C6"/>
+          <w:shd w:val="clear" w:color="auto" w:fill="232525"/>
         </w:rPr>
         <w:t>-&gt;</w:t>
       </w:r>
@@ -27578,7 +27790,6 @@
           <w:rFonts w:ascii="Fira Code" w:hAnsi="Fira Code"/>
           <w:color w:val="FFC66D"/>
           <w:shd w:val="clear" w:color="auto" w:fill="232525"/>
-          <w:lang w:val="en-US"/>
         </w:rPr>
         <w:t>findHistorycStation</w:t>
       </w:r>
@@ -27588,7 +27799,6 @@
           <w:rFonts w:ascii="Fira Code" w:hAnsi="Fira Code"/>
           <w:color w:val="A9B7C6"/>
           <w:shd w:val="clear" w:color="auto" w:fill="232525"/>
-          <w:lang w:val="en-US"/>
         </w:rPr>
         <w:t>(</w:t>
       </w:r>
@@ -27597,7 +27807,6 @@
           <w:rFonts w:ascii="Fira Code" w:hAnsi="Fira Code"/>
           <w:color w:val="9876AA"/>
           <w:shd w:val="clear" w:color="auto" w:fill="232525"/>
-          <w:lang w:val="en-US"/>
         </w:rPr>
         <w:t>$</w:t>
       </w:r>
@@ -27607,7 +27816,6 @@
           <w:rFonts w:ascii="Fira Code" w:hAnsi="Fira Code"/>
           <w:color w:val="9876AA"/>
           <w:shd w:val="clear" w:color="auto" w:fill="232525"/>
-          <w:lang w:val="en-US"/>
         </w:rPr>
         <w:t>uuidStation</w:t>
       </w:r>
@@ -27617,7 +27825,6 @@
           <w:rFonts w:ascii="Fira Code" w:hAnsi="Fira Code"/>
           <w:color w:val="A9B7C6"/>
           <w:shd w:val="clear" w:color="auto" w:fill="232525"/>
-          <w:lang w:val="en-US"/>
         </w:rPr>
         <w:t>))</w:t>
       </w:r>
@@ -27626,7 +27833,6 @@
           <w:rFonts w:ascii="Fira Code" w:hAnsi="Fira Code"/>
           <w:color w:val="CC7832"/>
           <w:shd w:val="clear" w:color="auto" w:fill="232525"/>
-          <w:lang w:val="en-US"/>
         </w:rPr>
         <w:t>;</w:t>
       </w:r>
@@ -27635,7 +27841,6 @@
           <w:rFonts w:ascii="Fira Code" w:hAnsi="Fira Code"/>
           <w:color w:val="CC7832"/>
           <w:shd w:val="clear" w:color="auto" w:fill="232525"/>
-          <w:lang w:val="en-US"/>
         </w:rPr>
         <w:t xml:space="preserve"> …</w:t>
       </w:r>
@@ -27644,35 +27849,51 @@
           <w:rFonts w:ascii="Fira Code" w:hAnsi="Fira Code"/>
           <w:color w:val="A9B7C6"/>
           <w:shd w:val="clear" w:color="auto" w:fill="232525"/>
-          <w:lang w:val="en-US"/>
         </w:rPr>
         <w:br/>
         <w:t xml:space="preserve">        </w:t>
       </w:r>
+      <w:proofErr w:type="spellStart"/>
       <w:r>
         <w:rPr>
           <w:rFonts w:ascii="Fira Code" w:hAnsi="Fira Code"/>
           <w:color w:val="CC7832"/>
           <w:shd w:val="clear" w:color="auto" w:fill="232525"/>
-          <w:lang w:val="en-US"/>
-        </w:rPr>
-        <w:t xml:space="preserve">return </w:t>
+        </w:rPr>
+        <w:t>return</w:t>
+      </w:r>
+      <w:proofErr w:type="spellEnd"/>
+      <w:r>
+        <w:rPr>
+          <w:rFonts w:ascii="Fira Code" w:hAnsi="Fira Code"/>
+          <w:color w:val="CC7832"/>
+          <w:shd w:val="clear" w:color="auto" w:fill="232525"/>
+        </w:rPr>
+        <w:t xml:space="preserve"> </w:t>
       </w:r>
       <w:r>
         <w:rPr>
           <w:rFonts w:ascii="Fira Code" w:hAnsi="Fira Code"/>
           <w:color w:val="9876AA"/>
           <w:shd w:val="clear" w:color="auto" w:fill="232525"/>
-          <w:lang w:val="en-US"/>
-        </w:rPr>
-        <w:t>$station</w:t>
-      </w:r>
+        </w:rPr>
+        <w:t>$</w:t>
+      </w:r>
+      <w:proofErr w:type="spellStart"/>
+      <w:r>
+        <w:rPr>
+          <w:rFonts w:ascii="Fira Code" w:hAnsi="Fira Code"/>
+          <w:color w:val="9876AA"/>
+          <w:shd w:val="clear" w:color="auto" w:fill="232525"/>
+        </w:rPr>
+        <w:t>station</w:t>
+      </w:r>
+      <w:proofErr w:type="spellEnd"/>
       <w:r>
         <w:rPr>
           <w:rFonts w:ascii="Fira Code" w:hAnsi="Fira Code"/>
           <w:color w:val="CC7832"/>
           <w:shd w:val="clear" w:color="auto" w:fill="232525"/>
-          <w:lang w:val="en-US"/>
         </w:rPr>
         <w:t>;</w:t>
       </w:r>
@@ -27686,7 +27907,6 @@
           <w:sz w:val="24"/>
           <w:szCs w:val="24"/>
           <w:shd w:val="clear" w:color="auto" w:fill="FFFFFF"/>
-          <w:lang w:val="en-US"/>
         </w:rPr>
       </w:pPr>
     </w:p>
@@ -27801,11 +28021,10 @@
         <w:rPr>
           <w:noProof/>
         </w:rPr>
-        <w:lastRenderedPageBreak/>
         <w:drawing>
-          <wp:inline distT="0" distB="0" distL="0" distR="0" wp14:anchorId="62B46E4C" wp14:editId="3EF8505F">
-            <wp:extent cx="4286250" cy="6210300"/>
-            <wp:effectExtent l="0" t="0" r="0" b="0"/>
+          <wp:inline distT="0" distB="0" distL="0" distR="0" wp14:anchorId="62B46E4C" wp14:editId="1644550A">
+            <wp:extent cx="2682193" cy="3886200"/>
+            <wp:effectExtent l="0" t="0" r="4445" b="0"/>
             <wp:docPr id="31" name="Imagen 31"/>
             <wp:cNvGraphicFramePr>
               <a:graphicFrameLocks xmlns:a="http://schemas.openxmlformats.org/drawingml/2006/main" noChangeAspect="1"/>
@@ -27826,7 +28045,7 @@
                   <pic:spPr>
                     <a:xfrm>
                       <a:off x="0" y="0"/>
-                      <a:ext cx="4286250" cy="6210300"/>
+                      <a:ext cx="2695979" cy="3906174"/>
                     </a:xfrm>
                     <a:prstGeom prst="rect">
                       <a:avLst/>
@@ -27858,6 +28077,7 @@
           <w:szCs w:val="24"/>
           <w:shd w:val="clear" w:color="auto" w:fill="FFFFFF"/>
         </w:rPr>
+        <w:lastRenderedPageBreak/>
         <w:t>Siguiendo la línea de ejemplos</w:t>
       </w:r>
     </w:p>
@@ -28364,15 +28584,6 @@
           <w:lang w:val="en-US"/>
         </w:rPr>
         <w:br/>
-      </w:r>
-      <w:r>
-        <w:rPr>
-          <w:rFonts w:ascii="Fira Code" w:hAnsi="Fira Code"/>
-          <w:color w:val="CC7832"/>
-          <w:shd w:val="clear" w:color="auto" w:fill="232525"/>
-          <w:lang w:val="en-US"/>
-        </w:rPr>
-        <w:lastRenderedPageBreak/>
         <w:t xml:space="preserve">    </w:t>
       </w:r>
       <w:r>
@@ -29323,9 +29534,25 @@
         </w:rPr>
         <w:lastRenderedPageBreak/>
         <w:drawing>
-          <wp:inline distT="0" distB="0" distL="0" distR="0" wp14:anchorId="2BAC0A56" wp14:editId="410F138D">
+          <wp:anchor distT="0" distB="0" distL="114300" distR="114300" simplePos="0" relativeHeight="251659264" behindDoc="0" locked="0" layoutInCell="1" allowOverlap="1" wp14:anchorId="2BAC0A56" wp14:editId="5FCB60BC">
+            <wp:simplePos x="0" y="0"/>
+            <wp:positionH relativeFrom="column">
+              <wp:posOffset>-635</wp:posOffset>
+            </wp:positionH>
+            <wp:positionV relativeFrom="paragraph">
+              <wp:posOffset>1905</wp:posOffset>
+            </wp:positionV>
             <wp:extent cx="5400040" cy="6454775"/>
             <wp:effectExtent l="0" t="0" r="0" b="3175"/>
+            <wp:wrapThrough wrapText="bothSides">
+              <wp:wrapPolygon edited="0">
+                <wp:start x="0" y="0"/>
+                <wp:lineTo x="0" y="21547"/>
+                <wp:lineTo x="21488" y="21547"/>
+                <wp:lineTo x="21488" y="0"/>
+                <wp:lineTo x="0" y="0"/>
+              </wp:wrapPolygon>
+            </wp:wrapThrough>
             <wp:docPr id="20" name="Imagen 20"/>
             <wp:cNvGraphicFramePr>
               <a:graphicFrameLocks xmlns:a="http://schemas.openxmlformats.org/drawingml/2006/main" noChangeAspect="1"/>
@@ -29361,7 +29588,7 @@
                 </pic:pic>
               </a:graphicData>
             </a:graphic>
-          </wp:inline>
+          </wp:anchor>
         </w:drawing>
       </w:r>
     </w:p>
@@ -29390,6 +29617,56 @@
         <w:jc w:val="both"/>
         <w:rPr>
           <w:rFonts w:ascii="Arial" w:hAnsi="Arial" w:cs="Arial"/>
+          <w:sz w:val="24"/>
+          <w:szCs w:val="24"/>
+        </w:rPr>
+      </w:pPr>
+    </w:p>
+    <w:p>
+      <w:pPr>
+        <w:jc w:val="both"/>
+        <w:rPr>
+          <w:rFonts w:ascii="Arial" w:hAnsi="Arial" w:cs="Arial"/>
+          <w:sz w:val="24"/>
+          <w:szCs w:val="24"/>
+        </w:rPr>
+      </w:pPr>
+    </w:p>
+    <w:p>
+      <w:pPr>
+        <w:jc w:val="both"/>
+        <w:rPr>
+          <w:rFonts w:ascii="Arial" w:hAnsi="Arial" w:cs="Arial"/>
+          <w:sz w:val="24"/>
+          <w:szCs w:val="24"/>
+        </w:rPr>
+      </w:pPr>
+    </w:p>
+    <w:p>
+      <w:pPr>
+        <w:jc w:val="both"/>
+        <w:rPr>
+          <w:rFonts w:ascii="Arial" w:hAnsi="Arial" w:cs="Arial"/>
+          <w:sz w:val="24"/>
+          <w:szCs w:val="24"/>
+        </w:rPr>
+      </w:pPr>
+    </w:p>
+    <w:p>
+      <w:pPr>
+        <w:jc w:val="both"/>
+        <w:rPr>
+          <w:rFonts w:ascii="Arial" w:hAnsi="Arial" w:cs="Arial"/>
+          <w:sz w:val="24"/>
+          <w:szCs w:val="24"/>
+        </w:rPr>
+      </w:pPr>
+    </w:p>
+    <w:p>
+      <w:pPr>
+        <w:jc w:val="both"/>
+        <w:rPr>
+          <w:rFonts w:ascii="Arial" w:hAnsi="Arial" w:cs="Arial"/>
           <w:b/>
           <w:sz w:val="24"/>
           <w:szCs w:val="24"/>
@@ -29402,8 +29679,1731 @@
           <w:sz w:val="24"/>
           <w:szCs w:val="24"/>
         </w:rPr>
-        <w:t>Estructura de carpetas</w:t>
-      </w:r>
+        <w:lastRenderedPageBreak/>
+        <w:t xml:space="preserve">Estructura </w:t>
+      </w:r>
+      <w:r>
+        <w:rPr>
+          <w:rFonts w:ascii="Arial" w:hAnsi="Arial" w:cs="Arial"/>
+          <w:b/>
+          <w:sz w:val="24"/>
+          <w:szCs w:val="24"/>
+        </w:rPr>
+        <w:t xml:space="preserve">general </w:t>
+      </w:r>
+      <w:r>
+        <w:rPr>
+          <w:rFonts w:ascii="Arial" w:hAnsi="Arial" w:cs="Arial"/>
+          <w:b/>
+          <w:sz w:val="24"/>
+          <w:szCs w:val="24"/>
+        </w:rPr>
+        <w:t>de carpetas</w:t>
+      </w:r>
+    </w:p>
+    <w:p>
+      <w:pPr>
+        <w:jc w:val="both"/>
+        <w:rPr>
+          <w:rFonts w:ascii="Arial" w:hAnsi="Arial" w:cs="Arial"/>
+          <w:b/>
+          <w:sz w:val="24"/>
+          <w:szCs w:val="24"/>
+        </w:rPr>
+      </w:pPr>
+      <w:r>
+        <w:rPr>
+          <w:noProof/>
+        </w:rPr>
+        <w:drawing>
+          <wp:anchor distT="0" distB="0" distL="114300" distR="114300" simplePos="0" relativeHeight="251660288" behindDoc="0" locked="0" layoutInCell="1" allowOverlap="1" wp14:anchorId="45B26C62" wp14:editId="6ADEB3B1">
+            <wp:simplePos x="0" y="0"/>
+            <wp:positionH relativeFrom="column">
+              <wp:posOffset>-635</wp:posOffset>
+            </wp:positionH>
+            <wp:positionV relativeFrom="paragraph">
+              <wp:posOffset>-3175</wp:posOffset>
+            </wp:positionV>
+            <wp:extent cx="2552700" cy="1390650"/>
+            <wp:effectExtent l="0" t="0" r="0" b="0"/>
+            <wp:wrapThrough wrapText="bothSides">
+              <wp:wrapPolygon edited="0">
+                <wp:start x="0" y="0"/>
+                <wp:lineTo x="0" y="21304"/>
+                <wp:lineTo x="21439" y="21304"/>
+                <wp:lineTo x="21439" y="0"/>
+                <wp:lineTo x="0" y="0"/>
+              </wp:wrapPolygon>
+            </wp:wrapThrough>
+            <wp:docPr id="14" name="Imagen 14"/>
+            <wp:cNvGraphicFramePr>
+              <a:graphicFrameLocks xmlns:a="http://schemas.openxmlformats.org/drawingml/2006/main" noChangeAspect="1"/>
+            </wp:cNvGraphicFramePr>
+            <a:graphic xmlns:a="http://schemas.openxmlformats.org/drawingml/2006/main">
+              <a:graphicData uri="http://schemas.openxmlformats.org/drawingml/2006/picture">
+                <pic:pic xmlns:pic="http://schemas.openxmlformats.org/drawingml/2006/picture">
+                  <pic:nvPicPr>
+                    <pic:cNvPr id="1" name=""/>
+                    <pic:cNvPicPr/>
+                  </pic:nvPicPr>
+                  <pic:blipFill>
+                    <a:blip r:embed="rId26">
+                      <a:extLst>
+                        <a:ext uri="{28A0092B-C50C-407E-A947-70E740481C1C}">
+                          <a14:useLocalDpi xmlns:a14="http://schemas.microsoft.com/office/drawing/2010/main" val="0"/>
+                        </a:ext>
+                      </a:extLst>
+                    </a:blip>
+                    <a:stretch>
+                      <a:fillRect/>
+                    </a:stretch>
+                  </pic:blipFill>
+                  <pic:spPr>
+                    <a:xfrm>
+                      <a:off x="0" y="0"/>
+                      <a:ext cx="2552700" cy="1390650"/>
+                    </a:xfrm>
+                    <a:prstGeom prst="rect">
+                      <a:avLst/>
+                    </a:prstGeom>
+                  </pic:spPr>
+                </pic:pic>
+              </a:graphicData>
+            </a:graphic>
+          </wp:anchor>
+        </w:drawing>
+      </w:r>
+    </w:p>
+    <w:p>
+      <w:pPr>
+        <w:pStyle w:val="Prrafodelista"/>
+        <w:numPr>
+          <w:ilvl w:val="0"/>
+          <w:numId w:val="19"/>
+        </w:numPr>
+        <w:rPr>
+          <w:rFonts w:ascii="Arial" w:hAnsi="Arial" w:cs="Arial"/>
+          <w:b/>
+          <w:sz w:val="24"/>
+          <w:szCs w:val="24"/>
+        </w:rPr>
+      </w:pPr>
+      <w:proofErr w:type="spellStart"/>
+      <w:r>
+        <w:rPr>
+          <w:rFonts w:ascii="Arial" w:hAnsi="Arial" w:cs="Arial"/>
+          <w:b/>
+          <w:sz w:val="24"/>
+          <w:szCs w:val="24"/>
+        </w:rPr>
+        <w:t>etc</w:t>
+      </w:r>
+      <w:proofErr w:type="spellEnd"/>
+      <w:r>
+        <w:rPr>
+          <w:rFonts w:ascii="Arial" w:hAnsi="Arial" w:cs="Arial"/>
+          <w:b/>
+          <w:sz w:val="24"/>
+          <w:szCs w:val="24"/>
+        </w:rPr>
+        <w:t xml:space="preserve">: </w:t>
+      </w:r>
+      <w:r>
+        <w:rPr>
+          <w:rFonts w:ascii="Arial" w:hAnsi="Arial" w:cs="Arial"/>
+          <w:sz w:val="24"/>
+          <w:szCs w:val="24"/>
+        </w:rPr>
+        <w:t xml:space="preserve">contiene la configuración particular de los contenedores de Docker, </w:t>
+      </w:r>
+      <w:proofErr w:type="spellStart"/>
+      <w:r>
+        <w:rPr>
+          <w:rFonts w:ascii="Arial" w:hAnsi="Arial" w:cs="Arial"/>
+          <w:sz w:val="24"/>
+          <w:szCs w:val="24"/>
+        </w:rPr>
+        <w:t>meteosalle.sql</w:t>
+      </w:r>
+      <w:proofErr w:type="spellEnd"/>
+      <w:r>
+        <w:rPr>
+          <w:rFonts w:ascii="Arial" w:hAnsi="Arial" w:cs="Arial"/>
+          <w:sz w:val="24"/>
+          <w:szCs w:val="24"/>
+        </w:rPr>
+        <w:t xml:space="preserve">, </w:t>
+      </w:r>
+      <w:r>
+        <w:rPr>
+          <w:rFonts w:ascii="Arial" w:hAnsi="Arial" w:cs="Arial"/>
+          <w:sz w:val="24"/>
+          <w:szCs w:val="24"/>
+        </w:rPr>
+        <w:t xml:space="preserve">configuración de </w:t>
+      </w:r>
+      <w:proofErr w:type="spellStart"/>
+      <w:r>
+        <w:rPr>
+          <w:rFonts w:ascii="Arial" w:hAnsi="Arial" w:cs="Arial"/>
+          <w:sz w:val="24"/>
+          <w:szCs w:val="24"/>
+        </w:rPr>
+        <w:t>nginx</w:t>
+      </w:r>
+      <w:proofErr w:type="spellEnd"/>
+      <w:r>
+        <w:rPr>
+          <w:rFonts w:ascii="Arial" w:hAnsi="Arial" w:cs="Arial"/>
+          <w:sz w:val="24"/>
+          <w:szCs w:val="24"/>
+        </w:rPr>
+        <w:t xml:space="preserve"> y php.ini</w:t>
+      </w:r>
+    </w:p>
+    <w:p>
+      <w:pPr>
+        <w:pStyle w:val="Prrafodelista"/>
+        <w:rPr>
+          <w:rFonts w:ascii="Arial" w:hAnsi="Arial" w:cs="Arial"/>
+          <w:b/>
+          <w:sz w:val="24"/>
+          <w:szCs w:val="24"/>
+        </w:rPr>
+      </w:pPr>
+    </w:p>
+    <w:p>
+      <w:pPr>
+        <w:pStyle w:val="Prrafodelista"/>
+        <w:numPr>
+          <w:ilvl w:val="0"/>
+          <w:numId w:val="19"/>
+        </w:numPr>
+        <w:rPr>
+          <w:rFonts w:ascii="Arial" w:hAnsi="Arial" w:cs="Arial"/>
+          <w:b/>
+          <w:sz w:val="24"/>
+          <w:szCs w:val="24"/>
+        </w:rPr>
+      </w:pPr>
+      <w:r>
+        <w:rPr>
+          <w:rFonts w:ascii="Arial" w:hAnsi="Arial" w:cs="Arial"/>
+          <w:b/>
+          <w:noProof/>
+          <w:sz w:val="24"/>
+          <w:szCs w:val="24"/>
+        </w:rPr>
+        <w:t>Ops</w:t>
+      </w:r>
+      <w:r>
+        <w:rPr>
+          <w:rFonts w:ascii="Arial" w:hAnsi="Arial" w:cs="Arial"/>
+          <w:b/>
+          <w:noProof/>
+          <w:sz w:val="24"/>
+          <w:szCs w:val="24"/>
+        </w:rPr>
+        <w:t xml:space="preserve">: </w:t>
+      </w:r>
+      <w:r>
+        <w:rPr>
+          <w:rFonts w:ascii="Arial" w:hAnsi="Arial" w:cs="Arial"/>
+          <w:noProof/>
+          <w:sz w:val="24"/>
+          <w:szCs w:val="24"/>
+        </w:rPr>
+        <w:t>contiene las particularidades de los docker file, sus personalizaciones para cada servicio</w:t>
+      </w:r>
+      <w:r>
+        <w:rPr>
+          <w:rFonts w:ascii="Arial" w:hAnsi="Arial" w:cs="Arial"/>
+          <w:noProof/>
+          <w:sz w:val="24"/>
+          <w:szCs w:val="24"/>
+        </w:rPr>
+        <w:t>, en nuestro caso los comandos especificos que se ha</w:t>
+      </w:r>
+      <w:r>
+        <w:rPr>
+          <w:rFonts w:ascii="Arial" w:hAnsi="Arial" w:cs="Arial"/>
+          <w:noProof/>
+          <w:sz w:val="24"/>
+          <w:szCs w:val="24"/>
+        </w:rPr>
+        <w:t>n de ejecutar en la creacion de la imagen de PHP</w:t>
+      </w:r>
+    </w:p>
+    <w:p>
+      <w:pPr>
+        <w:pStyle w:val="Prrafodelista"/>
+        <w:rPr>
+          <w:rFonts w:ascii="Arial" w:hAnsi="Arial" w:cs="Arial"/>
+          <w:b/>
+          <w:sz w:val="24"/>
+          <w:szCs w:val="24"/>
+        </w:rPr>
+      </w:pPr>
+    </w:p>
+    <w:p>
+      <w:pPr>
+        <w:pStyle w:val="Prrafodelista"/>
+        <w:numPr>
+          <w:ilvl w:val="0"/>
+          <w:numId w:val="19"/>
+        </w:numPr>
+        <w:rPr>
+          <w:rFonts w:ascii="Arial" w:hAnsi="Arial" w:cs="Arial"/>
+          <w:b/>
+          <w:sz w:val="24"/>
+          <w:szCs w:val="24"/>
+        </w:rPr>
+      </w:pPr>
+      <w:r>
+        <w:rPr>
+          <w:rFonts w:ascii="Arial" w:hAnsi="Arial" w:cs="Arial"/>
+          <w:b/>
+          <w:sz w:val="24"/>
+          <w:szCs w:val="24"/>
+        </w:rPr>
+        <w:t>Var:</w:t>
+      </w:r>
+      <w:r>
+        <w:rPr>
+          <w:rFonts w:ascii="Arial" w:hAnsi="Arial" w:cs="Arial"/>
+          <w:sz w:val="24"/>
+          <w:szCs w:val="24"/>
+        </w:rPr>
+        <w:t xml:space="preserve"> Contiene los datos que se han mapeado de los contenedores como las bases de datos de </w:t>
+      </w:r>
+      <w:proofErr w:type="spellStart"/>
+      <w:r>
+        <w:rPr>
+          <w:rFonts w:ascii="Arial" w:hAnsi="Arial" w:cs="Arial"/>
+          <w:sz w:val="24"/>
+          <w:szCs w:val="24"/>
+        </w:rPr>
+        <w:t>mysql</w:t>
+      </w:r>
+      <w:proofErr w:type="spellEnd"/>
+      <w:r>
+        <w:rPr>
+          <w:rFonts w:ascii="Arial" w:hAnsi="Arial" w:cs="Arial"/>
+          <w:sz w:val="24"/>
+          <w:szCs w:val="24"/>
+        </w:rPr>
+        <w:t xml:space="preserve"> y </w:t>
+      </w:r>
+      <w:proofErr w:type="spellStart"/>
+      <w:proofErr w:type="gramStart"/>
+      <w:r>
+        <w:rPr>
+          <w:rFonts w:ascii="Arial" w:hAnsi="Arial" w:cs="Arial"/>
+          <w:sz w:val="24"/>
+          <w:szCs w:val="24"/>
+        </w:rPr>
+        <w:t>redis</w:t>
+      </w:r>
+      <w:proofErr w:type="spellEnd"/>
+      <w:proofErr w:type="gramEnd"/>
+      <w:r>
+        <w:rPr>
+          <w:rFonts w:ascii="Arial" w:hAnsi="Arial" w:cs="Arial"/>
+          <w:sz w:val="24"/>
+          <w:szCs w:val="24"/>
+        </w:rPr>
+        <w:t xml:space="preserve"> así como los logs de </w:t>
+      </w:r>
+      <w:proofErr w:type="spellStart"/>
+      <w:r>
+        <w:rPr>
+          <w:rFonts w:ascii="Arial" w:hAnsi="Arial" w:cs="Arial"/>
+          <w:sz w:val="24"/>
+          <w:szCs w:val="24"/>
+        </w:rPr>
+        <w:t>nginx</w:t>
+      </w:r>
+      <w:proofErr w:type="spellEnd"/>
+      <w:r>
+        <w:rPr>
+          <w:rFonts w:ascii="Arial" w:hAnsi="Arial" w:cs="Arial"/>
+          <w:sz w:val="24"/>
+          <w:szCs w:val="24"/>
+        </w:rPr>
+        <w:t>.</w:t>
+      </w:r>
+    </w:p>
+    <w:p>
+      <w:pPr>
+        <w:pStyle w:val="Prrafodelista"/>
+        <w:rPr>
+          <w:rFonts w:ascii="Arial" w:hAnsi="Arial" w:cs="Arial"/>
+          <w:b/>
+          <w:sz w:val="24"/>
+          <w:szCs w:val="24"/>
+        </w:rPr>
+      </w:pPr>
+    </w:p>
+    <w:p>
+      <w:pPr>
+        <w:pStyle w:val="Prrafodelista"/>
+        <w:numPr>
+          <w:ilvl w:val="0"/>
+          <w:numId w:val="19"/>
+        </w:numPr>
+        <w:jc w:val="both"/>
+        <w:rPr>
+          <w:rFonts w:ascii="Arial" w:hAnsi="Arial" w:cs="Arial"/>
+          <w:sz w:val="24"/>
+          <w:szCs w:val="24"/>
+        </w:rPr>
+      </w:pPr>
+      <w:r>
+        <w:rPr>
+          <w:b/>
+          <w:noProof/>
+        </w:rPr>
+        <w:drawing>
+          <wp:anchor distT="0" distB="0" distL="114300" distR="114300" simplePos="0" relativeHeight="251662336" behindDoc="0" locked="0" layoutInCell="1" allowOverlap="1" wp14:anchorId="337BC0FA" wp14:editId="20FF07CD">
+            <wp:simplePos x="0" y="0"/>
+            <wp:positionH relativeFrom="column">
+              <wp:posOffset>0</wp:posOffset>
+            </wp:positionH>
+            <wp:positionV relativeFrom="paragraph">
+              <wp:posOffset>-36195</wp:posOffset>
+            </wp:positionV>
+            <wp:extent cx="2781300" cy="5753100"/>
+            <wp:effectExtent l="0" t="0" r="0" b="6350"/>
+            <wp:wrapThrough wrapText="bothSides">
+              <wp:wrapPolygon edited="0">
+                <wp:start x="0" y="0"/>
+                <wp:lineTo x="0" y="21551"/>
+                <wp:lineTo x="21452" y="21551"/>
+                <wp:lineTo x="21452" y="0"/>
+                <wp:lineTo x="0" y="0"/>
+              </wp:wrapPolygon>
+            </wp:wrapThrough>
+            <wp:docPr id="13" name="Imagen 13"/>
+            <wp:cNvGraphicFramePr>
+              <a:graphicFrameLocks xmlns:a="http://schemas.openxmlformats.org/drawingml/2006/main" noChangeAspect="1"/>
+            </wp:cNvGraphicFramePr>
+            <a:graphic xmlns:a="http://schemas.openxmlformats.org/drawingml/2006/main">
+              <a:graphicData uri="http://schemas.openxmlformats.org/drawingml/2006/picture">
+                <pic:pic xmlns:pic="http://schemas.openxmlformats.org/drawingml/2006/picture">
+                  <pic:nvPicPr>
+                    <pic:cNvPr id="1" name=""/>
+                    <pic:cNvPicPr/>
+                  </pic:nvPicPr>
+                  <pic:blipFill>
+                    <a:blip r:embed="rId27">
+                      <a:extLst>
+                        <a:ext uri="{28A0092B-C50C-407E-A947-70E740481C1C}">
+                          <a14:useLocalDpi xmlns:a14="http://schemas.microsoft.com/office/drawing/2010/main" val="0"/>
+                        </a:ext>
+                      </a:extLst>
+                    </a:blip>
+                    <a:stretch>
+                      <a:fillRect/>
+                    </a:stretch>
+                  </pic:blipFill>
+                  <pic:spPr>
+                    <a:xfrm>
+                      <a:off x="0" y="0"/>
+                      <a:ext cx="2781300" cy="5753100"/>
+                    </a:xfrm>
+                    <a:prstGeom prst="rect">
+                      <a:avLst/>
+                    </a:prstGeom>
+                  </pic:spPr>
+                </pic:pic>
+              </a:graphicData>
+            </a:graphic>
+            <wp14:sizeRelV relativeFrom="margin">
+              <wp14:pctHeight>0</wp14:pctHeight>
+            </wp14:sizeRelV>
+          </wp:anchor>
+        </w:drawing>
+      </w:r>
+      <w:proofErr w:type="spellStart"/>
+      <w:r>
+        <w:rPr>
+          <w:rFonts w:ascii="Arial" w:hAnsi="Arial" w:cs="Arial"/>
+          <w:b/>
+          <w:sz w:val="24"/>
+          <w:szCs w:val="24"/>
+        </w:rPr>
+        <w:t>bin</w:t>
+      </w:r>
+      <w:proofErr w:type="spellEnd"/>
+      <w:r>
+        <w:rPr>
+          <w:rFonts w:ascii="Arial" w:hAnsi="Arial" w:cs="Arial"/>
+          <w:b/>
+          <w:sz w:val="24"/>
+          <w:szCs w:val="24"/>
+        </w:rPr>
+        <w:t>:</w:t>
+      </w:r>
+      <w:r>
+        <w:rPr>
+          <w:rFonts w:ascii="Arial" w:hAnsi="Arial" w:cs="Arial"/>
+          <w:sz w:val="24"/>
+          <w:szCs w:val="24"/>
+        </w:rPr>
+        <w:t xml:space="preserve"> contiene los comandos propios de symfony</w:t>
+      </w:r>
+    </w:p>
+    <w:p>
+      <w:pPr>
+        <w:pStyle w:val="Prrafodelista"/>
+        <w:rPr>
+          <w:rFonts w:ascii="Arial" w:hAnsi="Arial" w:cs="Arial"/>
+          <w:sz w:val="24"/>
+          <w:szCs w:val="24"/>
+        </w:rPr>
+      </w:pPr>
+    </w:p>
+    <w:p>
+      <w:pPr>
+        <w:pStyle w:val="Prrafodelista"/>
+        <w:numPr>
+          <w:ilvl w:val="0"/>
+          <w:numId w:val="19"/>
+        </w:numPr>
+        <w:jc w:val="both"/>
+        <w:rPr>
+          <w:rFonts w:ascii="Arial" w:hAnsi="Arial" w:cs="Arial"/>
+          <w:sz w:val="24"/>
+          <w:szCs w:val="24"/>
+        </w:rPr>
+      </w:pPr>
+      <w:proofErr w:type="spellStart"/>
+      <w:r>
+        <w:rPr>
+          <w:rFonts w:ascii="Arial" w:hAnsi="Arial" w:cs="Arial"/>
+          <w:b/>
+          <w:sz w:val="24"/>
+          <w:szCs w:val="24"/>
+        </w:rPr>
+        <w:t>Config</w:t>
+      </w:r>
+      <w:proofErr w:type="spellEnd"/>
+      <w:r>
+        <w:rPr>
+          <w:rFonts w:ascii="Arial" w:hAnsi="Arial" w:cs="Arial"/>
+          <w:b/>
+          <w:sz w:val="24"/>
+          <w:szCs w:val="24"/>
+        </w:rPr>
+        <w:t>:</w:t>
+      </w:r>
+      <w:r>
+        <w:rPr>
+          <w:rFonts w:ascii="Arial" w:hAnsi="Arial" w:cs="Arial"/>
+          <w:sz w:val="24"/>
+          <w:szCs w:val="24"/>
+        </w:rPr>
+        <w:t xml:space="preserve"> </w:t>
+      </w:r>
+      <w:r>
+        <w:rPr>
+          <w:rFonts w:ascii="Arial" w:hAnsi="Arial" w:cs="Arial"/>
+          <w:sz w:val="24"/>
+          <w:szCs w:val="24"/>
+        </w:rPr>
+        <w:t>Contiene las configuraciones de los bundles</w:t>
+      </w:r>
+      <w:r>
+        <w:rPr>
+          <w:rFonts w:ascii="Arial" w:hAnsi="Arial" w:cs="Arial"/>
+          <w:sz w:val="24"/>
+          <w:szCs w:val="24"/>
+        </w:rPr>
+        <w:t xml:space="preserve">, servicios, paquetes y rutas a los controladores, propias del </w:t>
+      </w:r>
+      <w:proofErr w:type="spellStart"/>
+      <w:r>
+        <w:rPr>
+          <w:rFonts w:ascii="Arial" w:hAnsi="Arial" w:cs="Arial"/>
+          <w:sz w:val="24"/>
+          <w:szCs w:val="24"/>
+        </w:rPr>
+        <w:t>framework</w:t>
+      </w:r>
+      <w:proofErr w:type="spellEnd"/>
+      <w:r>
+        <w:rPr>
+          <w:rFonts w:ascii="Arial" w:hAnsi="Arial" w:cs="Arial"/>
+          <w:sz w:val="24"/>
+          <w:szCs w:val="24"/>
+        </w:rPr>
+        <w:t>.</w:t>
+      </w:r>
+    </w:p>
+    <w:p>
+      <w:pPr>
+        <w:pStyle w:val="Prrafodelista"/>
+        <w:rPr>
+          <w:rFonts w:ascii="Arial" w:hAnsi="Arial" w:cs="Arial"/>
+          <w:sz w:val="24"/>
+          <w:szCs w:val="24"/>
+        </w:rPr>
+      </w:pPr>
+    </w:p>
+    <w:p>
+      <w:pPr>
+        <w:pStyle w:val="Prrafodelista"/>
+        <w:numPr>
+          <w:ilvl w:val="0"/>
+          <w:numId w:val="19"/>
+        </w:numPr>
+        <w:jc w:val="both"/>
+        <w:rPr>
+          <w:rFonts w:ascii="Arial" w:hAnsi="Arial" w:cs="Arial"/>
+          <w:b/>
+          <w:sz w:val="24"/>
+          <w:szCs w:val="24"/>
+        </w:rPr>
+      </w:pPr>
+      <w:proofErr w:type="spellStart"/>
+      <w:r>
+        <w:rPr>
+          <w:rFonts w:ascii="Arial" w:hAnsi="Arial" w:cs="Arial"/>
+          <w:b/>
+          <w:sz w:val="24"/>
+          <w:szCs w:val="24"/>
+        </w:rPr>
+        <w:t>Public</w:t>
+      </w:r>
+      <w:proofErr w:type="spellEnd"/>
+      <w:r>
+        <w:rPr>
+          <w:rFonts w:ascii="Arial" w:hAnsi="Arial" w:cs="Arial"/>
+          <w:b/>
+          <w:sz w:val="24"/>
+          <w:szCs w:val="24"/>
+        </w:rPr>
+        <w:t>:</w:t>
+      </w:r>
+      <w:r>
+        <w:rPr>
+          <w:rFonts w:ascii="Arial" w:hAnsi="Arial" w:cs="Arial"/>
+          <w:sz w:val="24"/>
+          <w:szCs w:val="24"/>
+        </w:rPr>
+        <w:t xml:space="preserve"> </w:t>
+      </w:r>
+      <w:r>
+        <w:rPr>
+          <w:rFonts w:ascii="Arial" w:hAnsi="Arial" w:cs="Arial"/>
+          <w:sz w:val="24"/>
+          <w:szCs w:val="24"/>
+        </w:rPr>
+        <w:t>P</w:t>
+      </w:r>
+      <w:r>
+        <w:rPr>
+          <w:rFonts w:ascii="Arial" w:hAnsi="Arial" w:cs="Arial"/>
+          <w:sz w:val="24"/>
+          <w:szCs w:val="24"/>
+        </w:rPr>
+        <w:t>unto p</w:t>
+      </w:r>
+      <w:r>
+        <w:rPr>
+          <w:rFonts w:ascii="Arial" w:hAnsi="Arial" w:cs="Arial"/>
+          <w:sz w:val="24"/>
+          <w:szCs w:val="24"/>
+        </w:rPr>
+        <w:t>ú</w:t>
+      </w:r>
+      <w:r>
+        <w:rPr>
+          <w:rFonts w:ascii="Arial" w:hAnsi="Arial" w:cs="Arial"/>
+          <w:sz w:val="24"/>
+          <w:szCs w:val="24"/>
+        </w:rPr>
+        <w:t xml:space="preserve">blico de la </w:t>
+      </w:r>
+      <w:r>
+        <w:rPr>
+          <w:rFonts w:ascii="Arial" w:hAnsi="Arial" w:cs="Arial"/>
+          <w:sz w:val="24"/>
+          <w:szCs w:val="24"/>
+        </w:rPr>
+        <w:t>aplicación</w:t>
+      </w:r>
+      <w:r>
+        <w:rPr>
+          <w:rFonts w:ascii="Arial" w:hAnsi="Arial" w:cs="Arial"/>
+          <w:sz w:val="24"/>
+          <w:szCs w:val="24"/>
+        </w:rPr>
+        <w:t xml:space="preserve">, a esta carpeta se apunta en la configuración del interprete web que se utilice, en nuestro caso </w:t>
+      </w:r>
+      <w:proofErr w:type="spellStart"/>
+      <w:r>
+        <w:rPr>
+          <w:rFonts w:ascii="Arial" w:hAnsi="Arial" w:cs="Arial"/>
+          <w:sz w:val="24"/>
+          <w:szCs w:val="24"/>
+        </w:rPr>
+        <w:t>Nginx</w:t>
+      </w:r>
+      <w:proofErr w:type="spellEnd"/>
+      <w:r>
+        <w:rPr>
+          <w:rFonts w:ascii="Arial" w:hAnsi="Arial" w:cs="Arial"/>
+          <w:sz w:val="24"/>
+          <w:szCs w:val="24"/>
+        </w:rPr>
+        <w:t>.</w:t>
+      </w:r>
+    </w:p>
+    <w:p>
+      <w:pPr>
+        <w:pStyle w:val="Prrafodelista"/>
+        <w:rPr>
+          <w:rFonts w:ascii="Arial" w:hAnsi="Arial" w:cs="Arial"/>
+          <w:b/>
+          <w:sz w:val="24"/>
+          <w:szCs w:val="24"/>
+        </w:rPr>
+      </w:pPr>
+    </w:p>
+    <w:p>
+      <w:pPr>
+        <w:pStyle w:val="Prrafodelista"/>
+        <w:numPr>
+          <w:ilvl w:val="0"/>
+          <w:numId w:val="19"/>
+        </w:numPr>
+        <w:jc w:val="both"/>
+        <w:rPr>
+          <w:rFonts w:ascii="Arial" w:hAnsi="Arial" w:cs="Arial"/>
+          <w:b/>
+          <w:sz w:val="24"/>
+          <w:szCs w:val="24"/>
+        </w:rPr>
+      </w:pPr>
+      <w:proofErr w:type="spellStart"/>
+      <w:r>
+        <w:rPr>
+          <w:rFonts w:ascii="Arial" w:hAnsi="Arial" w:cs="Arial"/>
+          <w:b/>
+          <w:sz w:val="24"/>
+          <w:szCs w:val="24"/>
+        </w:rPr>
+        <w:t>Src</w:t>
+      </w:r>
+      <w:proofErr w:type="spellEnd"/>
+      <w:r>
+        <w:rPr>
+          <w:rFonts w:ascii="Arial" w:hAnsi="Arial" w:cs="Arial"/>
+          <w:b/>
+          <w:sz w:val="24"/>
+          <w:szCs w:val="24"/>
+        </w:rPr>
+        <w:t xml:space="preserve">: </w:t>
+      </w:r>
+      <w:r>
+        <w:rPr>
+          <w:rFonts w:ascii="Arial" w:hAnsi="Arial" w:cs="Arial"/>
+          <w:sz w:val="24"/>
+          <w:szCs w:val="24"/>
+        </w:rPr>
+        <w:t>contiene toda la lógica de la aplicación, sus carpetas contenidas reflejan en cierto modo las capas abstractas</w:t>
+      </w:r>
+      <w:r>
+        <w:rPr>
+          <w:rFonts w:ascii="Arial" w:hAnsi="Arial" w:cs="Arial"/>
+          <w:sz w:val="24"/>
+          <w:szCs w:val="24"/>
+        </w:rPr>
+        <w:t xml:space="preserve"> conceptuales definidas en el apartado </w:t>
+      </w:r>
+      <w:r>
+        <w:rPr>
+          <w:rFonts w:ascii="Arial" w:hAnsi="Arial" w:cs="Arial"/>
+          <w:sz w:val="24"/>
+          <w:szCs w:val="24"/>
+        </w:rPr>
+        <w:t>“</w:t>
+      </w:r>
+      <w:r>
+        <w:rPr>
+          <w:rFonts w:ascii="Arial" w:hAnsi="Arial" w:cs="Arial"/>
+          <w:b/>
+          <w:sz w:val="24"/>
+          <w:szCs w:val="24"/>
+        </w:rPr>
+        <w:t xml:space="preserve">arquitectura </w:t>
+      </w:r>
+      <w:r>
+        <w:rPr>
+          <w:rFonts w:ascii="Arial" w:hAnsi="Arial" w:cs="Arial"/>
+          <w:b/>
+          <w:sz w:val="24"/>
+          <w:szCs w:val="24"/>
+        </w:rPr>
+        <w:t>de software</w:t>
+      </w:r>
+      <w:r>
+        <w:rPr>
+          <w:rFonts w:ascii="Arial" w:hAnsi="Arial" w:cs="Arial"/>
+          <w:b/>
+          <w:sz w:val="24"/>
+          <w:szCs w:val="24"/>
+        </w:rPr>
+        <w:t xml:space="preserve"> de la API Middleware”</w:t>
+      </w:r>
+      <w:r>
+        <w:rPr>
+          <w:rFonts w:ascii="Arial" w:hAnsi="Arial" w:cs="Arial"/>
+          <w:sz w:val="24"/>
+          <w:szCs w:val="24"/>
+        </w:rPr>
+        <w:t>, se encuentra además el árbol abierto de</w:t>
+      </w:r>
+      <w:r>
+        <w:rPr>
+          <w:rFonts w:ascii="Arial" w:hAnsi="Arial" w:cs="Arial"/>
+          <w:sz w:val="24"/>
+          <w:szCs w:val="24"/>
+        </w:rPr>
+        <w:t>l contenido de las</w:t>
+      </w:r>
+      <w:r>
+        <w:rPr>
+          <w:rFonts w:ascii="Arial" w:hAnsi="Arial" w:cs="Arial"/>
+          <w:sz w:val="24"/>
+          <w:szCs w:val="24"/>
+        </w:rPr>
+        <w:t xml:space="preserve"> carpetas</w:t>
+      </w:r>
+      <w:r>
+        <w:rPr>
+          <w:rFonts w:ascii="Arial" w:hAnsi="Arial" w:cs="Arial"/>
+          <w:b/>
+          <w:sz w:val="24"/>
+          <w:szCs w:val="24"/>
+        </w:rPr>
+        <w:t>.</w:t>
+      </w:r>
+    </w:p>
+    <w:p>
+      <w:pPr>
+        <w:pStyle w:val="Prrafodelista"/>
+        <w:numPr>
+          <w:ilvl w:val="0"/>
+          <w:numId w:val="18"/>
+        </w:numPr>
+        <w:jc w:val="both"/>
+        <w:rPr>
+          <w:rFonts w:ascii="Arial" w:hAnsi="Arial" w:cs="Arial"/>
+          <w:b/>
+          <w:sz w:val="24"/>
+          <w:szCs w:val="24"/>
+        </w:rPr>
+      </w:pPr>
+      <w:proofErr w:type="spellStart"/>
+      <w:r>
+        <w:rPr>
+          <w:rFonts w:ascii="Arial" w:hAnsi="Arial" w:cs="Arial"/>
+          <w:b/>
+          <w:sz w:val="24"/>
+          <w:szCs w:val="24"/>
+        </w:rPr>
+        <w:t>Aplication</w:t>
+      </w:r>
+      <w:proofErr w:type="spellEnd"/>
+      <w:r>
+        <w:rPr>
+          <w:rFonts w:ascii="Arial" w:hAnsi="Arial" w:cs="Arial"/>
+          <w:b/>
+          <w:sz w:val="24"/>
+          <w:szCs w:val="24"/>
+        </w:rPr>
+        <w:t xml:space="preserve">: </w:t>
+      </w:r>
+      <w:r>
+        <w:rPr>
+          <w:rFonts w:ascii="Arial" w:hAnsi="Arial" w:cs="Arial"/>
+          <w:sz w:val="24"/>
+          <w:szCs w:val="24"/>
+        </w:rPr>
+        <w:t>contiene por separ</w:t>
+      </w:r>
+      <w:r>
+        <w:rPr>
+          <w:rFonts w:ascii="Arial" w:hAnsi="Arial" w:cs="Arial"/>
+          <w:sz w:val="24"/>
+          <w:szCs w:val="24"/>
+        </w:rPr>
+        <w:t>a</w:t>
+      </w:r>
+      <w:r>
+        <w:rPr>
+          <w:rFonts w:ascii="Arial" w:hAnsi="Arial" w:cs="Arial"/>
+          <w:sz w:val="24"/>
+          <w:szCs w:val="24"/>
+        </w:rPr>
+        <w:t xml:space="preserve">do los casos de uso de la </w:t>
+      </w:r>
+      <w:r>
+        <w:rPr>
+          <w:rFonts w:ascii="Arial" w:hAnsi="Arial" w:cs="Arial"/>
+          <w:sz w:val="24"/>
+          <w:szCs w:val="24"/>
+        </w:rPr>
+        <w:t xml:space="preserve">aplicación. </w:t>
+      </w:r>
+    </w:p>
+    <w:p>
+      <w:pPr>
+        <w:pStyle w:val="Prrafodelista"/>
+        <w:numPr>
+          <w:ilvl w:val="0"/>
+          <w:numId w:val="18"/>
+        </w:numPr>
+        <w:jc w:val="both"/>
+        <w:rPr>
+          <w:rFonts w:ascii="Arial" w:hAnsi="Arial" w:cs="Arial"/>
+          <w:b/>
+          <w:sz w:val="24"/>
+          <w:szCs w:val="24"/>
+        </w:rPr>
+      </w:pPr>
+      <w:proofErr w:type="spellStart"/>
+      <w:r>
+        <w:rPr>
+          <w:rFonts w:ascii="Arial" w:hAnsi="Arial" w:cs="Arial"/>
+          <w:b/>
+          <w:sz w:val="24"/>
+          <w:szCs w:val="24"/>
+        </w:rPr>
+        <w:t>Command</w:t>
+      </w:r>
+      <w:proofErr w:type="spellEnd"/>
+      <w:r>
+        <w:rPr>
+          <w:rFonts w:ascii="Arial" w:hAnsi="Arial" w:cs="Arial"/>
+          <w:b/>
+          <w:sz w:val="24"/>
+          <w:szCs w:val="24"/>
+        </w:rPr>
+        <w:t xml:space="preserve">: </w:t>
+      </w:r>
+      <w:r>
+        <w:rPr>
+          <w:rFonts w:ascii="Arial" w:hAnsi="Arial" w:cs="Arial"/>
+          <w:sz w:val="24"/>
+          <w:szCs w:val="24"/>
+        </w:rPr>
+        <w:t xml:space="preserve">contiene los comandos de consola creados para recrear la </w:t>
+      </w:r>
+      <w:r>
+        <w:rPr>
+          <w:rFonts w:ascii="Arial" w:hAnsi="Arial" w:cs="Arial"/>
+          <w:sz w:val="24"/>
+          <w:szCs w:val="24"/>
+        </w:rPr>
+        <w:t>base de datos en memoria,</w:t>
+      </w:r>
+      <w:r>
+        <w:rPr>
+          <w:rFonts w:ascii="Arial" w:hAnsi="Arial" w:cs="Arial"/>
+          <w:sz w:val="24"/>
+          <w:szCs w:val="24"/>
+        </w:rPr>
+        <w:t xml:space="preserve"> así como el “</w:t>
+      </w:r>
+      <w:proofErr w:type="spellStart"/>
+      <w:r>
+        <w:rPr>
+          <w:rFonts w:ascii="Arial" w:hAnsi="Arial" w:cs="Arial"/>
+          <w:sz w:val="24"/>
+          <w:szCs w:val="24"/>
+        </w:rPr>
+        <w:t>listener</w:t>
+      </w:r>
+      <w:proofErr w:type="spellEnd"/>
+      <w:r>
+        <w:rPr>
+          <w:rFonts w:ascii="Arial" w:hAnsi="Arial" w:cs="Arial"/>
+          <w:sz w:val="24"/>
+          <w:szCs w:val="24"/>
+        </w:rPr>
+        <w:t>” de eventos.</w:t>
+      </w:r>
+    </w:p>
+    <w:p>
+      <w:pPr>
+        <w:pStyle w:val="Prrafodelista"/>
+        <w:numPr>
+          <w:ilvl w:val="0"/>
+          <w:numId w:val="18"/>
+        </w:numPr>
+        <w:jc w:val="both"/>
+        <w:rPr>
+          <w:rFonts w:ascii="Arial" w:hAnsi="Arial" w:cs="Arial"/>
+          <w:b/>
+          <w:sz w:val="24"/>
+          <w:szCs w:val="24"/>
+        </w:rPr>
+      </w:pPr>
+      <w:r>
+        <w:rPr>
+          <w:rFonts w:ascii="Arial" w:hAnsi="Arial" w:cs="Arial"/>
+          <w:b/>
+          <w:sz w:val="24"/>
+          <w:szCs w:val="24"/>
+        </w:rPr>
+        <w:lastRenderedPageBreak/>
+        <w:t xml:space="preserve">Controller: </w:t>
+      </w:r>
+      <w:r>
+        <w:rPr>
+          <w:rFonts w:ascii="Arial" w:hAnsi="Arial" w:cs="Arial"/>
+          <w:sz w:val="24"/>
+          <w:szCs w:val="24"/>
+        </w:rPr>
+        <w:t xml:space="preserve">Contiene todos los </w:t>
+      </w:r>
+      <w:r>
+        <w:rPr>
+          <w:rFonts w:ascii="Arial" w:hAnsi="Arial" w:cs="Arial"/>
+          <w:sz w:val="24"/>
+          <w:szCs w:val="24"/>
+        </w:rPr>
+        <w:t>puntos de entrada y salida de la aplicación.</w:t>
+      </w:r>
+    </w:p>
+    <w:p>
+      <w:pPr>
+        <w:pStyle w:val="Prrafodelista"/>
+        <w:numPr>
+          <w:ilvl w:val="0"/>
+          <w:numId w:val="18"/>
+        </w:numPr>
+        <w:jc w:val="both"/>
+        <w:rPr>
+          <w:rFonts w:ascii="Arial" w:hAnsi="Arial" w:cs="Arial"/>
+          <w:b/>
+          <w:sz w:val="24"/>
+          <w:szCs w:val="24"/>
+        </w:rPr>
+      </w:pPr>
+      <w:proofErr w:type="spellStart"/>
+      <w:r>
+        <w:rPr>
+          <w:rFonts w:ascii="Arial" w:hAnsi="Arial" w:cs="Arial"/>
+          <w:b/>
+          <w:sz w:val="24"/>
+          <w:szCs w:val="24"/>
+        </w:rPr>
+        <w:t>Domain</w:t>
+      </w:r>
+      <w:proofErr w:type="spellEnd"/>
+      <w:r>
+        <w:rPr>
+          <w:rFonts w:ascii="Arial" w:hAnsi="Arial" w:cs="Arial"/>
+          <w:b/>
+          <w:sz w:val="24"/>
+          <w:szCs w:val="24"/>
+        </w:rPr>
+        <w:t>:</w:t>
+      </w:r>
+      <w:r>
+        <w:rPr>
+          <w:rFonts w:ascii="Arial" w:hAnsi="Arial" w:cs="Arial"/>
+          <w:sz w:val="24"/>
+          <w:szCs w:val="24"/>
+        </w:rPr>
+        <w:t xml:space="preserve"> Contiene todos los ficheros que </w:t>
+      </w:r>
+      <w:r>
+        <w:rPr>
+          <w:rFonts w:ascii="Arial" w:hAnsi="Arial" w:cs="Arial"/>
+          <w:sz w:val="24"/>
+          <w:szCs w:val="24"/>
+        </w:rPr>
+        <w:t>componen el dominio de la aplicación, en esta carpeta radica la esencia del aplicativo, la lógica contenida que moldea el modelo de negocio de la Api Middleware.</w:t>
+      </w:r>
+    </w:p>
+    <w:p>
+      <w:pPr>
+        <w:pStyle w:val="Prrafodelista"/>
+        <w:numPr>
+          <w:ilvl w:val="0"/>
+          <w:numId w:val="18"/>
+        </w:numPr>
+        <w:jc w:val="both"/>
+        <w:rPr>
+          <w:rFonts w:ascii="Arial" w:hAnsi="Arial" w:cs="Arial"/>
+          <w:b/>
+          <w:sz w:val="24"/>
+          <w:szCs w:val="24"/>
+        </w:rPr>
+      </w:pPr>
+      <w:proofErr w:type="spellStart"/>
+      <w:r>
+        <w:rPr>
+          <w:rFonts w:ascii="Arial" w:hAnsi="Arial" w:cs="Arial"/>
+          <w:b/>
+          <w:sz w:val="24"/>
+          <w:szCs w:val="24"/>
+        </w:rPr>
+        <w:t>Infraestructure</w:t>
+      </w:r>
+      <w:proofErr w:type="spellEnd"/>
+      <w:r>
+        <w:rPr>
+          <w:rFonts w:ascii="Arial" w:hAnsi="Arial" w:cs="Arial"/>
+          <w:b/>
+          <w:sz w:val="24"/>
+          <w:szCs w:val="24"/>
+        </w:rPr>
+        <w:t xml:space="preserve">: </w:t>
+      </w:r>
+      <w:r>
+        <w:rPr>
+          <w:rFonts w:ascii="Arial" w:hAnsi="Arial" w:cs="Arial"/>
+          <w:sz w:val="24"/>
+          <w:szCs w:val="24"/>
+        </w:rPr>
+        <w:t xml:space="preserve">Contiene la implementación </w:t>
+      </w:r>
+      <w:r>
+        <w:rPr>
+          <w:rFonts w:ascii="Arial" w:hAnsi="Arial" w:cs="Arial"/>
+          <w:sz w:val="24"/>
+          <w:szCs w:val="24"/>
+        </w:rPr>
+        <w:t xml:space="preserve">concreta </w:t>
+      </w:r>
+      <w:r>
+        <w:rPr>
+          <w:rFonts w:ascii="Arial" w:hAnsi="Arial" w:cs="Arial"/>
+          <w:sz w:val="24"/>
+          <w:szCs w:val="24"/>
+        </w:rPr>
+        <w:t>de los servicios externos</w:t>
+      </w:r>
+      <w:r>
+        <w:rPr>
+          <w:rFonts w:ascii="Arial" w:hAnsi="Arial" w:cs="Arial"/>
+          <w:sz w:val="24"/>
+          <w:szCs w:val="24"/>
+        </w:rPr>
+        <w:t>.</w:t>
+      </w:r>
+    </w:p>
+    <w:p>
+      <w:pPr>
+        <w:pStyle w:val="Prrafodelista"/>
+        <w:numPr>
+          <w:ilvl w:val="0"/>
+          <w:numId w:val="21"/>
+        </w:numPr>
+        <w:jc w:val="both"/>
+        <w:rPr>
+          <w:rFonts w:ascii="Arial" w:hAnsi="Arial" w:cs="Arial"/>
+          <w:b/>
+          <w:sz w:val="24"/>
+          <w:szCs w:val="24"/>
+        </w:rPr>
+      </w:pPr>
+      <w:r>
+        <w:rPr>
+          <w:rFonts w:ascii="Arial" w:hAnsi="Arial" w:cs="Arial"/>
+          <w:b/>
+          <w:sz w:val="24"/>
+          <w:szCs w:val="24"/>
+        </w:rPr>
+        <w:t xml:space="preserve">Test: </w:t>
+      </w:r>
+      <w:r>
+        <w:rPr>
+          <w:rFonts w:ascii="Arial" w:hAnsi="Arial" w:cs="Arial"/>
+          <w:sz w:val="24"/>
+          <w:szCs w:val="24"/>
+        </w:rPr>
+        <w:t xml:space="preserve">Contiene </w:t>
+      </w:r>
+      <w:proofErr w:type="gramStart"/>
+      <w:r>
+        <w:rPr>
+          <w:rFonts w:ascii="Arial" w:hAnsi="Arial" w:cs="Arial"/>
+          <w:sz w:val="24"/>
+          <w:szCs w:val="24"/>
+        </w:rPr>
+        <w:t>los test</w:t>
+      </w:r>
+      <w:proofErr w:type="gramEnd"/>
+      <w:r>
+        <w:rPr>
+          <w:rFonts w:ascii="Arial" w:hAnsi="Arial" w:cs="Arial"/>
+          <w:sz w:val="24"/>
+          <w:szCs w:val="24"/>
+        </w:rPr>
+        <w:t xml:space="preserve"> que verifican el funcionamiento adecuado de la aplicación.</w:t>
+      </w:r>
+    </w:p>
+    <w:p>
+      <w:pPr>
+        <w:pStyle w:val="Prrafodelista"/>
+        <w:numPr>
+          <w:ilvl w:val="0"/>
+          <w:numId w:val="21"/>
+        </w:numPr>
+        <w:jc w:val="both"/>
+        <w:rPr>
+          <w:rFonts w:ascii="Arial" w:hAnsi="Arial" w:cs="Arial"/>
+          <w:b/>
+          <w:sz w:val="24"/>
+          <w:szCs w:val="24"/>
+        </w:rPr>
+      </w:pPr>
+      <w:proofErr w:type="gramStart"/>
+      <w:r>
+        <w:rPr>
+          <w:rFonts w:ascii="Arial" w:hAnsi="Arial" w:cs="Arial"/>
+          <w:b/>
+          <w:sz w:val="24"/>
+          <w:szCs w:val="24"/>
+        </w:rPr>
+        <w:t xml:space="preserve">fichero </w:t>
+      </w:r>
+      <w:r>
+        <w:rPr>
+          <w:rFonts w:ascii="Arial" w:hAnsi="Arial" w:cs="Arial"/>
+          <w:b/>
+          <w:sz w:val="24"/>
+          <w:szCs w:val="24"/>
+        </w:rPr>
+        <w:t>.</w:t>
+      </w:r>
+      <w:proofErr w:type="spellStart"/>
+      <w:r>
+        <w:rPr>
+          <w:rFonts w:ascii="Arial" w:hAnsi="Arial" w:cs="Arial"/>
+          <w:b/>
+          <w:sz w:val="24"/>
+          <w:szCs w:val="24"/>
+        </w:rPr>
+        <w:t>env</w:t>
+      </w:r>
+      <w:proofErr w:type="spellEnd"/>
+      <w:proofErr w:type="gramEnd"/>
+      <w:r>
+        <w:rPr>
+          <w:rFonts w:ascii="Arial" w:hAnsi="Arial" w:cs="Arial"/>
+          <w:b/>
+          <w:sz w:val="24"/>
+          <w:szCs w:val="24"/>
+        </w:rPr>
+        <w:t>:</w:t>
+      </w:r>
+      <w:r>
+        <w:rPr>
+          <w:rFonts w:ascii="Arial" w:hAnsi="Arial" w:cs="Arial"/>
+          <w:sz w:val="24"/>
+          <w:szCs w:val="24"/>
+        </w:rPr>
+        <w:t xml:space="preserve"> Contiene las configuraciones que se pueden modificar para adaptar la aplicación a diferentes entornos o cambiar el comportamiento configurable de alguna parte o de toda la aplicación.</w:t>
+      </w:r>
+    </w:p>
+    <w:p>
+      <w:pPr>
+        <w:pStyle w:val="Prrafodelista"/>
+        <w:numPr>
+          <w:ilvl w:val="0"/>
+          <w:numId w:val="21"/>
+        </w:numPr>
+        <w:jc w:val="both"/>
+        <w:rPr>
+          <w:rFonts w:ascii="Arial" w:hAnsi="Arial" w:cs="Arial"/>
+          <w:b/>
+          <w:sz w:val="24"/>
+          <w:szCs w:val="24"/>
+        </w:rPr>
+      </w:pPr>
+      <w:proofErr w:type="gramStart"/>
+      <w:r>
+        <w:rPr>
+          <w:rFonts w:ascii="Arial" w:hAnsi="Arial" w:cs="Arial"/>
+          <w:b/>
+          <w:sz w:val="24"/>
+          <w:szCs w:val="24"/>
+        </w:rPr>
+        <w:t>fichero .</w:t>
+      </w:r>
+      <w:proofErr w:type="spellStart"/>
+      <w:r>
+        <w:rPr>
+          <w:rFonts w:ascii="Arial" w:hAnsi="Arial" w:cs="Arial"/>
+          <w:b/>
+          <w:sz w:val="24"/>
+          <w:szCs w:val="24"/>
+        </w:rPr>
+        <w:t>env</w:t>
+      </w:r>
+      <w:proofErr w:type="gramEnd"/>
+      <w:r>
+        <w:rPr>
+          <w:rFonts w:ascii="Arial" w:hAnsi="Arial" w:cs="Arial"/>
+          <w:b/>
+          <w:sz w:val="24"/>
+          <w:szCs w:val="24"/>
+        </w:rPr>
+        <w:t>.local</w:t>
+      </w:r>
+      <w:proofErr w:type="spellEnd"/>
+      <w:r>
+        <w:rPr>
+          <w:rFonts w:ascii="Arial" w:hAnsi="Arial" w:cs="Arial"/>
+          <w:b/>
+          <w:sz w:val="24"/>
+          <w:szCs w:val="24"/>
+        </w:rPr>
+        <w:t>:</w:t>
+      </w:r>
+      <w:r>
+        <w:rPr>
+          <w:rFonts w:ascii="Arial" w:hAnsi="Arial" w:cs="Arial"/>
+          <w:b/>
+          <w:sz w:val="24"/>
+          <w:szCs w:val="24"/>
+        </w:rPr>
+        <w:t xml:space="preserve"> </w:t>
+      </w:r>
+      <w:r>
+        <w:rPr>
+          <w:rFonts w:ascii="Arial" w:hAnsi="Arial" w:cs="Arial"/>
+          <w:sz w:val="24"/>
+          <w:szCs w:val="24"/>
+        </w:rPr>
+        <w:t>Contiene las configuraciones personalizadas  generalmente al entorno de desarrollo así como configuraciones que no han de estar en .</w:t>
+      </w:r>
+      <w:proofErr w:type="spellStart"/>
+      <w:r>
+        <w:rPr>
+          <w:rFonts w:ascii="Arial" w:hAnsi="Arial" w:cs="Arial"/>
+          <w:sz w:val="24"/>
+          <w:szCs w:val="24"/>
+        </w:rPr>
+        <w:t>env</w:t>
+      </w:r>
+      <w:proofErr w:type="spellEnd"/>
+      <w:r>
+        <w:rPr>
+          <w:rFonts w:ascii="Arial" w:hAnsi="Arial" w:cs="Arial"/>
+          <w:sz w:val="24"/>
+          <w:szCs w:val="24"/>
+        </w:rPr>
+        <w:t xml:space="preserve"> cuando se comparte la aplicación.</w:t>
+      </w:r>
+    </w:p>
+    <w:p>
+      <w:pPr>
+        <w:pStyle w:val="Prrafodelista"/>
+        <w:numPr>
+          <w:ilvl w:val="0"/>
+          <w:numId w:val="21"/>
+        </w:numPr>
+        <w:jc w:val="both"/>
+        <w:rPr>
+          <w:rFonts w:ascii="Arial" w:hAnsi="Arial" w:cs="Arial"/>
+          <w:b/>
+          <w:sz w:val="24"/>
+          <w:szCs w:val="24"/>
+        </w:rPr>
+      </w:pPr>
+      <w:proofErr w:type="gramStart"/>
+      <w:r>
+        <w:rPr>
+          <w:rFonts w:ascii="Arial" w:hAnsi="Arial" w:cs="Arial"/>
+          <w:b/>
+          <w:sz w:val="24"/>
+          <w:szCs w:val="24"/>
+        </w:rPr>
+        <w:t>fichero .</w:t>
+      </w:r>
+      <w:proofErr w:type="spellStart"/>
+      <w:r>
+        <w:rPr>
+          <w:rFonts w:ascii="Arial" w:hAnsi="Arial" w:cs="Arial"/>
+          <w:b/>
+          <w:sz w:val="24"/>
+          <w:szCs w:val="24"/>
+        </w:rPr>
+        <w:t>env</w:t>
+      </w:r>
+      <w:proofErr w:type="gramEnd"/>
+      <w:r>
+        <w:rPr>
+          <w:rFonts w:ascii="Arial" w:hAnsi="Arial" w:cs="Arial"/>
+          <w:b/>
+          <w:sz w:val="24"/>
+          <w:szCs w:val="24"/>
+        </w:rPr>
+        <w:t>.test</w:t>
+      </w:r>
+      <w:proofErr w:type="spellEnd"/>
+      <w:r>
+        <w:rPr>
+          <w:rFonts w:ascii="Arial" w:hAnsi="Arial" w:cs="Arial"/>
+          <w:b/>
+          <w:sz w:val="24"/>
+          <w:szCs w:val="24"/>
+        </w:rPr>
+        <w:t xml:space="preserve">: </w:t>
+      </w:r>
+      <w:r>
+        <w:rPr>
+          <w:rFonts w:ascii="Arial" w:hAnsi="Arial" w:cs="Arial"/>
+          <w:sz w:val="24"/>
+          <w:szCs w:val="24"/>
+        </w:rPr>
+        <w:t>Al igual que las anteriores adaptadas para el tiempo de ejecución de test.</w:t>
+      </w:r>
+    </w:p>
+    <w:p>
+      <w:pPr>
+        <w:pStyle w:val="Prrafodelista"/>
+        <w:numPr>
+          <w:ilvl w:val="0"/>
+          <w:numId w:val="21"/>
+        </w:numPr>
+        <w:jc w:val="both"/>
+        <w:rPr>
+          <w:rFonts w:ascii="Arial" w:hAnsi="Arial" w:cs="Arial"/>
+          <w:b/>
+          <w:sz w:val="24"/>
+          <w:szCs w:val="24"/>
+        </w:rPr>
+      </w:pPr>
+      <w:proofErr w:type="gramStart"/>
+      <w:r>
+        <w:rPr>
+          <w:rFonts w:ascii="Arial" w:hAnsi="Arial" w:cs="Arial"/>
+          <w:b/>
+          <w:sz w:val="24"/>
+          <w:szCs w:val="24"/>
+        </w:rPr>
+        <w:t xml:space="preserve">fichero </w:t>
+      </w:r>
+      <w:r>
+        <w:rPr>
+          <w:rFonts w:ascii="Arial" w:hAnsi="Arial" w:cs="Arial"/>
+          <w:b/>
+          <w:sz w:val="24"/>
+          <w:szCs w:val="24"/>
+        </w:rPr>
+        <w:t>.</w:t>
+      </w:r>
+      <w:proofErr w:type="spellStart"/>
+      <w:r>
+        <w:rPr>
+          <w:rFonts w:ascii="Arial" w:hAnsi="Arial" w:cs="Arial"/>
+          <w:b/>
+          <w:sz w:val="24"/>
+          <w:szCs w:val="24"/>
+        </w:rPr>
+        <w:t>gitignore</w:t>
+      </w:r>
+      <w:proofErr w:type="spellEnd"/>
+      <w:proofErr w:type="gramEnd"/>
+      <w:r>
+        <w:rPr>
+          <w:rFonts w:ascii="Arial" w:hAnsi="Arial" w:cs="Arial"/>
+          <w:b/>
+          <w:sz w:val="24"/>
+          <w:szCs w:val="24"/>
+        </w:rPr>
+        <w:t xml:space="preserve">: </w:t>
+      </w:r>
+      <w:r>
+        <w:rPr>
+          <w:rFonts w:ascii="Arial" w:hAnsi="Arial" w:cs="Arial"/>
+          <w:sz w:val="24"/>
+          <w:szCs w:val="24"/>
+        </w:rPr>
+        <w:t>Contiene la referencia de todos los ficheros y carpetas que no se desean publicar en GitHub.</w:t>
+      </w:r>
+    </w:p>
+    <w:p>
+      <w:pPr>
+        <w:pStyle w:val="Prrafodelista"/>
+        <w:numPr>
+          <w:ilvl w:val="0"/>
+          <w:numId w:val="21"/>
+        </w:numPr>
+        <w:jc w:val="both"/>
+        <w:rPr>
+          <w:rFonts w:ascii="Arial" w:hAnsi="Arial" w:cs="Arial"/>
+          <w:b/>
+          <w:sz w:val="24"/>
+          <w:szCs w:val="24"/>
+        </w:rPr>
+      </w:pPr>
+      <w:proofErr w:type="gramStart"/>
+      <w:r>
+        <w:rPr>
+          <w:rFonts w:ascii="Arial" w:hAnsi="Arial" w:cs="Arial"/>
+          <w:b/>
+          <w:sz w:val="24"/>
+          <w:szCs w:val="24"/>
+        </w:rPr>
+        <w:t>fichero .</w:t>
+      </w:r>
+      <w:proofErr w:type="spellStart"/>
+      <w:r>
+        <w:rPr>
+          <w:rFonts w:ascii="Arial" w:hAnsi="Arial" w:cs="Arial"/>
+          <w:b/>
+          <w:sz w:val="24"/>
+          <w:szCs w:val="24"/>
+        </w:rPr>
+        <w:t>composer</w:t>
+      </w:r>
+      <w:proofErr w:type="gramEnd"/>
+      <w:r>
+        <w:rPr>
+          <w:rFonts w:ascii="Arial" w:hAnsi="Arial" w:cs="Arial"/>
+          <w:b/>
+          <w:sz w:val="24"/>
+          <w:szCs w:val="24"/>
+        </w:rPr>
+        <w:t>.json</w:t>
+      </w:r>
+      <w:proofErr w:type="spellEnd"/>
+      <w:r>
+        <w:rPr>
+          <w:rFonts w:ascii="Arial" w:hAnsi="Arial" w:cs="Arial"/>
+          <w:b/>
+          <w:sz w:val="24"/>
+          <w:szCs w:val="24"/>
+        </w:rPr>
+        <w:t xml:space="preserve"> y </w:t>
+      </w:r>
+      <w:proofErr w:type="spellStart"/>
+      <w:r>
+        <w:rPr>
+          <w:rFonts w:ascii="Arial" w:hAnsi="Arial" w:cs="Arial"/>
+          <w:b/>
+          <w:sz w:val="24"/>
+          <w:szCs w:val="24"/>
+        </w:rPr>
+        <w:t>Composer.lock</w:t>
+      </w:r>
+      <w:proofErr w:type="spellEnd"/>
+      <w:r>
+        <w:rPr>
+          <w:rFonts w:ascii="Arial" w:hAnsi="Arial" w:cs="Arial"/>
+          <w:b/>
+          <w:sz w:val="24"/>
+          <w:szCs w:val="24"/>
+        </w:rPr>
+        <w:t>:</w:t>
+      </w:r>
+      <w:r>
+        <w:rPr>
+          <w:rFonts w:ascii="Arial" w:hAnsi="Arial" w:cs="Arial"/>
+          <w:b/>
+          <w:sz w:val="24"/>
+          <w:szCs w:val="24"/>
+        </w:rPr>
+        <w:t xml:space="preserve"> </w:t>
+      </w:r>
+      <w:r>
+        <w:rPr>
+          <w:rFonts w:ascii="Arial" w:hAnsi="Arial" w:cs="Arial"/>
+          <w:sz w:val="24"/>
+          <w:szCs w:val="24"/>
+        </w:rPr>
+        <w:t>es el fichero de configuración donde se gestión las dependencias del proyecto.</w:t>
+      </w:r>
+    </w:p>
+    <w:p>
+      <w:pPr>
+        <w:pStyle w:val="Prrafodelista"/>
+        <w:numPr>
+          <w:ilvl w:val="0"/>
+          <w:numId w:val="21"/>
+        </w:numPr>
+        <w:jc w:val="both"/>
+        <w:rPr>
+          <w:rFonts w:ascii="Arial" w:hAnsi="Arial" w:cs="Arial"/>
+          <w:b/>
+          <w:sz w:val="24"/>
+          <w:szCs w:val="24"/>
+        </w:rPr>
+      </w:pPr>
+      <w:r>
+        <w:rPr>
+          <w:rFonts w:ascii="Arial" w:hAnsi="Arial" w:cs="Arial"/>
+          <w:b/>
+          <w:sz w:val="24"/>
+          <w:szCs w:val="24"/>
+        </w:rPr>
+        <w:t xml:space="preserve">Phpunit.xml: </w:t>
+      </w:r>
+      <w:r>
+        <w:rPr>
+          <w:rFonts w:ascii="Arial" w:hAnsi="Arial" w:cs="Arial"/>
+          <w:sz w:val="24"/>
+          <w:szCs w:val="24"/>
+        </w:rPr>
+        <w:t xml:space="preserve">fichero de configuración de </w:t>
+      </w:r>
+      <w:proofErr w:type="gramStart"/>
+      <w:r>
+        <w:rPr>
+          <w:rFonts w:ascii="Arial" w:hAnsi="Arial" w:cs="Arial"/>
+          <w:sz w:val="24"/>
+          <w:szCs w:val="24"/>
+        </w:rPr>
+        <w:t>los test</w:t>
+      </w:r>
+      <w:proofErr w:type="gramEnd"/>
+      <w:r>
+        <w:rPr>
+          <w:rFonts w:ascii="Arial" w:hAnsi="Arial" w:cs="Arial"/>
+          <w:b/>
+          <w:sz w:val="24"/>
+          <w:szCs w:val="24"/>
+        </w:rPr>
+        <w:t>.</w:t>
+      </w:r>
+    </w:p>
+    <w:p>
+      <w:pPr>
+        <w:pStyle w:val="Prrafodelista"/>
+        <w:numPr>
+          <w:ilvl w:val="0"/>
+          <w:numId w:val="21"/>
+        </w:numPr>
+        <w:jc w:val="both"/>
+        <w:rPr>
+          <w:rFonts w:ascii="Arial" w:hAnsi="Arial" w:cs="Arial"/>
+          <w:b/>
+          <w:sz w:val="24"/>
+          <w:szCs w:val="24"/>
+        </w:rPr>
+      </w:pPr>
+      <w:r>
+        <w:rPr>
+          <w:rFonts w:ascii="Arial" w:hAnsi="Arial" w:cs="Arial"/>
+          <w:b/>
+          <w:sz w:val="24"/>
+          <w:szCs w:val="24"/>
+        </w:rPr>
+        <w:t xml:space="preserve">Fichero </w:t>
+      </w:r>
+      <w:proofErr w:type="spellStart"/>
+      <w:proofErr w:type="gramStart"/>
+      <w:r>
+        <w:rPr>
+          <w:rFonts w:ascii="Arial" w:hAnsi="Arial" w:cs="Arial"/>
+          <w:b/>
+          <w:sz w:val="24"/>
+          <w:szCs w:val="24"/>
+        </w:rPr>
+        <w:t>symfony.lock</w:t>
+      </w:r>
+      <w:proofErr w:type="spellEnd"/>
+      <w:proofErr w:type="gramEnd"/>
+      <w:r>
+        <w:rPr>
+          <w:rFonts w:ascii="Arial" w:hAnsi="Arial" w:cs="Arial"/>
+          <w:b/>
+          <w:sz w:val="24"/>
+          <w:szCs w:val="24"/>
+        </w:rPr>
+        <w:t xml:space="preserve">: </w:t>
+      </w:r>
+      <w:r>
+        <w:rPr>
+          <w:rFonts w:ascii="Arial" w:hAnsi="Arial" w:cs="Arial"/>
+          <w:sz w:val="24"/>
+          <w:szCs w:val="24"/>
+        </w:rPr>
+        <w:t>fichero mantenido</w:t>
+      </w:r>
+      <w:r>
+        <w:rPr>
+          <w:rFonts w:ascii="Arial" w:hAnsi="Arial" w:cs="Arial"/>
+          <w:sz w:val="24"/>
+          <w:szCs w:val="24"/>
+        </w:rPr>
+        <w:t xml:space="preserve"> por </w:t>
+      </w:r>
+      <w:r>
+        <w:rPr>
+          <w:rFonts w:ascii="Arial" w:hAnsi="Arial" w:cs="Arial"/>
+          <w:sz w:val="24"/>
+          <w:szCs w:val="24"/>
+        </w:rPr>
+        <w:t>F</w:t>
+      </w:r>
+      <w:r>
+        <w:rPr>
+          <w:rFonts w:ascii="Arial" w:hAnsi="Arial" w:cs="Arial"/>
+          <w:sz w:val="24"/>
+          <w:szCs w:val="24"/>
+        </w:rPr>
+        <w:t>lex</w:t>
+      </w:r>
+      <w:r>
+        <w:rPr>
+          <w:rFonts w:ascii="Arial" w:hAnsi="Arial" w:cs="Arial"/>
+          <w:sz w:val="24"/>
+          <w:szCs w:val="24"/>
+        </w:rPr>
+        <w:t xml:space="preserve"> donde se guardan las referencias de las “</w:t>
+      </w:r>
+      <w:proofErr w:type="spellStart"/>
+      <w:r>
+        <w:rPr>
+          <w:rFonts w:ascii="Arial" w:hAnsi="Arial" w:cs="Arial"/>
+          <w:sz w:val="24"/>
+          <w:szCs w:val="24"/>
+        </w:rPr>
+        <w:t>Recipes</w:t>
+      </w:r>
+      <w:proofErr w:type="spellEnd"/>
+      <w:r>
+        <w:rPr>
+          <w:rFonts w:ascii="Arial" w:hAnsi="Arial" w:cs="Arial"/>
+          <w:sz w:val="24"/>
+          <w:szCs w:val="24"/>
+        </w:rPr>
+        <w:t>” instaladas.</w:t>
+      </w:r>
+    </w:p>
+    <w:p>
+      <w:pPr>
+        <w:jc w:val="both"/>
+        <w:rPr>
+          <w:rFonts w:ascii="Arial" w:hAnsi="Arial" w:cs="Arial"/>
+          <w:b/>
+          <w:sz w:val="24"/>
+          <w:szCs w:val="24"/>
+        </w:rPr>
+      </w:pPr>
+    </w:p>
+    <w:p>
+      <w:pPr>
+        <w:jc w:val="both"/>
+        <w:rPr>
+          <w:rFonts w:ascii="Arial" w:hAnsi="Arial" w:cs="Arial"/>
+          <w:b/>
+          <w:sz w:val="24"/>
+          <w:szCs w:val="24"/>
+        </w:rPr>
+      </w:pPr>
       <w:bookmarkStart w:id="3" w:name="_GoBack"/>
       <w:bookmarkEnd w:id="3"/>
     </w:p>
@@ -29412,7 +31412,6 @@
         <w:jc w:val="both"/>
         <w:rPr>
           <w:rFonts w:ascii="Arial" w:hAnsi="Arial" w:cs="Arial"/>
-          <w:b/>
           <w:sz w:val="24"/>
           <w:szCs w:val="24"/>
         </w:rPr>
@@ -29527,6 +31526,86 @@
           <w:szCs w:val="24"/>
         </w:rPr>
       </w:pPr>
+    </w:p>
+    <w:p>
+      <w:pPr>
+        <w:jc w:val="both"/>
+        <w:rPr>
+          <w:rFonts w:ascii="Arial" w:hAnsi="Arial" w:cs="Arial"/>
+          <w:sz w:val="24"/>
+          <w:szCs w:val="24"/>
+        </w:rPr>
+      </w:pPr>
+    </w:p>
+    <w:p>
+      <w:pPr>
+        <w:jc w:val="both"/>
+        <w:rPr>
+          <w:rFonts w:ascii="Arial" w:hAnsi="Arial" w:cs="Arial"/>
+          <w:sz w:val="24"/>
+          <w:szCs w:val="24"/>
+        </w:rPr>
+      </w:pPr>
+    </w:p>
+    <w:p>
+      <w:pPr>
+        <w:jc w:val="both"/>
+        <w:rPr>
+          <w:rFonts w:ascii="Arial" w:hAnsi="Arial" w:cs="Arial"/>
+          <w:sz w:val="24"/>
+          <w:szCs w:val="24"/>
+        </w:rPr>
+      </w:pPr>
+    </w:p>
+    <w:p>
+      <w:pPr>
+        <w:jc w:val="both"/>
+        <w:rPr>
+          <w:rFonts w:ascii="Arial" w:hAnsi="Arial" w:cs="Arial"/>
+          <w:sz w:val="24"/>
+          <w:szCs w:val="24"/>
+        </w:rPr>
+      </w:pPr>
+    </w:p>
+    <w:p>
+      <w:pPr>
+        <w:jc w:val="both"/>
+        <w:rPr>
+          <w:rFonts w:ascii="Arial" w:hAnsi="Arial" w:cs="Arial"/>
+          <w:sz w:val="24"/>
+          <w:szCs w:val="24"/>
+        </w:rPr>
+      </w:pPr>
+    </w:p>
+    <w:p>
+      <w:pPr>
+        <w:jc w:val="both"/>
+        <w:rPr>
+          <w:rFonts w:ascii="Arial" w:hAnsi="Arial" w:cs="Arial"/>
+          <w:sz w:val="24"/>
+          <w:szCs w:val="24"/>
+        </w:rPr>
+      </w:pPr>
+    </w:p>
+    <w:p>
+      <w:pPr>
+        <w:jc w:val="both"/>
+        <w:rPr>
+          <w:rFonts w:ascii="Arial" w:hAnsi="Arial" w:cs="Arial"/>
+          <w:sz w:val="24"/>
+          <w:szCs w:val="24"/>
+        </w:rPr>
+      </w:pPr>
+    </w:p>
+    <w:p>
+      <w:pPr>
+        <w:jc w:val="both"/>
+        <w:rPr>
+          <w:rFonts w:ascii="Arial" w:hAnsi="Arial" w:cs="Arial"/>
+          <w:sz w:val="24"/>
+          <w:szCs w:val="24"/>
+        </w:rPr>
+      </w:pPr>
       <w:r>
         <w:rPr>
           <w:rFonts w:ascii="Arial" w:hAnsi="Arial" w:cs="Arial"/>
@@ -29751,7 +31830,7 @@
         </w:rPr>
         <w:t xml:space="preserve">Protocolo http: </w:t>
       </w:r>
-      <w:hyperlink r:id="rId26" w:history="1">
+      <w:hyperlink r:id="rId28" w:history="1">
         <w:r>
           <w:rPr>
             <w:rStyle w:val="Hipervnculo"/>
@@ -29772,7 +31851,7 @@
           <w:szCs w:val="24"/>
         </w:rPr>
       </w:pPr>
-      <w:hyperlink r:id="rId27" w:history="1">
+      <w:hyperlink r:id="rId29" w:history="1">
         <w:r>
           <w:rPr>
             <w:rStyle w:val="Hipervnculo"/>
@@ -29793,7 +31872,7 @@
           <w:szCs w:val="24"/>
         </w:rPr>
       </w:pPr>
-      <w:hyperlink r:id="rId28" w:history="1">
+      <w:hyperlink r:id="rId30" w:history="1">
         <w:r>
           <w:rPr>
             <w:rStyle w:val="Hipervnculo"/>
@@ -29814,7 +31893,7 @@
           <w:szCs w:val="24"/>
         </w:rPr>
       </w:pPr>
-      <w:hyperlink r:id="rId29" w:history="1">
+      <w:hyperlink r:id="rId31" w:history="1">
         <w:r>
           <w:rPr>
             <w:rStyle w:val="Hipervnculo"/>
@@ -29835,7 +31914,7 @@
           <w:szCs w:val="24"/>
         </w:rPr>
       </w:pPr>
-      <w:hyperlink r:id="rId30" w:history="1">
+      <w:hyperlink r:id="rId32" w:history="1">
         <w:r>
           <w:rPr>
             <w:rStyle w:val="Hipervnculo"/>
@@ -29856,7 +31935,7 @@
           <w:szCs w:val="24"/>
         </w:rPr>
       </w:pPr>
-      <w:hyperlink r:id="rId31" w:history="1">
+      <w:hyperlink r:id="rId33" w:history="1">
         <w:r>
           <w:rPr>
             <w:rStyle w:val="Hipervnculo"/>
@@ -29877,7 +31956,7 @@
           <w:szCs w:val="24"/>
         </w:rPr>
       </w:pPr>
-      <w:hyperlink r:id="rId32" w:history="1">
+      <w:hyperlink r:id="rId34" w:history="1">
         <w:r>
           <w:rPr>
             <w:rStyle w:val="Hipervnculo"/>
@@ -29899,7 +31978,7 @@
           <w:szCs w:val="24"/>
         </w:rPr>
       </w:pPr>
-      <w:hyperlink r:id="rId33" w:history="1">
+      <w:hyperlink r:id="rId35" w:history="1">
         <w:r>
           <w:rPr>
             <w:rStyle w:val="Hipervnculo"/>
@@ -29918,7 +31997,7 @@
           <w:rStyle w:val="Hipervnculo"/>
         </w:rPr>
       </w:pPr>
-      <w:hyperlink r:id="rId34" w:history="1">
+      <w:hyperlink r:id="rId36" w:history="1">
         <w:r>
           <w:rPr>
             <w:rStyle w:val="Hipervnculo"/>
@@ -29941,7 +32020,7 @@
         <w:pStyle w:val="Sinespaciado"/>
         <w:jc w:val="both"/>
       </w:pPr>
-      <w:hyperlink r:id="rId35" w:history="1">
+      <w:hyperlink r:id="rId37" w:history="1">
         <w:r>
           <w:rPr>
             <w:rStyle w:val="Hipervnculo"/>
@@ -29964,7 +32043,7 @@
         <w:pStyle w:val="Sinespaciado"/>
         <w:jc w:val="both"/>
       </w:pPr>
-      <w:hyperlink r:id="rId36" w:history="1">
+      <w:hyperlink r:id="rId38" w:history="1">
         <w:r>
           <w:rPr>
             <w:rStyle w:val="Hipervnculo"/>
@@ -29989,7 +32068,7 @@
         <w:pStyle w:val="Sinespaciado"/>
         <w:jc w:val="both"/>
       </w:pPr>
-      <w:hyperlink r:id="rId37" w:anchor="principio_de_segregacion_de_la_interfaz" w:history="1">
+      <w:hyperlink r:id="rId39" w:anchor="principio_de_segregacion_de_la_interfaz" w:history="1">
         <w:r>
           <w:rPr>
             <w:rStyle w:val="Hipervnculo"/>
@@ -30003,7 +32082,7 @@
         <w:pStyle w:val="Sinespaciado"/>
         <w:jc w:val="both"/>
       </w:pPr>
-      <w:hyperlink r:id="rId38" w:history="1">
+      <w:hyperlink r:id="rId40" w:history="1">
         <w:r>
           <w:rPr>
             <w:rStyle w:val="Hipervnculo"/>
@@ -30521,7 +32600,7 @@
           <w:lang w:val="en-US"/>
         </w:rPr>
       </w:pPr>
-      <w:hyperlink r:id="rId39" w:history="1">
+      <w:hyperlink r:id="rId41" w:history="1">
         <w:r>
           <w:rPr>
             <w:rStyle w:val="Hipervnculo"/>
@@ -30557,7 +32636,7 @@
           <w:lang w:val="en-US"/>
         </w:rPr>
       </w:pPr>
-      <w:hyperlink r:id="rId40" w:history="1">
+      <w:hyperlink r:id="rId42" w:history="1">
         <w:r>
           <w:rPr>
             <w:rStyle w:val="Hipervnculo"/>
@@ -30928,16 +33007,16 @@
     </w:lvl>
   </w:abstractNum>
   <w:abstractNum w:abstractNumId="2" w15:restartNumberingAfterBreak="0">
-    <w:nsid w:val="190C142F"/>
+    <w:nsid w:val="16462708"/>
     <w:multiLevelType w:val="hybridMultilevel"/>
-    <w:tmpl w:val="A8426204"/>
+    <w:tmpl w:val="0DD88C46"/>
     <w:lvl w:ilvl="0" w:tplc="0C0A0001">
       <w:start w:val="1"/>
       <w:numFmt w:val="bullet"/>
       <w:lvlText w:val=""/>
       <w:lvlJc w:val="left"/>
       <w:pPr>
-        <w:ind w:left="720" w:hanging="360"/>
+        <w:ind w:left="1440" w:hanging="360"/>
       </w:pPr>
       <w:rPr>
         <w:rFonts w:ascii="Symbol" w:hAnsi="Symbol" w:hint="default"/>
@@ -30949,7 +33028,7 @@
       <w:lvlText w:val="o"/>
       <w:lvlJc w:val="left"/>
       <w:pPr>
-        <w:ind w:left="1440" w:hanging="360"/>
+        <w:ind w:left="2160" w:hanging="360"/>
       </w:pPr>
       <w:rPr>
         <w:rFonts w:ascii="Courier New" w:hAnsi="Courier New" w:cs="Courier New" w:hint="default"/>
@@ -30961,7 +33040,7 @@
       <w:lvlText w:val=""/>
       <w:lvlJc w:val="left"/>
       <w:pPr>
-        <w:ind w:left="2160" w:hanging="360"/>
+        <w:ind w:left="2880" w:hanging="360"/>
       </w:pPr>
       <w:rPr>
         <w:rFonts w:ascii="Wingdings" w:hAnsi="Wingdings" w:hint="default"/>
@@ -30973,7 +33052,7 @@
       <w:lvlText w:val=""/>
       <w:lvlJc w:val="left"/>
       <w:pPr>
-        <w:ind w:left="2880" w:hanging="360"/>
+        <w:ind w:left="3600" w:hanging="360"/>
       </w:pPr>
       <w:rPr>
         <w:rFonts w:ascii="Symbol" w:hAnsi="Symbol" w:hint="default"/>
@@ -30985,7 +33064,7 @@
       <w:lvlText w:val="o"/>
       <w:lvlJc w:val="left"/>
       <w:pPr>
-        <w:ind w:left="3600" w:hanging="360"/>
+        <w:ind w:left="4320" w:hanging="360"/>
       </w:pPr>
       <w:rPr>
         <w:rFonts w:ascii="Courier New" w:hAnsi="Courier New" w:cs="Courier New" w:hint="default"/>
@@ -30997,7 +33076,7 @@
       <w:lvlText w:val=""/>
       <w:lvlJc w:val="left"/>
       <w:pPr>
-        <w:ind w:left="4320" w:hanging="360"/>
+        <w:ind w:left="5040" w:hanging="360"/>
       </w:pPr>
       <w:rPr>
         <w:rFonts w:ascii="Wingdings" w:hAnsi="Wingdings" w:hint="default"/>
@@ -31009,7 +33088,7 @@
       <w:lvlText w:val=""/>
       <w:lvlJc w:val="left"/>
       <w:pPr>
-        <w:ind w:left="5040" w:hanging="360"/>
+        <w:ind w:left="5760" w:hanging="360"/>
       </w:pPr>
       <w:rPr>
         <w:rFonts w:ascii="Symbol" w:hAnsi="Symbol" w:hint="default"/>
@@ -31021,7 +33100,7 @@
       <w:lvlText w:val="o"/>
       <w:lvlJc w:val="left"/>
       <w:pPr>
-        <w:ind w:left="5760" w:hanging="360"/>
+        <w:ind w:left="6480" w:hanging="360"/>
       </w:pPr>
       <w:rPr>
         <w:rFonts w:ascii="Courier New" w:hAnsi="Courier New" w:cs="Courier New" w:hint="default"/>
@@ -31033,7 +33112,7 @@
       <w:lvlText w:val=""/>
       <w:lvlJc w:val="left"/>
       <w:pPr>
-        <w:ind w:left="6480" w:hanging="360"/>
+        <w:ind w:left="7200" w:hanging="360"/>
       </w:pPr>
       <w:rPr>
         <w:rFonts w:ascii="Wingdings" w:hAnsi="Wingdings" w:hint="default"/>
@@ -31041,6 +33120,119 @@
     </w:lvl>
   </w:abstractNum>
   <w:abstractNum w:abstractNumId="3" w15:restartNumberingAfterBreak="0">
+    <w:nsid w:val="190C142F"/>
+    <w:multiLevelType w:val="hybridMultilevel"/>
+    <w:tmpl w:val="A8426204"/>
+    <w:lvl w:ilvl="0" w:tplc="0C0A0001">
+      <w:start w:val="1"/>
+      <w:numFmt w:val="bullet"/>
+      <w:lvlText w:val=""/>
+      <w:lvlJc w:val="left"/>
+      <w:pPr>
+        <w:ind w:left="720" w:hanging="360"/>
+      </w:pPr>
+      <w:rPr>
+        <w:rFonts w:ascii="Symbol" w:hAnsi="Symbol" w:hint="default"/>
+      </w:rPr>
+    </w:lvl>
+    <w:lvl w:ilvl="1" w:tplc="0C0A0003" w:tentative="1">
+      <w:start w:val="1"/>
+      <w:numFmt w:val="bullet"/>
+      <w:lvlText w:val="o"/>
+      <w:lvlJc w:val="left"/>
+      <w:pPr>
+        <w:ind w:left="1440" w:hanging="360"/>
+      </w:pPr>
+      <w:rPr>
+        <w:rFonts w:ascii="Courier New" w:hAnsi="Courier New" w:cs="Courier New" w:hint="default"/>
+      </w:rPr>
+    </w:lvl>
+    <w:lvl w:ilvl="2" w:tplc="0C0A0005" w:tentative="1">
+      <w:start w:val="1"/>
+      <w:numFmt w:val="bullet"/>
+      <w:lvlText w:val=""/>
+      <w:lvlJc w:val="left"/>
+      <w:pPr>
+        <w:ind w:left="2160" w:hanging="360"/>
+      </w:pPr>
+      <w:rPr>
+        <w:rFonts w:ascii="Wingdings" w:hAnsi="Wingdings" w:hint="default"/>
+      </w:rPr>
+    </w:lvl>
+    <w:lvl w:ilvl="3" w:tplc="0C0A0001" w:tentative="1">
+      <w:start w:val="1"/>
+      <w:numFmt w:val="bullet"/>
+      <w:lvlText w:val=""/>
+      <w:lvlJc w:val="left"/>
+      <w:pPr>
+        <w:ind w:left="2880" w:hanging="360"/>
+      </w:pPr>
+      <w:rPr>
+        <w:rFonts w:ascii="Symbol" w:hAnsi="Symbol" w:hint="default"/>
+      </w:rPr>
+    </w:lvl>
+    <w:lvl w:ilvl="4" w:tplc="0C0A0003" w:tentative="1">
+      <w:start w:val="1"/>
+      <w:numFmt w:val="bullet"/>
+      <w:lvlText w:val="o"/>
+      <w:lvlJc w:val="left"/>
+      <w:pPr>
+        <w:ind w:left="3600" w:hanging="360"/>
+      </w:pPr>
+      <w:rPr>
+        <w:rFonts w:ascii="Courier New" w:hAnsi="Courier New" w:cs="Courier New" w:hint="default"/>
+      </w:rPr>
+    </w:lvl>
+    <w:lvl w:ilvl="5" w:tplc="0C0A0005" w:tentative="1">
+      <w:start w:val="1"/>
+      <w:numFmt w:val="bullet"/>
+      <w:lvlText w:val=""/>
+      <w:lvlJc w:val="left"/>
+      <w:pPr>
+        <w:ind w:left="4320" w:hanging="360"/>
+      </w:pPr>
+      <w:rPr>
+        <w:rFonts w:ascii="Wingdings" w:hAnsi="Wingdings" w:hint="default"/>
+      </w:rPr>
+    </w:lvl>
+    <w:lvl w:ilvl="6" w:tplc="0C0A0001" w:tentative="1">
+      <w:start w:val="1"/>
+      <w:numFmt w:val="bullet"/>
+      <w:lvlText w:val=""/>
+      <w:lvlJc w:val="left"/>
+      <w:pPr>
+        <w:ind w:left="5040" w:hanging="360"/>
+      </w:pPr>
+      <w:rPr>
+        <w:rFonts w:ascii="Symbol" w:hAnsi="Symbol" w:hint="default"/>
+      </w:rPr>
+    </w:lvl>
+    <w:lvl w:ilvl="7" w:tplc="0C0A0003" w:tentative="1">
+      <w:start w:val="1"/>
+      <w:numFmt w:val="bullet"/>
+      <w:lvlText w:val="o"/>
+      <w:lvlJc w:val="left"/>
+      <w:pPr>
+        <w:ind w:left="5760" w:hanging="360"/>
+      </w:pPr>
+      <w:rPr>
+        <w:rFonts w:ascii="Courier New" w:hAnsi="Courier New" w:cs="Courier New" w:hint="default"/>
+      </w:rPr>
+    </w:lvl>
+    <w:lvl w:ilvl="8" w:tplc="0C0A0005" w:tentative="1">
+      <w:start w:val="1"/>
+      <w:numFmt w:val="bullet"/>
+      <w:lvlText w:val=""/>
+      <w:lvlJc w:val="left"/>
+      <w:pPr>
+        <w:ind w:left="6480" w:hanging="360"/>
+      </w:pPr>
+      <w:rPr>
+        <w:rFonts w:ascii="Wingdings" w:hAnsi="Wingdings" w:hint="default"/>
+      </w:rPr>
+    </w:lvl>
+  </w:abstractNum>
+  <w:abstractNum w:abstractNumId="4" w15:restartNumberingAfterBreak="0">
     <w:nsid w:val="213070A2"/>
     <w:multiLevelType w:val="hybridMultilevel"/>
     <w:tmpl w:val="D94CB354"/>
@@ -31152,10 +33344,10 @@
       </w:rPr>
     </w:lvl>
   </w:abstractNum>
-  <w:abstractNum w:abstractNumId="4" w15:restartNumberingAfterBreak="0">
-    <w:nsid w:val="26275B73"/>
+  <w:abstractNum w:abstractNumId="5" w15:restartNumberingAfterBreak="0">
+    <w:nsid w:val="21D804D7"/>
     <w:multiLevelType w:val="hybridMultilevel"/>
-    <w:tmpl w:val="D00E4BEC"/>
+    <w:tmpl w:val="A0E4EFDC"/>
     <w:lvl w:ilvl="0" w:tplc="0C0A0001">
       <w:start w:val="1"/>
       <w:numFmt w:val="bullet"/>
@@ -31265,7 +33457,120 @@
       </w:rPr>
     </w:lvl>
   </w:abstractNum>
-  <w:abstractNum w:abstractNumId="5" w15:restartNumberingAfterBreak="0">
+  <w:abstractNum w:abstractNumId="6" w15:restartNumberingAfterBreak="0">
+    <w:nsid w:val="26275B73"/>
+    <w:multiLevelType w:val="hybridMultilevel"/>
+    <w:tmpl w:val="D00E4BEC"/>
+    <w:lvl w:ilvl="0" w:tplc="0C0A0001">
+      <w:start w:val="1"/>
+      <w:numFmt w:val="bullet"/>
+      <w:lvlText w:val=""/>
+      <w:lvlJc w:val="left"/>
+      <w:pPr>
+        <w:ind w:left="720" w:hanging="360"/>
+      </w:pPr>
+      <w:rPr>
+        <w:rFonts w:ascii="Symbol" w:hAnsi="Symbol" w:hint="default"/>
+      </w:rPr>
+    </w:lvl>
+    <w:lvl w:ilvl="1" w:tplc="0C0A0003" w:tentative="1">
+      <w:start w:val="1"/>
+      <w:numFmt w:val="bullet"/>
+      <w:lvlText w:val="o"/>
+      <w:lvlJc w:val="left"/>
+      <w:pPr>
+        <w:ind w:left="1440" w:hanging="360"/>
+      </w:pPr>
+      <w:rPr>
+        <w:rFonts w:ascii="Courier New" w:hAnsi="Courier New" w:cs="Courier New" w:hint="default"/>
+      </w:rPr>
+    </w:lvl>
+    <w:lvl w:ilvl="2" w:tplc="0C0A0005" w:tentative="1">
+      <w:start w:val="1"/>
+      <w:numFmt w:val="bullet"/>
+      <w:lvlText w:val=""/>
+      <w:lvlJc w:val="left"/>
+      <w:pPr>
+        <w:ind w:left="2160" w:hanging="360"/>
+      </w:pPr>
+      <w:rPr>
+        <w:rFonts w:ascii="Wingdings" w:hAnsi="Wingdings" w:hint="default"/>
+      </w:rPr>
+    </w:lvl>
+    <w:lvl w:ilvl="3" w:tplc="0C0A0001" w:tentative="1">
+      <w:start w:val="1"/>
+      <w:numFmt w:val="bullet"/>
+      <w:lvlText w:val=""/>
+      <w:lvlJc w:val="left"/>
+      <w:pPr>
+        <w:ind w:left="2880" w:hanging="360"/>
+      </w:pPr>
+      <w:rPr>
+        <w:rFonts w:ascii="Symbol" w:hAnsi="Symbol" w:hint="default"/>
+      </w:rPr>
+    </w:lvl>
+    <w:lvl w:ilvl="4" w:tplc="0C0A0003" w:tentative="1">
+      <w:start w:val="1"/>
+      <w:numFmt w:val="bullet"/>
+      <w:lvlText w:val="o"/>
+      <w:lvlJc w:val="left"/>
+      <w:pPr>
+        <w:ind w:left="3600" w:hanging="360"/>
+      </w:pPr>
+      <w:rPr>
+        <w:rFonts w:ascii="Courier New" w:hAnsi="Courier New" w:cs="Courier New" w:hint="default"/>
+      </w:rPr>
+    </w:lvl>
+    <w:lvl w:ilvl="5" w:tplc="0C0A0005" w:tentative="1">
+      <w:start w:val="1"/>
+      <w:numFmt w:val="bullet"/>
+      <w:lvlText w:val=""/>
+      <w:lvlJc w:val="left"/>
+      <w:pPr>
+        <w:ind w:left="4320" w:hanging="360"/>
+      </w:pPr>
+      <w:rPr>
+        <w:rFonts w:ascii="Wingdings" w:hAnsi="Wingdings" w:hint="default"/>
+      </w:rPr>
+    </w:lvl>
+    <w:lvl w:ilvl="6" w:tplc="0C0A0001" w:tentative="1">
+      <w:start w:val="1"/>
+      <w:numFmt w:val="bullet"/>
+      <w:lvlText w:val=""/>
+      <w:lvlJc w:val="left"/>
+      <w:pPr>
+        <w:ind w:left="5040" w:hanging="360"/>
+      </w:pPr>
+      <w:rPr>
+        <w:rFonts w:ascii="Symbol" w:hAnsi="Symbol" w:hint="default"/>
+      </w:rPr>
+    </w:lvl>
+    <w:lvl w:ilvl="7" w:tplc="0C0A0003" w:tentative="1">
+      <w:start w:val="1"/>
+      <w:numFmt w:val="bullet"/>
+      <w:lvlText w:val="o"/>
+      <w:lvlJc w:val="left"/>
+      <w:pPr>
+        <w:ind w:left="5760" w:hanging="360"/>
+      </w:pPr>
+      <w:rPr>
+        <w:rFonts w:ascii="Courier New" w:hAnsi="Courier New" w:cs="Courier New" w:hint="default"/>
+      </w:rPr>
+    </w:lvl>
+    <w:lvl w:ilvl="8" w:tplc="0C0A0005" w:tentative="1">
+      <w:start w:val="1"/>
+      <w:numFmt w:val="bullet"/>
+      <w:lvlText w:val=""/>
+      <w:lvlJc w:val="left"/>
+      <w:pPr>
+        <w:ind w:left="6480" w:hanging="360"/>
+      </w:pPr>
+      <w:rPr>
+        <w:rFonts w:ascii="Wingdings" w:hAnsi="Wingdings" w:hint="default"/>
+      </w:rPr>
+    </w:lvl>
+  </w:abstractNum>
+  <w:abstractNum w:abstractNumId="7" w15:restartNumberingAfterBreak="0">
     <w:nsid w:val="2E826B23"/>
     <w:multiLevelType w:val="hybridMultilevel"/>
     <w:tmpl w:val="C3F652C2"/>
@@ -31377,10 +33682,10 @@
       </w:rPr>
     </w:lvl>
   </w:abstractNum>
-  <w:abstractNum w:abstractNumId="6" w15:restartNumberingAfterBreak="0">
+  <w:abstractNum w:abstractNumId="8" w15:restartNumberingAfterBreak="0">
     <w:nsid w:val="3DAC35F1"/>
     <w:multiLevelType w:val="hybridMultilevel"/>
-    <w:tmpl w:val="41827E00"/>
+    <w:tmpl w:val="2FAAE286"/>
     <w:lvl w:ilvl="0" w:tplc="A72818EA">
       <w:start w:val="1"/>
       <w:numFmt w:val="bullet"/>
@@ -31490,7 +33795,7 @@
       </w:rPr>
     </w:lvl>
   </w:abstractNum>
-  <w:abstractNum w:abstractNumId="7" w15:restartNumberingAfterBreak="0">
+  <w:abstractNum w:abstractNumId="9" w15:restartNumberingAfterBreak="0">
     <w:nsid w:val="43B70A51"/>
     <w:multiLevelType w:val="hybridMultilevel"/>
     <w:tmpl w:val="2584BAD8"/>
@@ -31576,7 +33881,7 @@
       </w:pPr>
     </w:lvl>
   </w:abstractNum>
-  <w:abstractNum w:abstractNumId="8" w15:restartNumberingAfterBreak="0">
+  <w:abstractNum w:abstractNumId="10" w15:restartNumberingAfterBreak="0">
     <w:nsid w:val="461E342F"/>
     <w:multiLevelType w:val="hybridMultilevel"/>
     <w:tmpl w:val="43A806E2"/>
@@ -31662,7 +33967,7 @@
       </w:pPr>
     </w:lvl>
   </w:abstractNum>
-  <w:abstractNum w:abstractNumId="9" w15:restartNumberingAfterBreak="0">
+  <w:abstractNum w:abstractNumId="11" w15:restartNumberingAfterBreak="0">
     <w:nsid w:val="4BF00BB2"/>
     <w:multiLevelType w:val="hybridMultilevel"/>
     <w:tmpl w:val="C2409FEE"/>
@@ -31748,7 +34053,7 @@
       </w:pPr>
     </w:lvl>
   </w:abstractNum>
-  <w:abstractNum w:abstractNumId="10" w15:restartNumberingAfterBreak="0">
+  <w:abstractNum w:abstractNumId="12" w15:restartNumberingAfterBreak="0">
     <w:nsid w:val="4DA62E4E"/>
     <w:multiLevelType w:val="hybridMultilevel"/>
     <w:tmpl w:val="3F842786"/>
@@ -31837,7 +34142,7 @@
       </w:pPr>
     </w:lvl>
   </w:abstractNum>
-  <w:abstractNum w:abstractNumId="11" w15:restartNumberingAfterBreak="0">
+  <w:abstractNum w:abstractNumId="13" w15:restartNumberingAfterBreak="0">
     <w:nsid w:val="4F0828F3"/>
     <w:multiLevelType w:val="hybridMultilevel"/>
     <w:tmpl w:val="7714CA7C"/>
@@ -31927,7 +34232,7 @@
       </w:pPr>
     </w:lvl>
   </w:abstractNum>
-  <w:abstractNum w:abstractNumId="12" w15:restartNumberingAfterBreak="0">
+  <w:abstractNum w:abstractNumId="14" w15:restartNumberingAfterBreak="0">
     <w:nsid w:val="56FB2B8D"/>
     <w:multiLevelType w:val="hybridMultilevel"/>
     <w:tmpl w:val="37229D86"/>
@@ -32016,7 +34321,7 @@
       </w:pPr>
     </w:lvl>
   </w:abstractNum>
-  <w:abstractNum w:abstractNumId="13" w15:restartNumberingAfterBreak="0">
+  <w:abstractNum w:abstractNumId="15" w15:restartNumberingAfterBreak="0">
     <w:nsid w:val="58D24700"/>
     <w:multiLevelType w:val="hybridMultilevel"/>
     <w:tmpl w:val="DC7894CE"/>
@@ -32105,7 +34410,7 @@
       </w:pPr>
     </w:lvl>
   </w:abstractNum>
-  <w:abstractNum w:abstractNumId="14" w15:restartNumberingAfterBreak="0">
+  <w:abstractNum w:abstractNumId="16" w15:restartNumberingAfterBreak="0">
     <w:nsid w:val="5FED6059"/>
     <w:multiLevelType w:val="hybridMultilevel"/>
     <w:tmpl w:val="3B548248"/>
@@ -32194,7 +34499,120 @@
       </w:pPr>
     </w:lvl>
   </w:abstractNum>
-  <w:abstractNum w:abstractNumId="15" w15:restartNumberingAfterBreak="0">
+  <w:abstractNum w:abstractNumId="17" w15:restartNumberingAfterBreak="0">
+    <w:nsid w:val="66E5288A"/>
+    <w:multiLevelType w:val="hybridMultilevel"/>
+    <w:tmpl w:val="977C1712"/>
+    <w:lvl w:ilvl="0" w:tplc="0C0A0001">
+      <w:start w:val="1"/>
+      <w:numFmt w:val="bullet"/>
+      <w:lvlText w:val=""/>
+      <w:lvlJc w:val="left"/>
+      <w:pPr>
+        <w:ind w:left="720" w:hanging="360"/>
+      </w:pPr>
+      <w:rPr>
+        <w:rFonts w:ascii="Symbol" w:hAnsi="Symbol" w:hint="default"/>
+      </w:rPr>
+    </w:lvl>
+    <w:lvl w:ilvl="1" w:tplc="0C0A0003" w:tentative="1">
+      <w:start w:val="1"/>
+      <w:numFmt w:val="bullet"/>
+      <w:lvlText w:val="o"/>
+      <w:lvlJc w:val="left"/>
+      <w:pPr>
+        <w:ind w:left="1440" w:hanging="360"/>
+      </w:pPr>
+      <w:rPr>
+        <w:rFonts w:ascii="Courier New" w:hAnsi="Courier New" w:cs="Courier New" w:hint="default"/>
+      </w:rPr>
+    </w:lvl>
+    <w:lvl w:ilvl="2" w:tplc="0C0A0005" w:tentative="1">
+      <w:start w:val="1"/>
+      <w:numFmt w:val="bullet"/>
+      <w:lvlText w:val=""/>
+      <w:lvlJc w:val="left"/>
+      <w:pPr>
+        <w:ind w:left="2160" w:hanging="360"/>
+      </w:pPr>
+      <w:rPr>
+        <w:rFonts w:ascii="Wingdings" w:hAnsi="Wingdings" w:hint="default"/>
+      </w:rPr>
+    </w:lvl>
+    <w:lvl w:ilvl="3" w:tplc="0C0A0001" w:tentative="1">
+      <w:start w:val="1"/>
+      <w:numFmt w:val="bullet"/>
+      <w:lvlText w:val=""/>
+      <w:lvlJc w:val="left"/>
+      <w:pPr>
+        <w:ind w:left="2880" w:hanging="360"/>
+      </w:pPr>
+      <w:rPr>
+        <w:rFonts w:ascii="Symbol" w:hAnsi="Symbol" w:hint="default"/>
+      </w:rPr>
+    </w:lvl>
+    <w:lvl w:ilvl="4" w:tplc="0C0A0003" w:tentative="1">
+      <w:start w:val="1"/>
+      <w:numFmt w:val="bullet"/>
+      <w:lvlText w:val="o"/>
+      <w:lvlJc w:val="left"/>
+      <w:pPr>
+        <w:ind w:left="3600" w:hanging="360"/>
+      </w:pPr>
+      <w:rPr>
+        <w:rFonts w:ascii="Courier New" w:hAnsi="Courier New" w:cs="Courier New" w:hint="default"/>
+      </w:rPr>
+    </w:lvl>
+    <w:lvl w:ilvl="5" w:tplc="0C0A0005" w:tentative="1">
+      <w:start w:val="1"/>
+      <w:numFmt w:val="bullet"/>
+      <w:lvlText w:val=""/>
+      <w:lvlJc w:val="left"/>
+      <w:pPr>
+        <w:ind w:left="4320" w:hanging="360"/>
+      </w:pPr>
+      <w:rPr>
+        <w:rFonts w:ascii="Wingdings" w:hAnsi="Wingdings" w:hint="default"/>
+      </w:rPr>
+    </w:lvl>
+    <w:lvl w:ilvl="6" w:tplc="0C0A0001" w:tentative="1">
+      <w:start w:val="1"/>
+      <w:numFmt w:val="bullet"/>
+      <w:lvlText w:val=""/>
+      <w:lvlJc w:val="left"/>
+      <w:pPr>
+        <w:ind w:left="5040" w:hanging="360"/>
+      </w:pPr>
+      <w:rPr>
+        <w:rFonts w:ascii="Symbol" w:hAnsi="Symbol" w:hint="default"/>
+      </w:rPr>
+    </w:lvl>
+    <w:lvl w:ilvl="7" w:tplc="0C0A0003" w:tentative="1">
+      <w:start w:val="1"/>
+      <w:numFmt w:val="bullet"/>
+      <w:lvlText w:val="o"/>
+      <w:lvlJc w:val="left"/>
+      <w:pPr>
+        <w:ind w:left="5760" w:hanging="360"/>
+      </w:pPr>
+      <w:rPr>
+        <w:rFonts w:ascii="Courier New" w:hAnsi="Courier New" w:cs="Courier New" w:hint="default"/>
+      </w:rPr>
+    </w:lvl>
+    <w:lvl w:ilvl="8" w:tplc="0C0A0005" w:tentative="1">
+      <w:start w:val="1"/>
+      <w:numFmt w:val="bullet"/>
+      <w:lvlText w:val=""/>
+      <w:lvlJc w:val="left"/>
+      <w:pPr>
+        <w:ind w:left="6480" w:hanging="360"/>
+      </w:pPr>
+      <w:rPr>
+        <w:rFonts w:ascii="Wingdings" w:hAnsi="Wingdings" w:hint="default"/>
+      </w:rPr>
+    </w:lvl>
+  </w:abstractNum>
+  <w:abstractNum w:abstractNumId="18" w15:restartNumberingAfterBreak="0">
     <w:nsid w:val="6CEE3F47"/>
     <w:multiLevelType w:val="hybridMultilevel"/>
     <w:tmpl w:val="79566264"/>
@@ -32283,7 +34701,7 @@
       </w:pPr>
     </w:lvl>
   </w:abstractNum>
-  <w:abstractNum w:abstractNumId="16" w15:restartNumberingAfterBreak="0">
+  <w:abstractNum w:abstractNumId="19" w15:restartNumberingAfterBreak="0">
     <w:nsid w:val="73A84A2A"/>
     <w:multiLevelType w:val="hybridMultilevel"/>
     <w:tmpl w:val="5FFC9FA0"/>
@@ -32372,7 +34790,7 @@
       </w:pPr>
     </w:lvl>
   </w:abstractNum>
-  <w:abstractNum w:abstractNumId="17" w15:restartNumberingAfterBreak="0">
+  <w:abstractNum w:abstractNumId="20" w15:restartNumberingAfterBreak="0">
     <w:nsid w:val="778A4AD1"/>
     <w:multiLevelType w:val="hybridMultilevel"/>
     <w:tmpl w:val="5E3ECC78"/>
@@ -32462,58 +34880,67 @@
     </w:lvl>
   </w:abstractNum>
   <w:num w:numId="1">
-    <w:abstractNumId w:val="11"/>
+    <w:abstractNumId w:val="13"/>
   </w:num>
   <w:num w:numId="2">
-    <w:abstractNumId w:val="2"/>
+    <w:abstractNumId w:val="3"/>
   </w:num>
   <w:num w:numId="3">
-    <w:abstractNumId w:val="3"/>
+    <w:abstractNumId w:val="4"/>
   </w:num>
   <w:num w:numId="4">
-    <w:abstractNumId w:val="5"/>
+    <w:abstractNumId w:val="7"/>
   </w:num>
   <w:num w:numId="5">
-    <w:abstractNumId w:val="8"/>
+    <w:abstractNumId w:val="10"/>
   </w:num>
   <w:num w:numId="6">
-    <w:abstractNumId w:val="9"/>
+    <w:abstractNumId w:val="11"/>
   </w:num>
   <w:num w:numId="7">
     <w:abstractNumId w:val="0"/>
   </w:num>
   <w:num w:numId="8">
-    <w:abstractNumId w:val="7"/>
+    <w:abstractNumId w:val="9"/>
   </w:num>
   <w:num w:numId="9">
-    <w:abstractNumId w:val="10"/>
+    <w:abstractNumId w:val="12"/>
   </w:num>
   <w:num w:numId="10">
-    <w:abstractNumId w:val="13"/>
+    <w:abstractNumId w:val="15"/>
   </w:num>
   <w:num w:numId="11">
-    <w:abstractNumId w:val="15"/>
+    <w:abstractNumId w:val="18"/>
   </w:num>
   <w:num w:numId="12">
+    <w:abstractNumId w:val="16"/>
+  </w:num>
+  <w:num w:numId="13">
     <w:abstractNumId w:val="14"/>
   </w:num>
-  <w:num w:numId="13">
-    <w:abstractNumId w:val="12"/>
-  </w:num>
   <w:num w:numId="14">
-    <w:abstractNumId w:val="17"/>
+    <w:abstractNumId w:val="20"/>
   </w:num>
   <w:num w:numId="15">
-    <w:abstractNumId w:val="16"/>
+    <w:abstractNumId w:val="19"/>
   </w:num>
   <w:num w:numId="16">
-    <w:abstractNumId w:val="4"/>
+    <w:abstractNumId w:val="6"/>
   </w:num>
   <w:num w:numId="17">
     <w:abstractNumId w:val="1"/>
   </w:num>
   <w:num w:numId="18">
-    <w:abstractNumId w:val="6"/>
+    <w:abstractNumId w:val="8"/>
+  </w:num>
+  <w:num w:numId="19">
+    <w:abstractNumId w:val="17"/>
+  </w:num>
+  <w:num w:numId="20">
+    <w:abstractNumId w:val="2"/>
+  </w:num>
+  <w:num w:numId="21">
+    <w:abstractNumId w:val="5"/>
   </w:num>
 </w:numbering>
 </file>
@@ -32919,6 +35346,7 @@
   <w:style w:type="character" w:default="1" w:styleId="Fuentedeprrafopredeter">
     <w:name w:val="Default Paragraph Font"/>
     <w:uiPriority w:val="1"/>
+    <w:semiHidden/>
     <w:unhideWhenUsed/>
   </w:style>
   <w:style w:type="table" w:default="1" w:styleId="Tablanormal">
@@ -33458,7 +35886,7 @@
 </file>
 
 <file path=customXml/itemProps1.xml><?xml version="1.0" encoding="utf-8"?>
-<ds:datastoreItem xmlns:ds="http://schemas.openxmlformats.org/officeDocument/2006/customXml" ds:itemID="{62FD94BF-C85C-49DD-A1CC-FEDE8E6BECBF}">
+<ds:datastoreItem xmlns:ds="http://schemas.openxmlformats.org/officeDocument/2006/customXml" ds:itemID="{22E37AEB-B37F-4436-A861-2877FF300DE7}">
   <ds:schemaRefs>
     <ds:schemaRef ds:uri="http://schemas.openxmlformats.org/officeDocument/2006/bibliography"/>
   </ds:schemaRefs>

</xml_diff>